<commit_message>
Lock in Option A sensory imagination for Aqlan and Mishka teaching scripts
</commit_message>
<xml_diff>
--- a/pancasila/Naskah_Guru_Word_by_Word_Lengkap_Pancasila_Sesi1_Sesi2.docx
+++ b/pancasila/Naskah_Guru_Word_by_Word_Lengkap_Pancasila_Sesi1_Sesi2.docx
@@ -35,7 +35,7 @@
                 <w:color w:val="FECDD3"/>
                 <w:sz w:val="19"/>
               </w:rPr>
-              <w:t>★ PANDUAN MENGAJAR RESMI GURU TIARA • PKBM PENERUS BANGSA ★</w:t>
+              <w:t>★ NASKAH TELEPROMPTER GURU TIARA ★</w:t>
               <w:br/>
             </w:r>
             <w:r>
@@ -43,9 +43,9 @@
                 <w:rFonts w:ascii="Arial Black" w:hAnsi="Arial Black"/>
                 <w:b/>
                 <w:color w:val="FFFFFF"/>
-                <w:sz w:val="31"/>
+                <w:sz w:val="32"/>
               </w:rPr>
-              <w:t>NASKAH GURU WORD-BY-WORD: PENDIDIKAN PANCASILA BAB 3</w:t>
+              <w:t>NASKAH GURU FINAL WORD-BY-WORD: PENDIDIKAN PANCASILA BAB 3</w:t>
               <w:br/>
             </w:r>
             <w:r>
@@ -55,64 +55,9 @@
                 <w:color w:val="FFF1F2"/>
                 <w:sz w:val="20"/>
               </w:rPr>
-              <w:t>Sesi 1: Aqlan (Kelas 4 SD • 60 Menit) | Sesi 2: Mishka (Kelas 5 SD • 60 Menit)</w:t>
+              <w:t>PILIHAN A TERKUNCI • SESI 1: AQLAN (KELAS 4) &amp; SESI 2: MISHKA (KELAS 5)</w:t>
               <w:br/>
-              <w:t>Dilengkapi Pilihan Imajinasi Awal Sensorik &amp; Panduan 4 Misi Game Interaktif</w:t>
-            </w:r>
-          </w:p>
-        </w:tc>
-      </w:tr>
-    </w:tbl>
-    <w:p/>
-    <w:tbl>
-      <w:tblPr>
-        <w:tblW w:type="auto" w:w="0"/>
-        <w:jc w:val="center"/>
-        <w:tblLayout w:type="fixed"/>
-        <w:tblLook w:firstColumn="1" w:firstRow="1" w:lastColumn="0" w:lastRow="0" w:noHBand="0" w:noVBand="1" w:val="04A0"/>
-      </w:tblPr>
-      <w:tblGrid>
-        <w:gridCol w:w="9792"/>
-      </w:tblGrid>
-      <w:tr>
-        <w:tc>
-          <w:tcPr>
-            <w:tcW w:type="dxa" w:w="10080"/>
-            <w:shd w:fill="EFF6FF"/>
-            <w:tcMar>
-              <w:top w:w="140" w:type="dxa"/>
-              <w:bottom w:w="140" w:type="dxa"/>
-              <w:left w:w="200" w:type="dxa"/>
-              <w:right w:w="200" w:type="dxa"/>
-            </w:tcMar>
-          </w:tcPr>
-          <w:p>
-            <w:r>
-              <w:rPr>
-                <w:rFonts w:ascii="Arial" w:hAnsi="Arial"/>
-                <w:b/>
-                <w:color w:val="1E40AF"/>
-                <w:sz w:val="22"/>
-              </w:rPr>
-              <w:t>🧠 PANDUAN GURU: TEKNIK GUIDED IMAGINATION (MEMBAWA ANAK MASUK KE DALAM CERITA)</w:t>
-              <w:br/>
-            </w:r>
-            <w:r>
-              <w:rPr>
-                <w:rFonts w:ascii="Calibri" w:hAnsi="Calibri"/>
-                <w:color w:val="1E293B"/>
-                <w:sz w:val="20"/>
-              </w:rPr>
-              <w:t>Sebelum materi dimulai, anak diajak hening sejenak memejamkan mata untuk mengaktifkan imajinasi sensorik (suara, rabaan, suhu, dan visual).</w:t>
-              <w:br/>
-              <w:br/>
-              <w:t>• Intonasi Suara: Gunakan suara yang hangat, pelan, berbisik ramah, dan ritmis.</w:t>
-              <w:br/>
-              <w:t>• Breathing Cue: Ajak anak menarik napas dalam-dalam 1 kali agar rileks dari distraksi layar gadget.</w:t>
-              <w:br/>
-              <w:t>• Pilihan Fleksibel: Guru Tiara dapat memilih 1 dari 3 Opsi Imajinasi yang paling pas dengan mood anak hari ini!</w:t>
-              <w:br/>
-              <w:t>• Hook ke Materi: Setelah anak membayangkan suasananya, langsung buka mata anak dan kaitkan dengan masalah di buku teks!</w:t>
+              <w:t>Durasi: 60 Menit Tiap Siswa • PKBM Penerus Bangsa</w:t>
             </w:r>
           </w:p>
         </w:tc>
@@ -124,13 +69,11 @@
         <w:rPr>
           <w:rFonts w:ascii="Arial Black" w:hAnsi="Arial Black"/>
           <w:color w:val="BE123C"/>
-          <w:sz w:val="24"/>
+          <w:sz w:val="23"/>
         </w:rPr>
         <w:t>━━━━━━━━━━━━━━━━━━━━━━━━━━━━━━━━━━━━━━━━━━━━━━━━━</w:t>
         <w:br/>
-        <w:t>PART I: SESI 1 — AQLAN (KELAS 4 SD • DURASI: 60 MENIT)</w:t>
-        <w:br/>
-        <w:t>Topik: Kerja Sama di Lingkunganku &amp; Bhinneka Tunggal Ika (Bab 3)</w:t>
+        <w:t>SESI 1: AQLAN (KELAS 4 SD • 60 MENIT) — GOTONG ROYONG DI LINGKUNGANKU</w:t>
         <w:br/>
         <w:t>━━━━━━━━━━━━━━━━━━━━━━━━━━━━━━━━━━━━━━━━━━━━━━━━━</w:t>
       </w:r>
@@ -165,7 +108,7 @@
                 <w:color w:val="BE123C"/>
                 <w:sz w:val="22"/>
               </w:rPr>
-              <w:t>🎯 3 PILIHAN IMAJINASI AWAL UNTUK AQLAN (PILIH SALAH SATU DI MENIT 00:00 - 05:00)</w:t>
+              <w:t>🎯 IMAGINATION HOOK PILIHAN A (TERKUNCI): MELUNCUR DI ATAS SKATEBOARD &amp; BADAI BERINGIN</w:t>
               <w:br/>
             </w:r>
             <w:r>
@@ -174,39 +117,13 @@
                 <w:color w:val="1E293B"/>
                 <w:sz w:val="20"/>
               </w:rPr>
-              <w:t>PILIHAN A: 'Meluncur di Atas Skateboard &amp; Terjangan Badai Beringin' (Fokus Kinestetik &amp; Audio)</w:t>
-              <w:br/>
-              <w:t>• Kata Kunci: Suara roda skate di aspal basah, embusan angin pagi sejuk, bau daun basah, lalu KRAAAK! Dahan beringin raksasa tumbang di depan mata.</w:t>
-              <w:br/>
-              <w:t>• Cocok Jika: Aqlan sedang penuh energi dan antusias bercerita tentang skateboard.</w:t>
-              <w:br/>
-              <w:br/>
-              <w:t>PILIHAN B: 'Misteri Sebatang Lidi yang Patah di Tangan' (Fokus Taktil &amp; Eksperimen)</w:t>
-              <w:br/>
-              <w:t>• Kata Kunci: Memegang sebatang lidi kelapa tipis, mencoba mematahkan dengan dua jari 'KREK!', lalu membayangkan 50 lidi diikat tali sakti yang tak bisa dipatahkan tangan sekuat apa pun.</w:t>
-              <w:br/>
-              <w:t>• Cocok Jika: Aqlan sedang penasaran dan suka tantangan teka-teki sains/fisika.</w:t>
-              <w:br/>
-              <w:br/>
-              <w:t>PILIHAN C: 'Mesin Waktu Kongres Pemuda 28 Oktober 1928' (Fokus Imajinasi Sejarah &amp; Bahasa)</w:t>
-              <w:br/>
-              <w:t>• Kata Kunci: Memakai helm waktu berkecepatan tinggi, mendarat di Jakarta tahun 1928, mendengar pemuda Batak, Jawa, Sunda, Maluku berdebat dengan bahasa daerah masing-masing sampai disatukan oleh Bahasa Indonesia.</w:t>
-              <w:br/>
-              <w:t>• Cocok Jika: Aqlan sedang tenang dan menyukai petualangan fantasi/detektif waktu.</w:t>
+              <w:t>"Aqlan, coba duduk rileks... pejamkan kedua matamu perlahan. Tarik napas dalam-dalam lewat hidung... hembuskan. Bayangkan Aqlan sedang berdiri di atas skateboard favoritmu. Pagi itu udara sangat sejuk sehabis hujan lebat semalam. Aqlan dorong kaki ke aspal... SWOOSH! Roda skate meluncur kencang 'krrrk-krrrk' di jalan komplek. Angin sejuk menerpa wajah Aqlan. Tapi tiba-tiba saat mau belok ke gerbang... BRAAAK! Dahan pohon beringin tua sebesar pelukan orang dewasa tumbang melintang menutupi seluruh jalan dan menyumbat selokan! Aqlan mengerem mendadak! Di sana, Pak RT berdiri kebingungan memegang gergaji kecil sendirian sambil menghela napas panjang... Sekarang, buka kedua matamu perlahan Aqlan!"</w:t>
             </w:r>
           </w:p>
         </w:tc>
       </w:tr>
     </w:tbl>
     <w:p/>
-    <w:p>
-      <w:r>
-        <w:rPr>
-          <w:b/>
-        </w:rPr>
-        <w:t>⏱️ SCRIPT WORD-BY-WORD: SESI 1 AQLAN (MENIT 00:00 - 60:00)</w:t>
-      </w:r>
-    </w:p>
     <w:p>
       <w:pPr>
         <w:spacing w:before="60" w:after="60"/>
@@ -219,7 +136,7 @@
           <w:color w:val="64748B"/>
           <w:sz w:val="18"/>
         </w:rPr>
-        <w:t>[Tersenyum ceria di kamera, melambaikan tangan dengan hangat]</w:t>
+        <w:t>[Tersenyum hangat, menyapa ceria di layar Zoom]</w:t>
         <w:br/>
       </w:r>
       <w:r>
@@ -276,7 +193,7 @@
           <w:color w:val="64748B"/>
           <w:sz w:val="18"/>
         </w:rPr>
-        <w:t>[Menggunakan suara pelan, tenang, tempo rileks]</w:t>
+        <w:t>[Menatap antusias]</w:t>
         <w:br/>
       </w:r>
       <w:r>
@@ -294,81 +211,7 @@
           <w:color w:val="0F172A"/>
           <w:sz w:val="20"/>
         </w:rPr>
-        <w:t>"Aqlan, sebelum kita buka buku atau slide Canva, Bu Tiara mau ajak Aqlan melakukan satu perjalanan rahasia. Mau ikutan? Coba Aqlan duduk yang paling nyaman di kursi... sekarang, pejamkan kedua mata Aqlan perlahan-lahan. Tarik napas dalam-dalam lewat hidung... hembuskan perlahan..."</w:t>
-      </w:r>
-    </w:p>
-    <w:p>
-      <w:r>
-        <w:rPr>
-          <w:i/>
-        </w:rPr>
-        <w:t>─── JIKA GURU MEMILIH PILIHAN A (DUNIA SKATER &amp; BADAI BERINGIN) ───</w:t>
-      </w:r>
-    </w:p>
-    <w:p>
-      <w:pPr>
-        <w:spacing w:before="60" w:after="60"/>
-        <w:ind w:left="0"/>
-      </w:pPr>
-      <w:r>
-        <w:rPr>
-          <w:rFonts w:ascii="Calibri" w:hAnsi="Calibri"/>
-          <w:i/>
-          <w:color w:val="64748B"/>
-          <w:sz w:val="18"/>
-        </w:rPr>
-        <w:t>[Suara dramatis tapi ramah, lalu tersenyum saat Aqlan membuka mata]</w:t>
-        <w:br/>
-      </w:r>
-      <w:r>
-        <w:rPr>
-          <w:rFonts w:ascii="Arial" w:hAnsi="Arial"/>
-          <w:b/>
-          <w:color w:val="BE123C"/>
-          <w:sz w:val="20"/>
-        </w:rPr>
-        <w:t xml:space="preserve">Guru Tiara: </w:t>
-      </w:r>
-      <w:r>
-        <w:rPr>
-          <w:rFonts w:ascii="Calibri" w:hAnsi="Calibri"/>
-          <w:color w:val="0F172A"/>
-          <w:sz w:val="20"/>
-        </w:rPr>
-        <w:t>"Bayangkan Aqlan sedang berdiri di atas papan skateboard favorit Aqlan. Pagi itu matahari baru terbit, udara masih dingin dan segar sehabis hujan lebat semalam. Aqlan mulai mendorong kaki kanan ke aspal... SWOOSH! Roda skate Aqlan meluncur kencang dan mulus. Aqlan bisa mendengar suara 'krrrk-krrrk' roda melibas jalanan komplek. Tapi tiba-tiba... saat Aqlan mau belok ke gerbang komplek... BRAAAK! Sebuah dahan pohon beringin tua sebesar pelukan orang dewasa tumbang melintang menutupi seluruh jalan! Saluran air di bawahnya tersumbat sampah ranting. Aqlan mengerem mendadak! Di sana, Pak RT sedang berdiri kebingungan sendirian memegang gergaji kecil sambil berkeringat dingin... Sekarang, buka mata Aqlan perlahan!"</w:t>
-      </w:r>
-    </w:p>
-    <w:p>
-      <w:pPr>
-        <w:spacing w:before="60" w:after="60"/>
-        <w:ind w:left="0"/>
-      </w:pPr>
-      <w:r>
-        <w:rPr>
-          <w:rFonts w:ascii="Calibri" w:hAnsi="Calibri"/>
-          <w:i/>
-          <w:color w:val="64748B"/>
-          <w:sz w:val="18"/>
-        </w:rPr>
-        <w:t>[Menatap Aqlan dengan antusias di layar]</w:t>
-        <w:br/>
-      </w:r>
-      <w:r>
-        <w:rPr>
-          <w:rFonts w:ascii="Arial" w:hAnsi="Arial"/>
-          <w:b/>
-          <w:color w:val="BE123C"/>
-          <w:sz w:val="20"/>
-        </w:rPr>
-        <w:t xml:space="preserve">Guru Tiara: </w:t>
-      </w:r>
-      <w:r>
-        <w:rPr>
-          <w:rFonts w:ascii="Calibri" w:hAnsi="Calibri"/>
-          <w:color w:val="0F172A"/>
-          <w:sz w:val="20"/>
-        </w:rPr>
-        <w:t>"Aqlan, dahan pohon seberat 100 kilo itu menutup jalan latihan skate Aqlan dan menyumbat saluran air. Pak RT bilang, 'Aqlan, kalau Bapak potong sendirian, butuh waktu 5 hari (120 jam)! Nanti malam hujan badai turun lagi, rumah warga pasti kebanjiran!' Kalau Aqlan di posisi itu, apa yang Aqlan lakukan? Pulang tidur, atau turun dari papan skate membantu Pak RT?"</w:t>
+        <w:t>"Aqlan, dahan pohon beringin seberat 100 kg tadi menutup jalan skate Aqlan dan menyumbat selokan. Pak RT bilang, 'Aqlan, kalau Bapak potong sendirian butuh 5 hari (120 jam)! Nanti malam badai hujan lebat turun lagi dan rumah warga bisa kebanjiran!' Kalau Aqlan di situ, apa yang Aqlan lakukan? Pulang tidur, atau turun dari papan skate membantu Pak RT?"</w:t>
       </w:r>
     </w:p>
     <w:p>
@@ -407,7 +250,7 @@
           <w:color w:val="64748B"/>
           <w:sz w:val="18"/>
         </w:rPr>
-        <w:t>[Menepuk tangan pelan, membagikan layar Canva Slide 1 dan 2]</w:t>
+        <w:t>[Tersenyum bangga, membuka Slide Canva 1 &amp; 2]</w:t>
         <w:br/>
       </w:r>
       <w:r>
@@ -425,15 +268,7 @@
           <w:color w:val="0F172A"/>
           <w:sz w:val="20"/>
         </w:rPr>
-        <w:t>"HEBAT BANGET! Jawaban seorang ksatria sejati! Nah Aqlan, tindakan memanggil warga dan membersihkan dahan bersama-sama itu punya nama sakti di Indonesia. Namanya adalah: GOTONG ROYONG! Hari ini, di Pendidikan Pancasila Bab 3, Aqlan akan dinobatkan menjadi Ksatria Gotong Royong!"</w:t>
-      </w:r>
-    </w:p>
-    <w:p>
-      <w:r>
-        <w:rPr>
-          <w:b/>
-        </w:rPr>
-        <w:t>📖 [Menit 08:00 - 20:00] Pendalaman Materi Textbook Kemendikbud &amp; Keseharian Aqlan</w:t>
+        <w:t>"HEBAT BANGET! Jawaban seorang ksatria sejati! Tindakan memanggil warga dan membersihkan dahan bersama-sama sukarela itu namanya GOTONG ROYONG sesuai pengamalan Sila ke-3 Pancasila!"</w:t>
       </w:r>
     </w:p>
     <w:p>
@@ -448,7 +283,7 @@
           <w:color w:val="64748B"/>
           <w:sz w:val="18"/>
         </w:rPr>
-        <w:t>[Menunjukkan poin penting di slide Canva]</w:t>
+        <w:t>[Membahas konsep buku teks]</w:t>
         <w:br/>
       </w:r>
       <w:r>
@@ -466,7 +301,40 @@
           <w:color w:val="0F172A"/>
           <w:sz w:val="20"/>
         </w:rPr>
-        <w:t>"Coba Aqlan lihat Slide 2 Canva ini. Buku Siswa Kemendikbud halaman 63 mencatat bahwa Indonesia punya lebih dari 1.340 suku bangsa dan 718 bahasa daerah! Di komplek Aqlan sendiri, tetangga Aqlan ada yang dari Jawa, Sunda, Batak, Minang, sampai Maluku kan? Nah, di halaman 71 buku teks, ada satu nilai sakti warisan nenek moyang kita, yaitu Sila ke-3 Pancasila: Persatuan Indonesia. Gotong royong artinya bekerja bersama-sama secara sukarela tanpa minta bayaran uang demi kepentingan bersama."</w:t>
+        <w:t>"Di Buku Siswa Kemendikbud halaman 63 dicatat bahwa Indonesia punya 1.340 suku bangsa. Di komplek Aqlan ada tetangga dari Jawa, Sunda, Batak, Minang. Gotong royong adalah bekerja sama sukarela tanpa pamrih. Di Jawa namanya Gugur Gunung, di Minahasa namanya Mapalus. Kalau Pak RT butuh 5 hari sendirian, kalau warga membagi tugas 3 regu, cuma butuh 45 menit saja!"</w:t>
+      </w:r>
+    </w:p>
+    <w:p>
+      <w:pPr>
+        <w:spacing w:before="60" w:after="60"/>
+        <w:ind w:left="0"/>
+      </w:pPr>
+      <w:r>
+        <w:rPr>
+          <w:rFonts w:ascii="Calibri" w:hAnsi="Calibri"/>
+          <w:i/>
+          <w:color w:val="64748B"/>
+          <w:sz w:val="18"/>
+        </w:rPr>
+        <w:t>[Membimbing ke game web]</w:t>
+        <w:br/>
+      </w:r>
+      <w:r>
+        <w:rPr>
+          <w:rFonts w:ascii="Arial" w:hAnsi="Arial"/>
+          <w:b/>
+          <w:color w:val="BE123C"/>
+          <w:sz w:val="20"/>
+        </w:rPr>
+        <w:t xml:space="preserve">Guru Tiara: </w:t>
+      </w:r>
+      <w:r>
+        <w:rPr>
+          <w:rFonts w:ascii="Calibri" w:hAnsi="Calibri"/>
+          <w:color w:val="0F172A"/>
+          <w:sz w:val="20"/>
+        </w:rPr>
+        <w:t>"Sekarang buka game Pancasila kita di: https://tiara-dwi.github.io/pkbm-games/pancasila/. Pastikan nama Aqlan sudah terpilih. Ada 4 Misi beruntun menuju target 400 Poin Ksatria!"</w:t>
       </w:r>
     </w:p>
     <w:p>
@@ -490,40 +358,7 @@
           <w:color w:val="334155"/>
           <w:sz w:val="20"/>
         </w:rPr>
-        <w:t>"Berarti nggak boleh pamrih ya bu?"</w:t>
-      </w:r>
-    </w:p>
-    <w:p>
-      <w:pPr>
-        <w:spacing w:before="60" w:after="60"/>
-        <w:ind w:left="0"/>
-      </w:pPr>
-      <w:r>
-        <w:rPr>
-          <w:rFonts w:ascii="Calibri" w:hAnsi="Calibri"/>
-          <w:i/>
-          <w:color w:val="64748B"/>
-          <w:sz w:val="18"/>
-        </w:rPr>
-        <w:t>[Menatap Aqlan dengan ekspresi penasaran]</w:t>
-        <w:br/>
-      </w:r>
-      <w:r>
-        <w:rPr>
-          <w:rFonts w:ascii="Arial" w:hAnsi="Arial"/>
-          <w:b/>
-          <w:color w:val="BE123C"/>
-          <w:sz w:val="20"/>
-        </w:rPr>
-        <w:t xml:space="preserve">Guru Tiara: </w:t>
-      </w:r>
-      <w:r>
-        <w:rPr>
-          <w:rFonts w:ascii="Calibri" w:hAnsi="Calibri"/>
-          <w:color w:val="0F172A"/>
-          <w:sz w:val="20"/>
-        </w:rPr>
-        <w:t>"Tepat sekali, 100 buat Aqlan! Tanpa pamrih! Dan tradisi gotong royong ini ada namanya di tiap pulau. Di Jawa namanya 'Gugur Gunung'. Di Minahasa Sulawesi Utara namanya 'Mapalus'. Di Palembang namanya 'Sikaroban'. Sekarang coba Aqlan tebak: kalau pohon beringin tadi dikerjakan sendirian oleh Pak RT butuh 5 hari, kalau warga membagi tugas jadi 3 regu, butuh berapa lama?"</w:t>
+        <w:t>"Misi 1 selesai dapet 100 poin bu! Misi 2 sapu lidi dapet 100 poin lagi! Misi 3 tradisi nusantara dapet 100 poin! Sekarang Misi 4 Mini Test bu!"</w:t>
       </w:r>
     </w:p>
     <w:p>
@@ -547,7 +382,7 @@
           <w:color w:val="334155"/>
           <w:sz w:val="20"/>
         </w:rPr>
-        <w:t>"Jadi cepat banget bu! Mungkin nggak sampai sejam udah beres!"</w:t>
+        <w:t>"Horeee bu! Skor aku 400 sempurna! Keluar piala emas sama sertifikat Ksatria Gotong Royong SD Kelas 4!"</w:t>
       </w:r>
     </w:p>
     <w:p>
@@ -562,7 +397,7 @@
           <w:color w:val="64748B"/>
           <w:sz w:val="18"/>
         </w:rPr>
-        <w:t>[Tersenyum bangga]</w:t>
+        <w:t>[Mendiktekan 5 poin ringkas resmi]</w:t>
         <w:br/>
       </w:r>
       <w:r>
@@ -580,15 +415,7 @@
           <w:color w:val="0F172A"/>
           <w:sz w:val="20"/>
         </w:rPr>
-        <w:t>"Betul! Cuma butuh 45 menit saja! Beban berat 100 kilo jadi enteng saat diangkat bersama-sama!"</w:t>
-      </w:r>
-    </w:p>
-    <w:p>
-      <w:r>
-        <w:rPr>
-          <w:b/>
-        </w:rPr>
-        <w:t>🎮 [Menit 20:00 - 40:00] Praktik Langsung 4 Misi di Game Web Interaktif</w:t>
+        <w:t>"Alhamdulillah! Ksatria hebat tangannya juga rapi menulis. Ambil buku tulis PPKn dan pulpen Aqlan, kita catat 5 poin penting ksatria hari ini ya!"</w:t>
       </w:r>
     </w:p>
     <w:p>
@@ -603,7 +430,7 @@
           <w:color w:val="64748B"/>
           <w:sz w:val="18"/>
         </w:rPr>
-        <w:t>[Mengarahkan Aqlan membuka tab game]</w:t>
+        <w:t>[Refleksi akhir]</w:t>
         <w:br/>
       </w:r>
       <w:r>
@@ -621,40 +448,7 @@
           <w:color w:val="0F172A"/>
           <w:sz w:val="20"/>
         </w:rPr>
-        <w:t>"Sekarang, buka link game Pancasila kita di: https://tiara-dwi.github.io/pkbm-games/pancasila/. Pastikan nama Aqlan sudah terpilih di pojok atas ya! Lihat di bawahnya, ada 4 Misi Bertahap yang harus Aqlan selesaikan sampai mengumpulkan 400 Poin Ksatria!"</w:t>
-      </w:r>
-    </w:p>
-    <w:p>
-      <w:pPr>
-        <w:spacing w:before="60" w:after="60"/>
-        <w:ind w:left="0"/>
-      </w:pPr>
-      <w:r>
-        <w:rPr>
-          <w:rFonts w:ascii="Calibri" w:hAnsi="Calibri"/>
-          <w:i/>
-          <w:color w:val="64748B"/>
-          <w:sz w:val="18"/>
-        </w:rPr>
-        <w:t>[Membimbing Misi 1]</w:t>
-        <w:br/>
-      </w:r>
-      <w:r>
-        <w:rPr>
-          <w:rFonts w:ascii="Arial" w:hAnsi="Arial"/>
-          <w:b/>
-          <w:color w:val="BE123C"/>
-          <w:sz w:val="20"/>
-        </w:rPr>
-        <w:t xml:space="preserve">Guru Tiara: </w:t>
-      </w:r>
-      <w:r>
-        <w:rPr>
-          <w:rFonts w:ascii="Calibri" w:hAnsi="Calibri"/>
-          <w:color w:val="0F172A"/>
-          <w:sz w:val="20"/>
-        </w:rPr>
-        <w:t>"Klik tombol 'Misi 1: Badai Beringin'. Baca skenarionya, lalu pilih tindakan terbaik untuk membagi tugas 3 regu! Coba klik kartu gotong royong!"</w:t>
+        <w:t>"Apa 1 tindakan gotong royong nyata yang mau Aqlan lakukan di rumah hari ini bareng Ayah atau Bunda?"</w:t>
       </w:r>
     </w:p>
     <w:p>
@@ -678,7 +472,7 @@
           <w:color w:val="334155"/>
           <w:sz w:val="20"/>
         </w:rPr>
-        <w:t>"Yey dapat 100 poin bu! Suaranya ting-ting-ting!"</w:t>
+        <w:t>"Nanti sore aku mau bantu Ayah bersihin garasi dan cuci papan skate aku sendiri bu!"</w:t>
       </w:r>
     </w:p>
     <w:p>
@@ -693,7 +487,7 @@
           <w:color w:val="64748B"/>
           <w:sz w:val="18"/>
         </w:rPr>
-        <w:t>[Membimbing Misi 2]</w:t>
+        <w:t>[Menutup Sesi 1]</w:t>
         <w:br/>
       </w:r>
       <w:r>
@@ -711,375 +505,7 @@
           <w:color w:val="0F172A"/>
           <w:sz w:val="20"/>
         </w:rPr>
-        <w:t>"Mantap! Sekarang klik tombol 'Misi 2: Sapu Lidi'. Di situ ada tombol uji 1 lidi vs uji 50 lidi. Coba klik yang 1 lidi dulu!"</w:t>
-      </w:r>
-    </w:p>
-    <w:p>
-      <w:pPr>
-        <w:spacing w:before="60" w:after="60"/>
-        <w:ind w:left="288"/>
-      </w:pPr>
-      <w:r>
-        <w:rPr>
-          <w:rFonts w:ascii="Arial" w:hAnsi="Arial"/>
-          <w:b/>
-          <w:color w:val="0284C7"/>
-          <w:sz w:val="20"/>
-        </w:rPr>
-        <w:t xml:space="preserve">Aqlan: </w:t>
-      </w:r>
-      <w:r>
-        <w:rPr>
-          <w:rFonts w:ascii="Calibri" w:hAnsi="Calibri"/>
-          <w:i/>
-          <w:color w:val="334155"/>
-          <w:sz w:val="20"/>
-        </w:rPr>
-        <w:t>"Wah lidinya patah bu! Ada tulisan KREK!"</w:t>
-      </w:r>
-    </w:p>
-    <w:p>
-      <w:pPr>
-        <w:spacing w:before="60" w:after="60"/>
-        <w:ind w:left="0"/>
-      </w:pPr>
-      <w:r>
-        <w:rPr>
-          <w:rFonts w:ascii="Calibri" w:hAnsi="Calibri"/>
-          <w:i/>
-          <w:color w:val="64748B"/>
-          <w:sz w:val="18"/>
-        </w:rPr>
-        <w:t>[Tersenyum menanti reaksi Aqlan]</w:t>
-        <w:br/>
-      </w:r>
-      <w:r>
-        <w:rPr>
-          <w:rFonts w:ascii="Arial" w:hAnsi="Arial"/>
-          <w:b/>
-          <w:color w:val="BE123C"/>
-          <w:sz w:val="20"/>
-        </w:rPr>
-        <w:t xml:space="preserve">Guru Tiara: </w:t>
-      </w:r>
-      <w:r>
-        <w:rPr>
-          <w:rFonts w:ascii="Calibri" w:hAnsi="Calibri"/>
-          <w:color w:val="0F172A"/>
-          <w:sz w:val="20"/>
-        </w:rPr>
-        <w:t>"Nah, sekarang coba klik yang 50 lidi diikat jadi sapu!"</w:t>
-      </w:r>
-    </w:p>
-    <w:p>
-      <w:pPr>
-        <w:spacing w:before="60" w:after="60"/>
-        <w:ind w:left="288"/>
-      </w:pPr>
-      <w:r>
-        <w:rPr>
-          <w:rFonts w:ascii="Arial" w:hAnsi="Arial"/>
-          <w:b/>
-          <w:color w:val="0284C7"/>
-          <w:sz w:val="20"/>
-        </w:rPr>
-        <w:t xml:space="preserve">Aqlan: </w:t>
-      </w:r>
-      <w:r>
-        <w:rPr>
-          <w:rFonts w:ascii="Calibri" w:hAnsi="Calibri"/>
-          <w:i/>
-          <w:color w:val="334155"/>
-          <w:sz w:val="20"/>
-        </w:rPr>
-        <w:t>"Wih langsung bersih kerikilnya bu! Nambah 100 poin lagi, skorku jadi 200!"</w:t>
-      </w:r>
-    </w:p>
-    <w:p>
-      <w:pPr>
-        <w:spacing w:before="60" w:after="60"/>
-        <w:ind w:left="0"/>
-      </w:pPr>
-      <w:r>
-        <w:rPr>
-          <w:rFonts w:ascii="Calibri" w:hAnsi="Calibri"/>
-          <w:i/>
-          <w:color w:val="64748B"/>
-          <w:sz w:val="18"/>
-        </w:rPr>
-        <w:t>[Membimbing Misi 3]</w:t>
-        <w:br/>
-      </w:r>
-      <w:r>
-        <w:rPr>
-          <w:rFonts w:ascii="Arial" w:hAnsi="Arial"/>
-          <w:b/>
-          <w:color w:val="BE123C"/>
-          <w:sz w:val="20"/>
-        </w:rPr>
-        <w:t xml:space="preserve">Guru Tiara: </w:t>
-      </w:r>
-      <w:r>
-        <w:rPr>
-          <w:rFonts w:ascii="Calibri" w:hAnsi="Calibri"/>
-          <w:color w:val="0F172A"/>
-          <w:sz w:val="20"/>
-        </w:rPr>
-        <w:t>"Luar biasa! Sekarang lanjut ke 'Misi 3: Tradisi Nusantara'. Cocokkan tradisi Mapalus dari Minahasa dan jawab peran Bahasa Indonesia Sumpah Pemuda 1928!"</w:t>
-      </w:r>
-    </w:p>
-    <w:p>
-      <w:pPr>
-        <w:spacing w:before="60" w:after="60"/>
-        <w:ind w:left="288"/>
-      </w:pPr>
-      <w:r>
-        <w:rPr>
-          <w:rFonts w:ascii="Arial" w:hAnsi="Arial"/>
-          <w:b/>
-          <w:color w:val="0284C7"/>
-          <w:sz w:val="20"/>
-        </w:rPr>
-        <w:t xml:space="preserve">Aqlan: </w:t>
-      </w:r>
-      <w:r>
-        <w:rPr>
-          <w:rFonts w:ascii="Calibri" w:hAnsi="Calibri"/>
-          <w:i/>
-          <w:color w:val="334155"/>
-          <w:sz w:val="20"/>
-        </w:rPr>
-        <w:t>"Udah beres bu, skor aku sekarang 300 poin!"</w:t>
-      </w:r>
-    </w:p>
-    <w:p>
-      <w:pPr>
-        <w:spacing w:before="60" w:after="60"/>
-        <w:ind w:left="0"/>
-      </w:pPr>
-      <w:r>
-        <w:rPr>
-          <w:rFonts w:ascii="Calibri" w:hAnsi="Calibri"/>
-          <w:i/>
-          <w:color w:val="64748B"/>
-          <w:sz w:val="18"/>
-        </w:rPr>
-        <w:t>[Mengawasi pengerjaan 4 soal mini test]</w:t>
-        <w:br/>
-      </w:r>
-      <w:r>
-        <w:rPr>
-          <w:rFonts w:ascii="Arial" w:hAnsi="Arial"/>
-          <w:b/>
-          <w:color w:val="BE123C"/>
-          <w:sz w:val="20"/>
-        </w:rPr>
-        <w:t xml:space="preserve">Guru Tiara: </w:t>
-      </w:r>
-      <w:r>
-        <w:rPr>
-          <w:rFonts w:ascii="Calibri" w:hAnsi="Calibri"/>
-          <w:color w:val="0F172A"/>
-          <w:sz w:val="20"/>
-        </w:rPr>
-        <w:t>"Keren banget! Misi terakhir, klik 'Misi 4: Mini Test C3-C4'. Ada 4 soal pilihan ganda. Baca tenang-tenang, pilih jawaban A, B, C, atau D. Tiap soal bernilai 25 poin!"</w:t>
-      </w:r>
-    </w:p>
-    <w:p>
-      <w:pPr>
-        <w:spacing w:before="60" w:after="60"/>
-        <w:ind w:left="288"/>
-      </w:pPr>
-      <w:r>
-        <w:rPr>
-          <w:rFonts w:ascii="Arial" w:hAnsi="Arial"/>
-          <w:b/>
-          <w:color w:val="0284C7"/>
-          <w:sz w:val="20"/>
-        </w:rPr>
-        <w:t xml:space="preserve">Aqlan: </w:t>
-      </w:r>
-      <w:r>
-        <w:rPr>
-          <w:rFonts w:ascii="Calibri" w:hAnsi="Calibri"/>
-          <w:i/>
-          <w:color w:val="334155"/>
-          <w:sz w:val="20"/>
-        </w:rPr>
-        <w:t>"Horeee bu! Skor aku 400 sempurna! Keluar piala emas sama tulisan Ksatria Gotong Royong!"</w:t>
-      </w:r>
-    </w:p>
-    <w:p>
-      <w:r>
-        <w:rPr>
-          <w:b/>
-        </w:rPr>
-        <w:t>📝 [Menit 40:00 - 52:00] Bimbingan Menulis Catatan Ringkas di Buku Tulis Aqlan</w:t>
-      </w:r>
-    </w:p>
-    <w:p>
-      <w:pPr>
-        <w:spacing w:before="60" w:after="60"/>
-        <w:ind w:left="0"/>
-      </w:pPr>
-      <w:r>
-        <w:rPr>
-          <w:rFonts w:ascii="Calibri" w:hAnsi="Calibri"/>
-          <w:i/>
-          <w:color w:val="64748B"/>
-          <w:sz w:val="18"/>
-        </w:rPr>
-        <w:t>[Mendiktekan dengan sabar, memastikan Aqlan menulis dengan postur tegap]</w:t>
-        <w:br/>
-      </w:r>
-      <w:r>
-        <w:rPr>
-          <w:rFonts w:ascii="Arial" w:hAnsi="Arial"/>
-          <w:b/>
-          <w:color w:val="BE123C"/>
-          <w:sz w:val="20"/>
-        </w:rPr>
-        <w:t xml:space="preserve">Guru Tiara: </w:t>
-      </w:r>
-      <w:r>
-        <w:rPr>
-          <w:rFonts w:ascii="Calibri" w:hAnsi="Calibri"/>
-          <w:color w:val="0F172A"/>
-          <w:sz w:val="20"/>
-        </w:rPr>
-        <w:t>"Alhamdulillah! Nah Aqlan, ksatria hebat bukan cuma jago di game, tapi tangannya juga rapi menulis ilmu di buku catatan. Sekarang ambil buku tulis PPKn dan pulpen Aqlan. Kita catat 5 poin rahasia ksatria hari ini ya. Bu Tiara diktekan pelan-pelan sambil Aqlan tulis rapi:</w:t>
-        <w:br/>
-        <w:t>1. Gotong royong adalah tradisi bekerja bersama secara sukarela demi kepentingan umum (pengamalan Sila ke-3 Pancasila).</w:t>
-        <w:br/>
-        <w:t>2. Empat manfaat gotong royong: kerja berat jadi ringan, cepat selesai (5 hari jadi 45 menit), hemat biaya, dan mempererat kerukunan.</w:t>
-        <w:br/>
-        <w:t>3. Tradisi daerah: Gugur Gunung (Jawa) dan Mapalus (Minahasa).</w:t>
-        <w:br/>
-        <w:t>4. Bahasa Indonesia adalah bahasa persatuan penjembatan kebinekaan sesuai ikrar Sumpah Pemuda 28 Oktober 1928.</w:t>
-        <w:br/>
-        <w:t>5. Filosofi Sapu Lidi: Sendirian mudah patah, bersatu mengikat perbedaan tak terkalahkan!"</w:t>
-      </w:r>
-    </w:p>
-    <w:p>
-      <w:pPr>
-        <w:spacing w:before="60" w:after="60"/>
-        <w:ind w:left="288"/>
-      </w:pPr>
-      <w:r>
-        <w:rPr>
-          <w:rFonts w:ascii="Arial" w:hAnsi="Arial"/>
-          <w:b/>
-          <w:color w:val="0284C7"/>
-          <w:sz w:val="20"/>
-        </w:rPr>
-        <w:t xml:space="preserve">Aqlan: </w:t>
-      </w:r>
-      <w:r>
-        <w:rPr>
-          <w:rFonts w:ascii="Calibri" w:hAnsi="Calibri"/>
-          <w:i/>
-          <w:color w:val="334155"/>
-          <w:sz w:val="20"/>
-        </w:rPr>
-        <w:t>"Sudah selesai bu! Rapi banget tulisanku!"</w:t>
-      </w:r>
-    </w:p>
-    <w:p>
-      <w:r>
-        <w:rPr>
-          <w:b/>
-        </w:rPr>
-        <w:t>🌟 [Menit 52:00 - 60:00] Refleksi Karakter &amp; Penutupan Sesi 1</w:t>
-      </w:r>
-    </w:p>
-    <w:p>
-      <w:pPr>
-        <w:spacing w:before="60" w:after="60"/>
-        <w:ind w:left="0"/>
-      </w:pPr>
-      <w:r>
-        <w:rPr>
-          <w:rFonts w:ascii="Calibri" w:hAnsi="Calibri"/>
-          <w:i/>
-          <w:color w:val="64748B"/>
-          <w:sz w:val="18"/>
-        </w:rPr>
-        <w:t>[Menatap hangat dan penuh penghargaan]</w:t>
-        <w:br/>
-      </w:r>
-      <w:r>
-        <w:rPr>
-          <w:rFonts w:ascii="Arial" w:hAnsi="Arial"/>
-          <w:b/>
-          <w:color w:val="BE123C"/>
-          <w:sz w:val="20"/>
-        </w:rPr>
-        <w:t xml:space="preserve">Guru Tiara: </w:t>
-      </w:r>
-      <w:r>
-        <w:rPr>
-          <w:rFonts w:ascii="Calibri" w:hAnsi="Calibri"/>
-          <w:color w:val="0F172A"/>
-          <w:sz w:val="20"/>
-        </w:rPr>
-        <w:t>"Masya Allah, hebat sekali Aqlan! Terakhir, sebelum kita tutup sesi 60 menit hari ini: apa 1 tindakan gotong royong nyata yang mau Aqlan lakukan di rumah hari ini bareng Ayah atau Bunda?"</w:t>
-      </w:r>
-    </w:p>
-    <w:p>
-      <w:pPr>
-        <w:spacing w:before="60" w:after="60"/>
-        <w:ind w:left="288"/>
-      </w:pPr>
-      <w:r>
-        <w:rPr>
-          <w:rFonts w:ascii="Arial" w:hAnsi="Arial"/>
-          <w:b/>
-          <w:color w:val="0284C7"/>
-          <w:sz w:val="20"/>
-        </w:rPr>
-        <w:t xml:space="preserve">Aqlan: </w:t>
-      </w:r>
-      <w:r>
-        <w:rPr>
-          <w:rFonts w:ascii="Calibri" w:hAnsi="Calibri"/>
-          <w:i/>
-          <w:color w:val="334155"/>
-          <w:sz w:val="20"/>
-        </w:rPr>
-        <w:t>"Nanti sore aku mau bantu Ayah bersihin garasi dan cuci sepatu skate aku sendiri bu!"</w:t>
-      </w:r>
-    </w:p>
-    <w:p>
-      <w:pPr>
-        <w:spacing w:before="60" w:after="60"/>
-        <w:ind w:left="0"/>
-      </w:pPr>
-      <w:r>
-        <w:rPr>
-          <w:rFonts w:ascii="Calibri" w:hAnsi="Calibri"/>
-          <w:i/>
-          <w:color w:val="64748B"/>
-          <w:sz w:val="18"/>
-        </w:rPr>
-        <w:t>[Melambaikan tangan ceria, menutup sesi Zoom Aqlan]</w:t>
-        <w:br/>
-      </w:r>
-      <w:r>
-        <w:rPr>
-          <w:rFonts w:ascii="Arial" w:hAnsi="Arial"/>
-          <w:b/>
-          <w:color w:val="BE123C"/>
-          <w:sz w:val="20"/>
-        </w:rPr>
-        <w:t xml:space="preserve">Guru Tiara: </w:t>
-      </w:r>
-      <w:r>
-        <w:rPr>
-          <w:rFonts w:ascii="Calibri" w:hAnsi="Calibri"/>
-          <w:color w:val="0F172A"/>
-          <w:sz w:val="20"/>
-        </w:rPr>
-        <w:t>"Janji ksatria yang luar biasa! Selamat ya Aqlan, hari ini resmi menjadi Ksatria Gotong Royong PKBM Penerus Bangsa dengan skor 400 sempurna! Terima kasih Aqlan, sampai ketemu lagi di sesi berikutnya. Wassalamu'alaikum warahmatullahi wabarakatuh!"</w:t>
+        <w:t>"Janji ksatria yang luar biasa! Selamat ya Aqlan atas gelar Ksatria Gotong Royong 400 Poin hari ini! Wassalamu'alaikum wr. wb!"</w:t>
       </w:r>
     </w:p>
     <w:p>
@@ -1092,13 +518,11 @@
         <w:rPr>
           <w:rFonts w:ascii="Arial Black" w:hAnsi="Arial Black"/>
           <w:color w:val="B45309"/>
-          <w:sz w:val="24"/>
+          <w:sz w:val="23"/>
         </w:rPr>
         <w:t>━━━━━━━━━━━━━━━━━━━━━━━━━━━━━━━━━━━━━━━━━━━━━━━━━</w:t>
         <w:br/>
-        <w:t>PART II: SESI 2 — MISHKA (KELAS 5 SD • DURASI: 60 MENIT)</w:t>
-        <w:br/>
-        <w:t>Topik: Keragaman Budaya Indonesiaku &amp; Sains Arsitektur Nusantara (Bab 3)</w:t>
+        <w:t>SESI 2: MISHKA (KELAS 5 SD • 60 MENIT) — KERAGAMAN BUDAYA INDONESIAKU</w:t>
         <w:br/>
         <w:t>━━━━━━━━━━━━━━━━━━━━━━━━━━━━━━━━━━━━━━━━━━━━━━━━━</w:t>
       </w:r>
@@ -1133,7 +557,7 @@
                 <w:color w:val="B45309"/>
                 <w:sz w:val="22"/>
               </w:rPr>
-              <w:t>🎯 3 PILIHAN IMAJINASI AWAL UNTUK MISHKA (PILIH SALAH SATU DI MENIT 00:00 - 05:00)</w:t>
+              <w:t>🎯 IMAGINATION HOOK PILIHAN A (TERKUNCI): MENEMBUS DINGIN 5°C LEMBAH BALIEM KE KEHANGATAN HONAI</w:t>
               <w:br/>
             </w:r>
             <w:r>
@@ -1142,39 +566,13 @@
                 <w:color w:val="1E293B"/>
                 <w:sz w:val="20"/>
               </w:rPr>
-              <w:t>PILIHAN A: 'Menembus Kabut Dingin 5°C Lembah Baliem Menuju Kehangatan Honai' (Fokus Suhu &amp; Taktil)</w:t>
-              <w:br/>
-              <w:t>• Kata Kunci: Embusan angin beku pegunungan Papua, uap napas mengepul putih, jari-jari kedinginan, lalu melangkah masuk ke dalam silinder kayu Honai yang hangat dengan bara api perapian kayu manis.</w:t>
-              <w:br/>
-              <w:t>• Cocok Jika: Mishka menyukai suasana alam dramatis, cuaca dingin, dan rasa nyaman di dalam rumah.</w:t>
-              <w:br/>
-              <w:br/>
-              <w:t>PILIHAN B: 'Gempa Seismik 7.5 SR &amp; Rumah Gadang yang Menari Lentur' (Fokus Kinestetik &amp; Senam)</w:t>
-              <w:br/>
-              <w:t>• Kata Kunci: Tanah bergetar hebat di lereng Bukit Barisan Sumatera Barat, gedung semen retak roboh, namun Rumah Gadang bergoyang luwes elastis tanpa retak laksana pesenam lantai yang mendarat sempurna.</w:t>
-              <w:br/>
-              <w:t>• Cocok Jika: Mishka sedang bersemangat membahas hobi senam lantai, kelenturan tubuh, dan sains gempa.</w:t>
-              <w:br/>
-              <w:br/>
-              <w:t>PILIHAN C: 'Mengarungi 17.000 Pulau di Atas Kapal Pinisi &amp; Mahakarya Bhinneka' (Fokus Visual &amp; Kebinekaan)</w:t>
-              <w:br/>
-              <w:t>• Kata Kunci: Berdiri di haluan kapal Pinisi berlayar di laut biru nusantara, melihat ribuan pulau dengan rumah adat melingkar dan beratap perahu, menyatukan seluruh nada dalam simfoni persaudaraan.</w:t>
-              <w:br/>
-              <w:t>• Cocok Jika: Mishka sedang dalam suasana tenang, reflektif, dan menyukai seni budaya nusantara.</w:t>
+              <w:t>"Mishka, duduk tegak dan rileks... pejamkan kedua matamu perlahan. Tarik napas sejuk dari hidung... hembuskan. Bayangkan Mishka sedang berdiri di puncak Lembah Baliem Pegunungan Jayawijaya Papua saat senja. Dinginnya menusuk jaket tebalmu... suhunya anjlok sampai 5 derajat Celsius! Setiap kali Mishka bernapas, keluar uap putih es. Ujung jari mulai kaku kedinginan. Tapi di depanmu berdiri rumah bulat silinder beratap jerami tebal tanpa jendela sama sekali. Mishka melangkah masuk lewat pintunya yang rendah... WUSH! Seketika udara berubah hangat 22 derajat Celsius! Di tengah ruangan ada bara perapian kayu yang menyala tenang. Tak ada angin dingin yang bisa menembus masuk... Sekarang, buka kedua matamu perlahan Mishka!"</w:t>
             </w:r>
           </w:p>
         </w:tc>
       </w:tr>
     </w:tbl>
     <w:p/>
-    <w:p>
-      <w:r>
-        <w:rPr>
-          <w:b/>
-        </w:rPr>
-        <w:t>⏱️ SCRIPT WORD-BY-WORD: SESI 2 MISHKA (MENIT 00:00 - 60:00)</w:t>
-      </w:r>
-    </w:p>
     <w:p>
       <w:pPr>
         <w:spacing w:before="60" w:after="60"/>
@@ -1187,7 +585,7 @@
           <w:color w:val="64748B"/>
           <w:sz w:val="18"/>
         </w:rPr>
-        <w:t>[Tersenyum manis, menyapa dengan nada hangat]</w:t>
+        <w:t>[Tersenyum ramah di Zoom]</w:t>
         <w:br/>
       </w:r>
       <w:r>
@@ -1205,7 +603,7 @@
           <w:color w:val="0F172A"/>
           <w:sz w:val="20"/>
         </w:rPr>
-        <w:t>"Halo Mishka! Assalamu'alaikum! Senang sekali bisa bertatap muka lagi dengan Mishka di Zoom hari ini! Gimana latihannya minggu ini? Sehat dan semangat kan?"</w:t>
+        <w:t>"Halo Mishka! Assalamu'alaikum! Senang sekali bisa ketemu lagi di Zoom hari ini! Gimana latihannya minggu ini? Sehat dan semangat kan?"</w:t>
       </w:r>
     </w:p>
     <w:p>
@@ -1244,7 +642,7 @@
           <w:color w:val="64748B"/>
           <w:sz w:val="18"/>
         </w:rPr>
-        <w:t>[Suara lembut menenangkan, tempo santai]</w:t>
+        <w:t>[Memantik rasa ingin tahu]</w:t>
         <w:br/>
       </w:r>
       <w:r>
@@ -1262,81 +660,7 @@
           <w:color w:val="0F172A"/>
           <w:sz w:val="20"/>
         </w:rPr>
-        <w:t>"Wah hebat! Nah Mishka, sebelum kita masuk ke buku teks dan slide Canva, Bu Tiara punya rahasia sains luar biasa yang berhubungan langsung dengan kelenturan gerak tubuh Mishka dan kehebatan nenek moyang bangsa kita. Yuk, duduk tegak tapi rileks di kursimu... sekarang, pejamkan kedua mata Mishka perlahan-lahan. Tarik napas dalam-dalam dari hidung... rasakan udara sejuk mengisi dadamu... hembuskan perlahan..."</w:t>
-      </w:r>
-    </w:p>
-    <w:p>
-      <w:r>
-        <w:rPr>
-          <w:i/>
-        </w:rPr>
-        <w:t>─── JIKA GURU MEMILIH PILIHAN A (EKSPEDISI SUHU 5°C LEMBAH BALIEM PAPUA) ───</w:t>
-      </w:r>
-    </w:p>
-    <w:p>
-      <w:pPr>
-        <w:spacing w:before="60" w:after="60"/>
-        <w:ind w:left="0"/>
-      </w:pPr>
-      <w:r>
-        <w:rPr>
-          <w:rFonts w:ascii="Calibri" w:hAnsi="Calibri"/>
-          <w:i/>
-          <w:color w:val="64748B"/>
-          <w:sz w:val="18"/>
-        </w:rPr>
-        <w:t>[Suara mendalam, menciptakan imajinasi suhu termal yang nyata]</w:t>
-        <w:br/>
-      </w:r>
-      <w:r>
-        <w:rPr>
-          <w:rFonts w:ascii="Arial" w:hAnsi="Arial"/>
-          <w:b/>
-          <w:color w:val="BE123C"/>
-          <w:sz w:val="20"/>
-        </w:rPr>
-        <w:t xml:space="preserve">Guru Tiara: </w:t>
-      </w:r>
-      <w:r>
-        <w:rPr>
-          <w:rFonts w:ascii="Calibri" w:hAnsi="Calibri"/>
-          <w:color w:val="0F172A"/>
-          <w:sz w:val="20"/>
-        </w:rPr>
-        <w:t>"Bayangkan Mishka sedang berdiri di atas puncak Lembah Baliem Pegunungan Jayawijaya Papua. Matahari baru saja terbenam di balik bukit kabut. Dinginnya luar biasa menusuk jaket tebalmu... suhunya anjlok sampai 5 derajat Celsius! Setiap kali Mishka menghembuskan napas, keluar uap putih seperti es di udara. Ujung-ujung jari Mishka mulai kaku kedinginan. Tapi di depan Mishka, berdiri sebuah rumah tradisional berbentuk silinder bundar beratap jerami ilalang kering yang sangat tebal. Rumah itu tidak punya jendela sama sekali. Mishka melangkah masuk melewati pintu kecilnya yang rendah... Dan begitu berada di dalam: WUSH! Udara langsung berubah menjadi hangat dan nyaman, sekitar 22 derajat Celsius! Di tengah ruangan, ada perapian kayu kecil yang menyala tenang. Tak ada angin dingin yang bisa menembus masuk... Sekarang, buka kedua mata Mishka perlahan-lahan!"</w:t>
-      </w:r>
-    </w:p>
-    <w:p>
-      <w:pPr>
-        <w:spacing w:before="60" w:after="60"/>
-        <w:ind w:left="0"/>
-      </w:pPr>
-      <w:r>
-        <w:rPr>
-          <w:rFonts w:ascii="Calibri" w:hAnsi="Calibri"/>
-          <w:i/>
-          <w:color w:val="64748B"/>
-          <w:sz w:val="18"/>
-        </w:rPr>
-        <w:t>[Tersenyum menatap mata Mishka di kamera]</w:t>
-        <w:br/>
-      </w:r>
-      <w:r>
-        <w:rPr>
-          <w:rFonts w:ascii="Arial" w:hAnsi="Arial"/>
-          <w:b/>
-          <w:color w:val="BE123C"/>
-          <w:sz w:val="20"/>
-        </w:rPr>
-        <w:t xml:space="preserve">Guru Tiara: </w:t>
-      </w:r>
-      <w:r>
-        <w:rPr>
-          <w:rFonts w:ascii="Calibri" w:hAnsi="Calibri"/>
-          <w:color w:val="0F172A"/>
-          <w:sz w:val="20"/>
-        </w:rPr>
-        <w:t>"Mishka, pernahkah terpikir: kenapa nenek moyang suku Dani di Papua merancang Rumah Honai berbentuk bulat melingkar dan sengaja TIDAK membuat jendela sama sekali? Apakah karena mereka kehabisan bahan bangunan, atau karena mereka adalah ilmuwan termodinamika alami yang sangat jenius?"</w:t>
+        <w:t>"Mishka, pernahkah terpikir: kenapa nenek moyang suku Dani Papua membuat Honai bulat tanpa jendela sama sekali? Apakah karena kehabisan bahan, atau karena mereka ilmuwan termodinamika alami yang sangat jenius?"</w:t>
       </w:r>
     </w:p>
     <w:p>
@@ -1393,15 +717,7 @@
           <w:color w:val="0F172A"/>
           <w:sz w:val="20"/>
         </w:rPr>
-        <w:t>"BINGO! Cerdas sekali analisis sains Mishka! Itu yang di fisika modern disebut 'Heat Trap' atau perangkap kalor alami! Tanpa AC, tanpa pemanas listrik canggih, mereka mampu bertahan hidup di pegunungan beku 5 derajat Celsius selama ratusan tahun!"</w:t>
-      </w:r>
-    </w:p>
-    <w:p>
-      <w:r>
-        <w:rPr>
-          <w:b/>
-        </w:rPr>
-        <w:t>📖 [Menit 08:00 - 20:00] Pendalaman Materi Textbook Kemendikbud &amp; Sains Arsitektur</w:t>
+        <w:t>"BINGO! Cerdas sekali analisis sains Mishka! Itu yang di fisika modern disebut 'Heat Trap' atau perangkap kalor alami! Tanpa listrik canggih, mereka mampu bertahan hidup di pegunungan beku 5 derajat Celsius selama ratusan tahun!"</w:t>
       </w:r>
     </w:p>
     <w:p>
@@ -1416,7 +732,7 @@
           <w:color w:val="64748B"/>
           <w:sz w:val="18"/>
         </w:rPr>
-        <w:t>[Menunjukkan perbandingan gambar di slide Canva]</w:t>
+        <w:t>[Menjelaskan materi textbook]</w:t>
         <w:br/>
       </w:r>
       <w:r>
@@ -1434,7 +750,40 @@
           <w:color w:val="0F172A"/>
           <w:sz w:val="20"/>
         </w:rPr>
-        <w:t>"Coba lihat Slide 2 dan 4 Canva ini Mishka. Buku Siswa Kemendikbud halaman 63 mencatat bahwa Indonesia adalah negara kepulauan terbesar di dunia dengan lebih dari 17.000 pulau! Nah, karena pulau-pulau kita dipisahkan oleh lautan luas, setiap suku mengembangkan adaptasi rumah adat dan pakaian yang unik sesuai tantangan alamnya. Coba bandingkan Honai di Papua tadi dengan Rumah Gadang di Minangkabau Sumatera Barat. Kalau Honai bentuknya bulat tanpa jendela, Rumah Gadang bentuk atapnya melengkung runcing seperti tanduk kerbau dan dibangun dengan tiang panggung tanpa paku besi sama sekali!"</w:t>
+        <w:t>"Buku Siswa Kemendikbud halaman 63 mencatat bahwa Indonesia punya lebih dari 17.000 pulau. Bandingkan Honai penahan dingin beku dengan Rumah Gadang di Minangkabau yang memakai sistem pasak kayu elastis tanpa paku besi sama sekali untuk meredam gempa bumi, persis kelenturan senam lantai! Dan ada Rumah Tongkonan Toraja beratap perahu. Sikap membanggakan budaya sendiri berlebihan dan meremehkan budaya lain disebut Etnosentrisme, dan Pelajar Pancasila wajib melawannya!"</w:t>
+      </w:r>
+    </w:p>
+    <w:p>
+      <w:pPr>
+        <w:spacing w:before="60" w:after="60"/>
+        <w:ind w:left="0"/>
+      </w:pPr>
+      <w:r>
+        <w:rPr>
+          <w:rFonts w:ascii="Calibri" w:hAnsi="Calibri"/>
+          <w:i/>
+          <w:color w:val="64748B"/>
+          <w:sz w:val="18"/>
+        </w:rPr>
+        <w:t>[Mengarahkan ke game web]</w:t>
+        <w:br/>
+      </w:r>
+      <w:r>
+        <w:rPr>
+          <w:rFonts w:ascii="Arial" w:hAnsi="Arial"/>
+          <w:b/>
+          <w:color w:val="BE123C"/>
+          <w:sz w:val="20"/>
+        </w:rPr>
+        <w:t xml:space="preserve">Guru Tiara: </w:t>
+      </w:r>
+      <w:r>
+        <w:rPr>
+          <w:rFonts w:ascii="Calibri" w:hAnsi="Calibri"/>
+          <w:color w:val="0F172A"/>
+          <w:sz w:val="20"/>
+        </w:rPr>
+        <w:t>"Buka game Pancasila di: https://tiara-dwi.github.io/pkbm-games/pancasila/, pilih nama Mishka dan klik tab Kelas 5. Ada 4 Misi Ekspedisi Sains &amp; Budaya untuk kumpulkan 400 Poin!"</w:t>
       </w:r>
     </w:p>
     <w:p>
@@ -1458,7 +807,7 @@
           <w:color w:val="334155"/>
           <w:sz w:val="20"/>
         </w:rPr>
-        <w:t>"Tanpa paku besi bu? Terus nyambung kayunya pakai apa?"</w:t>
+        <w:t>"Misi 1 Honai dapet 100 poin! Misi 2 pasak gempa Gadang dapet 100 poin! Misi 3 anti-etnosentrisme dapet 100 poin! Dan Misi 4 Mini Test betul semua dapet 100 poin! Total 400 poin sempurna bu!"</w:t>
       </w:r>
     </w:p>
     <w:p>
@@ -1473,7 +822,7 @@
           <w:color w:val="64748B"/>
           <w:sz w:val="18"/>
         </w:rPr>
-        <w:t>[Menjelaskan dengan analogi senam lantai yang dekat dengan Mishka]</w:t>
+        <w:t>[Mendiktekan 5 poin ringkas resmi]</w:t>
         <w:br/>
       </w:r>
       <w:r>
@@ -1491,7 +840,40 @@
           <w:color w:val="0F172A"/>
           <w:sz w:val="20"/>
         </w:rPr>
-        <w:t>"Mereka memakai sistem pasak kayu elastis! Dan ini rahasia sainsnya: Sumatera Barat berada di jalur rawan gempa bumi. Bangunan semen modern yang kaku jika diguncang gempa 7.5 SR akan patah dan retak roboh. Tapi Rumah Gadang, berkat pasak kayu elastisnya, justru bergoyang luwes meredam getaran gempa persis seperti tubuh pesenam lantai yang lentur saat melakukan pendaratan! Tidak retak, tidak patah, dan berdiri kokoh ratusan tahun!"</w:t>
+        <w:t>"Alhamdulillah! Sekarang ambil buku tulis PPKn dan pulpen Mishka. Kita catat 5 poin inti sains dan budaya nusantara hari ini ya!"</w:t>
+      </w:r>
+    </w:p>
+    <w:p>
+      <w:pPr>
+        <w:spacing w:before="60" w:after="60"/>
+        <w:ind w:left="0"/>
+      </w:pPr>
+      <w:r>
+        <w:rPr>
+          <w:rFonts w:ascii="Calibri" w:hAnsi="Calibri"/>
+          <w:i/>
+          <w:color w:val="64748B"/>
+          <w:sz w:val="18"/>
+        </w:rPr>
+        <w:t>[Refleksi akhir]</w:t>
+        <w:br/>
+      </w:r>
+      <w:r>
+        <w:rPr>
+          <w:rFonts w:ascii="Arial" w:hAnsi="Arial"/>
+          <w:b/>
+          <w:color w:val="BE123C"/>
+          <w:sz w:val="20"/>
+        </w:rPr>
+        <w:t xml:space="preserve">Guru Tiara: </w:t>
+      </w:r>
+      <w:r>
+        <w:rPr>
+          <w:rFonts w:ascii="Calibri" w:hAnsi="Calibri"/>
+          <w:color w:val="0F172A"/>
+          <w:sz w:val="20"/>
+        </w:rPr>
+        <w:t>"Bagaimana Mishka memadukan kelenturan lingkaran Honai dan keagungan haluan Tongkonan dalam gerakan senam lantai nanti?"</w:t>
       </w:r>
     </w:p>
     <w:p>
@@ -1515,7 +897,7 @@
           <w:color w:val="334155"/>
           <w:sz w:val="20"/>
         </w:rPr>
-        <w:t>"Wah keren banget bu! Ternyata rumah adat kita sarat dengan sains ya!"</w:t>
+        <w:t>"Bisa bikin gerakan melingkar lentur seperti Honai, lalu gerakan tangan membentang seperti atap perahu Tongkonan bu! Keduanya indah kalau bersatu!"</w:t>
       </w:r>
     </w:p>
     <w:p>
@@ -1530,7 +912,7 @@
           <w:color w:val="64748B"/>
           <w:sz w:val="18"/>
         </w:rPr>
-        <w:t>[Memantik kesadaran moral]</w:t>
+        <w:t>[Menutup Sesi 2]</w:t>
         <w:br/>
       </w:r>
       <w:r>
@@ -1548,563 +930,7 @@
           <w:color w:val="0F172A"/>
           <w:sz w:val="20"/>
         </w:rPr>
-        <w:t>"Sangat sarat sains! Dan ada satu lagi rumah adat megah bernama Rumah Tongkonan dari Toraja yang bentuk atapnya menyerupai perahu untuk menghormati leluhur pelaut. Nah Mishka, jika semua suku punya kejeniusan masing-masing, pantas tidak jika ada teman yang mengejek tarian atau rumah adat suku lain?"</w:t>
-      </w:r>
-    </w:p>
-    <w:p>
-      <w:pPr>
-        <w:spacing w:before="60" w:after="60"/>
-        <w:ind w:left="288"/>
-      </w:pPr>
-      <w:r>
-        <w:rPr>
-          <w:rFonts w:ascii="Arial" w:hAnsi="Arial"/>
-          <w:b/>
-          <w:color w:val="0284C7"/>
-          <w:sz w:val="20"/>
-        </w:rPr>
-        <w:t xml:space="preserve">Mishka: </w:t>
-      </w:r>
-      <w:r>
-        <w:rPr>
-          <w:rFonts w:ascii="Calibri" w:hAnsi="Calibri"/>
-          <w:i/>
-          <w:color w:val="334155"/>
-          <w:sz w:val="20"/>
-        </w:rPr>
-        <w:t>"Sama sekali nggak pantas bu! Kita harus saling menghargai dan bangga dengan semua suku."</w:t>
-      </w:r>
-    </w:p>
-    <w:p>
-      <w:pPr>
-        <w:spacing w:before="60" w:after="60"/>
-        <w:ind w:left="0"/>
-      </w:pPr>
-      <w:r>
-        <w:rPr>
-          <w:rFonts w:ascii="Calibri" w:hAnsi="Calibri"/>
-          <w:i/>
-          <w:color w:val="64748B"/>
-          <w:sz w:val="18"/>
-        </w:rPr>
-        <w:t>[Memberikan apresiasi moral]</w:t>
-        <w:br/>
-      </w:r>
-      <w:r>
-        <w:rPr>
-          <w:rFonts w:ascii="Arial" w:hAnsi="Arial"/>
-          <w:b/>
-          <w:color w:val="BE123C"/>
-          <w:sz w:val="20"/>
-        </w:rPr>
-        <w:t xml:space="preserve">Guru Tiara: </w:t>
-      </w:r>
-      <w:r>
-        <w:rPr>
-          <w:rFonts w:ascii="Calibri" w:hAnsi="Calibri"/>
-          <w:color w:val="0F172A"/>
-          <w:sz w:val="20"/>
-        </w:rPr>
-        <w:t>"Benar sekali! Sikap memandang budayanya sendiri paling hebat dan meremehkan budaya lain itu dinamakan 'Etnosentrisme'. Dan Pelajar Pancasila sejati seperti Mishka selalu menolak paham etnosentrisme!"</w:t>
-      </w:r>
-    </w:p>
-    <w:p>
-      <w:r>
-        <w:rPr>
-          <w:b/>
-        </w:rPr>
-        <w:t>🎮 [Menit 20:00 - 40:00] Praktik Langsung 4 Misi di Game Web Interaktif Mishka</w:t>
-      </w:r>
-    </w:p>
-    <w:p>
-      <w:pPr>
-        <w:spacing w:before="60" w:after="60"/>
-        <w:ind w:left="0"/>
-      </w:pPr>
-      <w:r>
-        <w:rPr>
-          <w:rFonts w:ascii="Calibri" w:hAnsi="Calibri"/>
-          <w:i/>
-          <w:color w:val="64748B"/>
-          <w:sz w:val="18"/>
-        </w:rPr>
-        <w:t>[Membimbing Mishka membuka game]</w:t>
-        <w:br/>
-      </w:r>
-      <w:r>
-        <w:rPr>
-          <w:rFonts w:ascii="Arial" w:hAnsi="Arial"/>
-          <w:b/>
-          <w:color w:val="BE123C"/>
-          <w:sz w:val="20"/>
-        </w:rPr>
-        <w:t xml:space="preserve">Guru Tiara: </w:t>
-      </w:r>
-      <w:r>
-        <w:rPr>
-          <w:rFonts w:ascii="Calibri" w:hAnsi="Calibri"/>
-          <w:color w:val="0F172A"/>
-          <w:sz w:val="20"/>
-        </w:rPr>
-        <w:t>"Sekarang buka browser Mishka di: https://tiara-dwi.github.io/pkbm-games/pancasila/. Pilih nama Mishka di pojok kanan atas, lalu klik tab 'Sesi 2: Mishka'. Ada 4 Misi Ekspedisi Sains &amp; Budaya untuk Mishka kumpulkan hingga 400 Poin!"</w:t>
-      </w:r>
-    </w:p>
-    <w:p>
-      <w:pPr>
-        <w:spacing w:before="60" w:after="60"/>
-        <w:ind w:left="0"/>
-      </w:pPr>
-      <w:r>
-        <w:rPr>
-          <w:rFonts w:ascii="Calibri" w:hAnsi="Calibri"/>
-          <w:i/>
-          <w:color w:val="64748B"/>
-          <w:sz w:val="18"/>
-        </w:rPr>
-        <w:t>[Membimbing Misi 1]</w:t>
-        <w:br/>
-      </w:r>
-      <w:r>
-        <w:rPr>
-          <w:rFonts w:ascii="Arial" w:hAnsi="Arial"/>
-          <w:b/>
-          <w:color w:val="BE123C"/>
-          <w:sz w:val="20"/>
-        </w:rPr>
-        <w:t xml:space="preserve">Guru Tiara: </w:t>
-      </w:r>
-      <w:r>
-        <w:rPr>
-          <w:rFonts w:ascii="Calibri" w:hAnsi="Calibri"/>
-          <w:color w:val="0F172A"/>
-          <w:sz w:val="20"/>
-        </w:rPr>
-        <w:t>"Klik 'Misi 1: Sains Honai 5°C'. Coba klik tombol pasang jendela kaca dulu!"</w:t>
-      </w:r>
-    </w:p>
-    <w:p>
-      <w:pPr>
-        <w:spacing w:before="60" w:after="60"/>
-        <w:ind w:left="288"/>
-      </w:pPr>
-      <w:r>
-        <w:rPr>
-          <w:rFonts w:ascii="Arial" w:hAnsi="Arial"/>
-          <w:b/>
-          <w:color w:val="0284C7"/>
-          <w:sz w:val="20"/>
-        </w:rPr>
-        <w:t xml:space="preserve">Mishka: </w:t>
-      </w:r>
-      <w:r>
-        <w:rPr>
-          <w:rFonts w:ascii="Calibri" w:hAnsi="Calibri"/>
-          <w:i/>
-          <w:color w:val="334155"/>
-          <w:sz w:val="20"/>
-        </w:rPr>
-        <w:t>"Wah suhu di dalam rumahnya langsung drop jadi 7 derajat bu! Ada tanda merah hipotermia!"</w:t>
-      </w:r>
-    </w:p>
-    <w:p>
-      <w:pPr>
-        <w:spacing w:before="60" w:after="60"/>
-        <w:ind w:left="0"/>
-      </w:pPr>
-      <w:r>
-        <w:rPr>
-          <w:rFonts w:ascii="Calibri" w:hAnsi="Calibri"/>
-          <w:i/>
-          <w:color w:val="64748B"/>
-          <w:sz w:val="18"/>
-        </w:rPr>
-        <w:t>[Tersenyum menanti reaksi]</w:t>
-        <w:br/>
-      </w:r>
-      <w:r>
-        <w:rPr>
-          <w:rFonts w:ascii="Arial" w:hAnsi="Arial"/>
-          <w:b/>
-          <w:color w:val="BE123C"/>
-          <w:sz w:val="20"/>
-        </w:rPr>
-        <w:t xml:space="preserve">Guru Tiara: </w:t>
-      </w:r>
-      <w:r>
-        <w:rPr>
-          <w:rFonts w:ascii="Calibri" w:hAnsi="Calibri"/>
-          <w:color w:val="0F172A"/>
-          <w:sz w:val="20"/>
-        </w:rPr>
-        <w:t>"Nah, sekarang klik tombol desain asli Honai tanpa jendela!"</w:t>
-      </w:r>
-    </w:p>
-    <w:p>
-      <w:pPr>
-        <w:spacing w:before="60" w:after="60"/>
-        <w:ind w:left="288"/>
-      </w:pPr>
-      <w:r>
-        <w:rPr>
-          <w:rFonts w:ascii="Arial" w:hAnsi="Arial"/>
-          <w:b/>
-          <w:color w:val="0284C7"/>
-          <w:sz w:val="20"/>
-        </w:rPr>
-        <w:t xml:space="preserve">Aqlan/Mishka: </w:t>
-      </w:r>
-      <w:r>
-        <w:rPr>
-          <w:rFonts w:ascii="Calibri" w:hAnsi="Calibri"/>
-          <w:i/>
-          <w:color w:val="334155"/>
-          <w:sz w:val="20"/>
-        </w:rPr>
-        <w:t>"Horeee! Suhunya naik jadi 22 derajat hangat nyaman! Dapet 100 poin pertama bu!"</w:t>
-      </w:r>
-    </w:p>
-    <w:p>
-      <w:pPr>
-        <w:spacing w:before="60" w:after="60"/>
-        <w:ind w:left="0"/>
-      </w:pPr>
-      <w:r>
-        <w:rPr>
-          <w:rFonts w:ascii="Calibri" w:hAnsi="Calibri"/>
-          <w:i/>
-          <w:color w:val="64748B"/>
-          <w:sz w:val="18"/>
-        </w:rPr>
-        <w:t>[Membimbing Misi 2]</w:t>
-        <w:br/>
-      </w:r>
-      <w:r>
-        <w:rPr>
-          <w:rFonts w:ascii="Arial" w:hAnsi="Arial"/>
-          <w:b/>
-          <w:color w:val="BE123C"/>
-          <w:sz w:val="20"/>
-        </w:rPr>
-        <w:t xml:space="preserve">Guru Tiara: </w:t>
-      </w:r>
-      <w:r>
-        <w:rPr>
-          <w:rFonts w:ascii="Calibri" w:hAnsi="Calibri"/>
-          <w:color w:val="0F172A"/>
-          <w:sz w:val="20"/>
-        </w:rPr>
-        <w:t>"Pintar! Sekarang klik 'Misi 2: Pasak Gempa Gadang'. Uji guncangan gempa bumi pada gedung semen vs Rumah Gadang pasak elastis!"</w:t>
-      </w:r>
-    </w:p>
-    <w:p>
-      <w:pPr>
-        <w:spacing w:before="60" w:after="60"/>
-        <w:ind w:left="288"/>
-      </w:pPr>
-      <w:r>
-        <w:rPr>
-          <w:rFonts w:ascii="Arial" w:hAnsi="Arial"/>
-          <w:b/>
-          <w:color w:val="0284C7"/>
-          <w:sz w:val="20"/>
-        </w:rPr>
-        <w:t xml:space="preserve">Mishka: </w:t>
-      </w:r>
-      <w:r>
-        <w:rPr>
-          <w:rFonts w:ascii="Calibri" w:hAnsi="Calibri"/>
-          <w:i/>
-          <w:color w:val="334155"/>
-          <w:sz w:val="20"/>
-        </w:rPr>
-        <w:t>"Gedung semennya roboh retak bu, tapi Rumah Gadangnya bergoyang lentur dan aman! Tambah 100 poin lagi jadi 200!"</w:t>
-      </w:r>
-    </w:p>
-    <w:p>
-      <w:pPr>
-        <w:spacing w:before="60" w:after="60"/>
-        <w:ind w:left="0"/>
-      </w:pPr>
-      <w:r>
-        <w:rPr>
-          <w:rFonts w:ascii="Calibri" w:hAnsi="Calibri"/>
-          <w:i/>
-          <w:color w:val="64748B"/>
-          <w:sz w:val="18"/>
-        </w:rPr>
-        <w:t>[Membimbing Misi 3]</w:t>
-        <w:br/>
-      </w:r>
-      <w:r>
-        <w:rPr>
-          <w:rFonts w:ascii="Arial" w:hAnsi="Arial"/>
-          <w:b/>
-          <w:color w:val="BE123C"/>
-          <w:sz w:val="20"/>
-        </w:rPr>
-        <w:t xml:space="preserve">Guru Tiara: </w:t>
-      </w:r>
-      <w:r>
-        <w:rPr>
-          <w:rFonts w:ascii="Calibri" w:hAnsi="Calibri"/>
-          <w:color w:val="0F172A"/>
-          <w:sz w:val="20"/>
-        </w:rPr>
-        <w:t>"Luar biasa! Lanjut ke 'Misi 3: Anti-Etnosentrisme'. Selesaikan kasus teman yang mengejek budaya lain saat festival seni!"</w:t>
-      </w:r>
-    </w:p>
-    <w:p>
-      <w:pPr>
-        <w:spacing w:before="60" w:after="60"/>
-        <w:ind w:left="288"/>
-      </w:pPr>
-      <w:r>
-        <w:rPr>
-          <w:rFonts w:ascii="Arial" w:hAnsi="Arial"/>
-          <w:b/>
-          <w:color w:val="0284C7"/>
-          <w:sz w:val="20"/>
-        </w:rPr>
-        <w:t xml:space="preserve">Mishka: </w:t>
-      </w:r>
-      <w:r>
-        <w:rPr>
-          <w:rFonts w:ascii="Calibri" w:hAnsi="Calibri"/>
-          <w:i/>
-          <w:color w:val="334155"/>
-          <w:sz w:val="20"/>
-        </w:rPr>
-        <w:t>"Udah bu! Sekarang skorku 300 poin!"</w:t>
-      </w:r>
-    </w:p>
-    <w:p>
-      <w:pPr>
-        <w:spacing w:before="60" w:after="60"/>
-        <w:ind w:left="0"/>
-      </w:pPr>
-      <w:r>
-        <w:rPr>
-          <w:rFonts w:ascii="Calibri" w:hAnsi="Calibri"/>
-          <w:i/>
-          <w:color w:val="64748B"/>
-          <w:sz w:val="18"/>
-        </w:rPr>
-        <w:t>[Mengawasi pengerjaan mini test]</w:t>
-        <w:br/>
-      </w:r>
-      <w:r>
-        <w:rPr>
-          <w:rFonts w:ascii="Arial" w:hAnsi="Arial"/>
-          <w:b/>
-          <w:color w:val="BE123C"/>
-          <w:sz w:val="20"/>
-        </w:rPr>
-        <w:t xml:space="preserve">Guru Tiara: </w:t>
-      </w:r>
-      <w:r>
-        <w:rPr>
-          <w:rFonts w:ascii="Calibri" w:hAnsi="Calibri"/>
-          <w:color w:val="0F172A"/>
-          <w:sz w:val="20"/>
-        </w:rPr>
-        <w:t>"Hebat! Misi puncak kita: klik 'Misi 4: Mini Test C3-C4'. Ada 4 soal pilihan ganda analisis sains arsitektur. Kerjakan dengan teliti ya Mishka!"</w:t>
-      </w:r>
-    </w:p>
-    <w:p>
-      <w:pPr>
-        <w:spacing w:before="60" w:after="60"/>
-        <w:ind w:left="288"/>
-      </w:pPr>
-      <w:r>
-        <w:rPr>
-          <w:rFonts w:ascii="Arial" w:hAnsi="Arial"/>
-          <w:b/>
-          <w:color w:val="0284C7"/>
-          <w:sz w:val="20"/>
-        </w:rPr>
-        <w:t xml:space="preserve">Mishka: </w:t>
-      </w:r>
-      <w:r>
-        <w:rPr>
-          <w:rFonts w:ascii="Calibri" w:hAnsi="Calibri"/>
-          <w:i/>
-          <w:color w:val="334155"/>
-          <w:sz w:val="20"/>
-        </w:rPr>
-        <w:t>"Alhamdulillah bu, betul semua! Skorku 400 sempurna dan dapat sertifikat Duta Pelestari Budaya Nusantara!"</w:t>
-      </w:r>
-    </w:p>
-    <w:p>
-      <w:r>
-        <w:rPr>
-          <w:b/>
-        </w:rPr>
-        <w:t>📝 [Menit 40:00 - 52:00] Bimbingan Menulis Catatan Ringkas di Buku Tulis Mishka</w:t>
-      </w:r>
-    </w:p>
-    <w:p>
-      <w:pPr>
-        <w:spacing w:before="60" w:after="60"/>
-        <w:ind w:left="0"/>
-      </w:pPr>
-      <w:r>
-        <w:rPr>
-          <w:rFonts w:ascii="Calibri" w:hAnsi="Calibri"/>
-          <w:i/>
-          <w:color w:val="64748B"/>
-          <w:sz w:val="18"/>
-        </w:rPr>
-        <w:t>[Mendiktekan dengan terstruktur dan jelas]</w:t>
-        <w:br/>
-      </w:r>
-      <w:r>
-        <w:rPr>
-          <w:rFonts w:ascii="Arial" w:hAnsi="Arial"/>
-          <w:b/>
-          <w:color w:val="BE123C"/>
-          <w:sz w:val="20"/>
-        </w:rPr>
-        <w:t xml:space="preserve">Guru Tiara: </w:t>
-      </w:r>
-      <w:r>
-        <w:rPr>
-          <w:rFonts w:ascii="Calibri" w:hAnsi="Calibri"/>
-          <w:color w:val="0F172A"/>
-          <w:sz w:val="20"/>
-        </w:rPr>
-        <w:t>"Alhamdulillah! Sekarang ambil buku tulis PPKn dan pulpen Mishka. Kita catat 5 poin inti sains dan budaya nusantara hari ini:</w:t>
-        <w:br/>
-        <w:t>1. Tiga faktor keragaman budaya: letak strategis, kondisi kepulauan (&gt;17.000 pulau), dan perbedaan bentang alam/iklim.</w:t>
-        <w:br/>
-        <w:t>2. Sains Termodinamika Rumah Honai (Papua): Bentuk silinder jerami tebal tanpa jendela mengunci kalor perapian (heat trap) dari dingin beku 5°C pegunungan.</w:t>
-        <w:br/>
-        <w:t>3. Sains Tahan Gempa Rumah Gadang (Minangkabau): Dibangun dengan pasak kayu elastis tanpa paku besi sehingga lentur meredam getaran seismik gempa bumi.</w:t>
-        <w:br/>
-        <w:t>4. Rumah Tongkonan (Toraja): Atap lengkung perahu menghormati leluhur maritim dan panggung tinggi melancarkan udara lembap tropis.</w:t>
-        <w:br/>
-        <w:t>5. Anti-Etnosentrisme: Menghindari sikap menganggap budayanya sendiri paling unggul dan selalu mengagumi mahakarya kebinekaan Indonesia!"</w:t>
-      </w:r>
-    </w:p>
-    <w:p>
-      <w:pPr>
-        <w:spacing w:before="60" w:after="60"/>
-        <w:ind w:left="288"/>
-      </w:pPr>
-      <w:r>
-        <w:rPr>
-          <w:rFonts w:ascii="Arial" w:hAnsi="Arial"/>
-          <w:b/>
-          <w:color w:val="0284C7"/>
-          <w:sz w:val="20"/>
-        </w:rPr>
-        <w:t xml:space="preserve">Mishka: </w:t>
-      </w:r>
-      <w:r>
-        <w:rPr>
-          <w:rFonts w:ascii="Calibri" w:hAnsi="Calibri"/>
-          <w:i/>
-          <w:color w:val="334155"/>
-          <w:sz w:val="20"/>
-        </w:rPr>
-        <w:t>"Sudah selesai bu Tiara! Catatannya rapi dan lengkap!"</w:t>
-      </w:r>
-    </w:p>
-    <w:p>
-      <w:r>
-        <w:rPr>
-          <w:b/>
-        </w:rPr>
-        <w:t>🌟 [Menit 52:00 - 60:00] Refleksi Karakter &amp; Penutupan Sesi 2</w:t>
-      </w:r>
-    </w:p>
-    <w:p>
-      <w:pPr>
-        <w:spacing w:before="60" w:after="60"/>
-        <w:ind w:left="0"/>
-      </w:pPr>
-      <w:r>
-        <w:rPr>
-          <w:rFonts w:ascii="Calibri" w:hAnsi="Calibri"/>
-          <w:i/>
-          <w:color w:val="64748B"/>
-          <w:sz w:val="18"/>
-        </w:rPr>
-        <w:t>[Menatap hangat dan menginspirasi]</w:t>
-        <w:br/>
-      </w:r>
-      <w:r>
-        <w:rPr>
-          <w:rFonts w:ascii="Arial" w:hAnsi="Arial"/>
-          <w:b/>
-          <w:color w:val="BE123C"/>
-          <w:sz w:val="20"/>
-        </w:rPr>
-        <w:t xml:space="preserve">Guru Tiara: </w:t>
-      </w:r>
-      <w:r>
-        <w:rPr>
-          <w:rFonts w:ascii="Calibri" w:hAnsi="Calibri"/>
-          <w:color w:val="0F172A"/>
-          <w:sz w:val="20"/>
-        </w:rPr>
-        <w:t>"Alhamdulillah, bangga sekali Bu Tiara sama Mishka hari ini! Sebagai refleksi akhir: bagaimana Mishka memadukan kelenturan lingkaran Honai dan keagungan haluan Tongkonan dalam koreografi senam lantai Mishka di sekolah nanti?"</w:t>
-      </w:r>
-    </w:p>
-    <w:p>
-      <w:pPr>
-        <w:spacing w:before="60" w:after="60"/>
-        <w:ind w:left="288"/>
-      </w:pPr>
-      <w:r>
-        <w:rPr>
-          <w:rFonts w:ascii="Arial" w:hAnsi="Arial"/>
-          <w:b/>
-          <w:color w:val="0284C7"/>
-          <w:sz w:val="20"/>
-        </w:rPr>
-        <w:t xml:space="preserve">Mishka: </w:t>
-      </w:r>
-      <w:r>
-        <w:rPr>
-          <w:rFonts w:ascii="Calibri" w:hAnsi="Calibri"/>
-          <w:i/>
-          <w:color w:val="334155"/>
-          <w:sz w:val="20"/>
-        </w:rPr>
-        <w:t>"Aku bisa bikin gerakan melingkar yang lentur seperti Honai, lalu gerakan tangan tegak membentang seperti atap perahu Tongkonan bu! Keduanya indah kalau bersatu!"</w:t>
-      </w:r>
-    </w:p>
-    <w:p>
-      <w:pPr>
-        <w:spacing w:before="60" w:after="60"/>
-        <w:ind w:left="0"/>
-      </w:pPr>
-      <w:r>
-        <w:rPr>
-          <w:rFonts w:ascii="Calibri" w:hAnsi="Calibri"/>
-          <w:i/>
-          <w:color w:val="64748B"/>
-          <w:sz w:val="18"/>
-        </w:rPr>
-        <w:t>[Tersenyum bangga, melambaikan tangan, menutup sesi Zoom Mishka]</w:t>
-        <w:br/>
-      </w:r>
-      <w:r>
-        <w:rPr>
-          <w:rFonts w:ascii="Arial" w:hAnsi="Arial"/>
-          <w:b/>
-          <w:color w:val="BE123C"/>
-          <w:sz w:val="20"/>
-        </w:rPr>
-        <w:t xml:space="preserve">Guru Tiara: </w:t>
-      </w:r>
-      <w:r>
-        <w:rPr>
-          <w:rFonts w:ascii="Calibri" w:hAnsi="Calibri"/>
-          <w:color w:val="0F172A"/>
-          <w:sz w:val="20"/>
-        </w:rPr>
-        <w:t>"Subhanallah, sebuah gagasan koreografi persatuan yang sangat puitis dan indah! Selamat ya Mishka, resmi dinobatkan sebagai Duta Pelestari Budaya Nusantara SD dengan skor 400 sempurna! Terima kasih banyak Mishka, sampai jumpa di sesi berikutnya ya. Wassalamu'alaikum warahmatullahi wabarakatuh!"</w:t>
+        <w:t>"Gagasan koreografi persatuan yang luar biasa puitis! Selamat atas predikat Duta Pelestari Budaya Nusantara 400 Poin hari ini Mishka! Sampai jumpa di sesi berikutnya ya. Wassalamu'alaikum wr. wb!"</w:t>
       </w:r>
     </w:p>
     <w:sectPr>

</xml_diff>

<commit_message>
Update comprehensive Word-by-Word teacher script with embedded images in docx format
</commit_message>
<xml_diff>
--- a/pancasila/Naskah_Guru_Word_by_Word_Lengkap_Pancasila_Sesi1_Sesi2.docx
+++ b/pancasila/Naskah_Guru_Word_by_Word_Lengkap_Pancasila_Sesi1_Sesi2.docx
@@ -35,7 +35,7 @@
                 <w:color w:val="FECDD3"/>
                 <w:sz w:val="19"/>
               </w:rPr>
-              <w:t>★ NASKAH TELEPROMPTER GURU TIARA ★</w:t>
+              <w:t>★ NASKAH RESMI TELEPROMPTER GURU TIARA ★</w:t>
               <w:br/>
             </w:r>
             <w:r>
@@ -43,9 +43,9 @@
                 <w:rFonts w:ascii="Arial Black" w:hAnsi="Arial Black"/>
                 <w:b/>
                 <w:color w:val="FFFFFF"/>
-                <w:sz w:val="32"/>
+                <w:sz w:val="31"/>
               </w:rPr>
-              <w:t>NASKAH GURU FINAL WORD-BY-WORD: PENDIDIKAN PANCASILA BAB 3</w:t>
+              <w:t>NASKAH GURU WORD-BY-WORD: PENDIDIKAN PANCASILA BAB 3</w:t>
               <w:br/>
             </w:r>
             <w:r>
@@ -55,9 +55,63 @@
                 <w:color w:val="FFF1F2"/>
                 <w:sz w:val="20"/>
               </w:rPr>
-              <w:t>PILIHAN A TERKUNCI • SESI 1: AQLAN (KELAS 4) &amp; SESI 2: MISHKA (KELAS 5)</w:t>
+              <w:t>PILIHAN A TERKUNCI • SESI 1: AQLAN (KELAS 4 SD) &amp; SESI 2: MISHKA (KELAS 5 SD)</w:t>
               <w:br/>
-              <w:t>Durasi: 60 Menit Tiap Siswa • PKBM Penerus Bangsa</w:t>
+              <w:t>Durasi: 60 Menit Penuh Tiap Siswa • PKBM Penerus Bangsa • Pendekatan Storytelling Pak Gita Wirjawan</w:t>
+            </w:r>
+          </w:p>
+        </w:tc>
+      </w:tr>
+    </w:tbl>
+    <w:p/>
+    <w:tbl>
+      <w:tblPr>
+        <w:tblW w:type="auto" w:w="0"/>
+        <w:jc w:val="center"/>
+        <w:tblLayout w:type="fixed"/>
+        <w:tblLook w:firstColumn="1" w:firstRow="1" w:lastColumn="0" w:lastRow="0" w:noHBand="0" w:noVBand="1" w:val="04A0"/>
+      </w:tblPr>
+      <w:tblGrid>
+        <w:gridCol w:w="9792"/>
+      </w:tblGrid>
+      <w:tr>
+        <w:tc>
+          <w:tcPr>
+            <w:tcW w:type="dxa" w:w="10080"/>
+            <w:shd w:fill="EFF6FF"/>
+            <w:tcMar>
+              <w:top w:w="140" w:type="dxa"/>
+              <w:bottom w:w="140" w:type="dxa"/>
+              <w:left w:w="200" w:type="dxa"/>
+              <w:right w:w="200" w:type="dxa"/>
+            </w:tcMar>
+          </w:tcPr>
+          <w:p>
+            <w:r>
+              <w:rPr>
+                <w:rFonts w:ascii="Arial" w:hAnsi="Arial"/>
+                <w:b/>
+                <w:color w:val="1E40AF"/>
+                <w:sz w:val="22"/>
+              </w:rPr>
+              <w:t>🧠 PANDUAN PELAKSANAAN PEMBELAJARAN (TEKNIK GUIDED IMAGINATION &amp; INTERAKTIVITAS)</w:t>
+              <w:br/>
+            </w:r>
+            <w:r>
+              <w:rPr>
+                <w:rFonts w:ascii="Calibri" w:hAnsi="Calibri"/>
+                <w:color w:val="1E293B"/>
+                <w:sz w:val="20"/>
+              </w:rPr>
+              <w:t>1. Suasana Awal (Menit 00:00 - 08:00): Guru Tiara meminta anak duduk tegak tapi rileks, memejamkan mata, dan mengambil satu tarikan napas dalam untuk mengaktifkan imajinasi sensorik (suara, gerak, dan suhu) sesuai Pilihan A yang telah dikunci.</w:t>
+              <w:br/>
+              <w:t>2. Transisi Slide Canva (Menit 08:00 - 30:00): Mengaitkan imajinasi awal dengan konsep Buku Siswa Kemendikbud dan kehidupan sehari-hari anak.</w:t>
+              <w:br/>
+              <w:t>3. Game Web Interaktif 4 Misi (Menit 30:00 - 45:00): Membimbing anak menyelesaikan 4 Misi di portal https://tiara-dwi.github.io/pkbm-games/pancasila/ hingga meraih 400 Poin.</w:t>
+              <w:br/>
+              <w:t>4. Menulis Buku Catatan (Menit 45:00 - 55:00): Mendiktekan 5 poin ringkas resmi untuk disalin rapi ke buku tulis PPKn siswa.</w:t>
+              <w:br/>
+              <w:t>5. Refleksi &amp; Penutup (Menit 55:00 - 60:00): Menyimpulkan komitmen karakter nyata di rumah dan apresiasi gelar ksatria/duta budaya.</w:t>
             </w:r>
           </w:p>
         </w:tc>
@@ -69,11 +123,13 @@
         <w:rPr>
           <w:rFonts w:ascii="Arial Black" w:hAnsi="Arial Black"/>
           <w:color w:val="BE123C"/>
-          <w:sz w:val="23"/>
+          <w:sz w:val="24"/>
         </w:rPr>
         <w:t>━━━━━━━━━━━━━━━━━━━━━━━━━━━━━━━━━━━━━━━━━━━━━━━━━</w:t>
         <w:br/>
-        <w:t>SESI 1: AQLAN (KELAS 4 SD • 60 MENIT) — GOTONG ROYONG DI LINGKUNGANKU</w:t>
+        <w:t>PART I: SESI 1 — AQLAN (KELAS 4 SD • DURASI: 60 MENIT)</w:t>
+        <w:br/>
+        <w:t>Topik: Kerja Sama di Lingkunganku &amp; Sila ke-3 Pancasila (Bab 3)</w:t>
         <w:br/>
         <w:t>━━━━━━━━━━━━━━━━━━━━━━━━━━━━━━━━━━━━━━━━━━━━━━━━━</w:t>
       </w:r>
@@ -108,7 +164,7 @@
                 <w:color w:val="BE123C"/>
                 <w:sz w:val="22"/>
               </w:rPr>
-              <w:t>🎯 IMAGINATION HOOK PILIHAN A (TERKUNCI): MELUNCUR DI ATAS SKATEBOARD &amp; BADAI BERINGIN</w:t>
+              <w:t>🎯 [00:00 - 08:00] PEMBUKAAN &amp; GUIDED IMAGINATION (PILIHAN A TERKUNCI: SKATER &amp; BADAI BERINGIN)</w:t>
               <w:br/>
             </w:r>
             <w:r>
@@ -117,7 +173,7 @@
                 <w:color w:val="1E293B"/>
                 <w:sz w:val="20"/>
               </w:rPr>
-              <w:t>"Aqlan, coba duduk rileks... pejamkan kedua matamu perlahan. Tarik napas dalam-dalam lewat hidung... hembuskan. Bayangkan Aqlan sedang berdiri di atas skateboard favoritmu. Pagi itu udara sangat sejuk sehabis hujan lebat semalam. Aqlan dorong kaki ke aspal... SWOOSH! Roda skate meluncur kencang 'krrrk-krrrk' di jalan komplek. Angin sejuk menerpa wajah Aqlan. Tapi tiba-tiba saat mau belok ke gerbang... BRAAAK! Dahan pohon beringin tua sebesar pelukan orang dewasa tumbang melintang menutupi seluruh jalan dan menyumbat selokan! Aqlan mengerem mendadak! Di sana, Pak RT berdiri kebingungan memegang gergaji kecil sendirian sambil menghela napas panjang... Sekarang, buka kedua matamu perlahan Aqlan!"</w:t>
+              <w:t>Fokus Stimulasi Sensorik: Kinestetik meluncur di aspal basah, embusan angin pagi sejuk, suara 'krrrk-krrrk' roda skate, dan hentakan dramatis pohon beringin tua tumbang menghalangi jalan.</w:t>
             </w:r>
           </w:p>
         </w:tc>
@@ -136,7 +192,7 @@
           <w:color w:val="64748B"/>
           <w:sz w:val="18"/>
         </w:rPr>
-        <w:t>[Tersenyum hangat, menyapa ceria di layar Zoom]</w:t>
+        <w:t>[Tersenyum ceria di depan kamera Zoom, melambaikan tangan dengan hangat]</w:t>
         <w:br/>
       </w:r>
       <w:r>
@@ -154,7 +210,7 @@
           <w:color w:val="0F172A"/>
           <w:sz w:val="20"/>
         </w:rPr>
-        <w:t>"Halo Aqlan! Assalamu'alaikum! Senang banget bisa ketemu Aqlan lagi hari ini di Zoom! Gimana kabarnya hari ini? Sehat?"</w:t>
+        <w:t>"Halo Aqlan! Assalamu'alaikum! Senang banget Bu Tiara bisa ketemu Aqlan lagi hari ini di Zoom! Gimana kabarnya hari ini? Sehat dan semangat kan?"</w:t>
       </w:r>
     </w:p>
     <w:p>
@@ -193,7 +249,7 @@
           <w:color w:val="64748B"/>
           <w:sz w:val="18"/>
         </w:rPr>
-        <w:t>[Menatap antusias]</w:t>
+        <w:t>[Mengatur intonasi suara menjadi tenang, lembut, dan ritmis]</w:t>
         <w:br/>
       </w:r>
       <w:r>
@@ -211,7 +267,73 @@
           <w:color w:val="0F172A"/>
           <w:sz w:val="20"/>
         </w:rPr>
-        <w:t>"Aqlan, dahan pohon beringin seberat 100 kg tadi menutup jalan skate Aqlan dan menyumbat selokan. Pak RT bilang, 'Aqlan, kalau Bapak potong sendirian butuh 5 hari (120 jam)! Nanti malam badai hujan lebat turun lagi dan rumah warga bisa kebanjiran!' Kalau Aqlan di situ, apa yang Aqlan lakukan? Pulang tidur, atau turun dari papan skate membantu Pak RT?"</w:t>
+        <w:t>"Aqlan, sebelum kita buka slide Canva atau buku catatan, Bu Tiara mau ajak Aqlan melakukan sebuah perjalanan imajinasi rahasia. Mau ikutan? Coba sekarang Aqlan duduk tegak tapi rileks di kursimu... ya, posisikan badan yang nyaman. Sekarang, pejamkan kedua matamu perlahan-lahan. Tarik napas dalam-dalam lewat hidung... tahan satu detik... hembuskan perlahan lewat mulut..."</w:t>
+      </w:r>
+    </w:p>
+    <w:p>
+      <w:pPr>
+        <w:spacing w:before="60" w:after="60"/>
+        <w:ind w:left="0"/>
+      </w:pPr>
+      <w:r>
+        <w:rPr>
+          <w:rFonts w:ascii="Calibri" w:hAnsi="Calibri"/>
+          <w:i/>
+          <w:color w:val="64748B"/>
+          <w:sz w:val="18"/>
+        </w:rPr>
+        <w:t>[Membacakan narasi sensorik dengan tempo santai dan penuh penghayatan]</w:t>
+        <w:br/>
+      </w:r>
+      <w:r>
+        <w:rPr>
+          <w:rFonts w:ascii="Arial" w:hAnsi="Arial"/>
+          <w:b/>
+          <w:color w:val="BE123C"/>
+          <w:sz w:val="20"/>
+        </w:rPr>
+        <w:t xml:space="preserve">Guru Tiara: </w:t>
+      </w:r>
+      <w:r>
+        <w:rPr>
+          <w:rFonts w:ascii="Calibri" w:hAnsi="Calibri"/>
+          <w:color w:val="0F172A"/>
+          <w:sz w:val="20"/>
+        </w:rPr>
+        <w:t>"Bayangkan Aqlan sedang berdiri di atas papan skateboard kesayanganmu. Pagi itu matahari baru saja terbit, udaranya sangat sejuk dan segar sehabis hujan lebat semalam. Aqlan mulai mendorong kaki kanan ke aspal... SWOOSH! Papan skate Aqlan meluncur kencang dan mulus. Aqlan bisa mendengar suara 'krrrk-krrrk' roda berputar melibas jalanan komplek. Angin pagi yang dingin menerpa wajah Aqlan. Tapi tiba-tiba... saat Aqlan mau berbelok menuju gerbang utama komplek... BRAAAK! Sebuah dahan pohon beringin tua yang sangat raksasa tumbang melintang menutupi seluruh badan jalan! Ranting-rantingnya menyumbat selokan dan air mulai meluap. Aqlan mengerem mendadak! Di depan dahan itu, ada Pak RT yang sedang berdiri kebingungan sendirian sambil memegang gergaji kecil... Pak RT menghela napas panjang dan berkeringat dingin... Sekarang, buka kedua matamu perlahan-lahan, Aqlan!"</w:t>
+      </w:r>
+    </w:p>
+    <w:p>
+      <w:pPr>
+        <w:spacing w:before="60" w:after="60"/>
+        <w:ind w:left="0"/>
+      </w:pPr>
+      <w:r>
+        <w:rPr>
+          <w:rFonts w:ascii="Calibri" w:hAnsi="Calibri"/>
+          <w:i/>
+          <w:color w:val="64748B"/>
+          <w:sz w:val="18"/>
+        </w:rPr>
+        <w:t>[Menatap antusias saat Aqlan membuka mata]</w:t>
+        <w:br/>
+      </w:r>
+      <w:r>
+        <w:rPr>
+          <w:rFonts w:ascii="Arial" w:hAnsi="Arial"/>
+          <w:b/>
+          <w:color w:val="BE123C"/>
+          <w:sz w:val="20"/>
+        </w:rPr>
+        <w:t xml:space="preserve">Guru Tiara: </w:t>
+      </w:r>
+      <w:r>
+        <w:rPr>
+          <w:rFonts w:ascii="Calibri" w:hAnsi="Calibri"/>
+          <w:color w:val="0F172A"/>
+          <w:sz w:val="20"/>
+        </w:rPr>
+        <w:t>"Aqlan, dahan pohon beringin seberat 100 kg tadi menutup jalan latihan skate Aqlan dan menyumbat selokan. Pak RT bilang, 'Aqlan, kalau Bapak potong dan bersihkan sendirian pakai gergaji kecil ini, butuh waktu 5 hari (120 jam)! Nanti malam badai hujan lebat diprediksi BMKG turun lagi, dan rumah warga pasti kebanjiran!' Nah, kalau Aqlan di posisi itu, apa yang akan Aqlan lakukan? Apakah Aqlan putar balik pulang untuk tidur, atau turun dari papan skateboard untuk membantu Pak RT?"</w:t>
       </w:r>
     </w:p>
     <w:p>
@@ -235,7 +357,7 @@
           <w:color w:val="334155"/>
           <w:sz w:val="20"/>
         </w:rPr>
-        <w:t>"Aku turun dari skateboard bu! Aku bantuin Pak RT panggil tetangga-tetangga lain biar kerja bakti!"</w:t>
+        <w:t>"Aku turun dari skateboard bu! Aku bantuin Pak RT panggil tetangga-tetangga lain biar kerja bakti bareng!"</w:t>
       </w:r>
     </w:p>
     <w:p>
@@ -250,7 +372,7 @@
           <w:color w:val="64748B"/>
           <w:sz w:val="18"/>
         </w:rPr>
-        <w:t>[Tersenyum bangga, membuka Slide Canva 1 &amp; 2]</w:t>
+        <w:t>[Tepuk tangan bangga, membagikan layar Canva Slide 1 dan 2]</w:t>
         <w:br/>
       </w:r>
       <w:r>
@@ -268,9 +390,55 @@
           <w:color w:val="0F172A"/>
           <w:sz w:val="20"/>
         </w:rPr>
-        <w:t>"HEBAT BANGET! Jawaban seorang ksatria sejati! Tindakan memanggil warga dan membersihkan dahan bersama-sama sukarela itu namanya GOTONG ROYONG sesuai pengamalan Sila ke-3 Pancasila!"</w:t>
+        <w:t>"HEBAT BANGET! Jawaban seorang ksatria sejati! Tindakan memanggil warga dan membersihkan dahan bersama-sama secara sukarela itu punya nama sakti warisan bangsa kita, yaitu: GOTONG ROYONG sesuai pengamalan Sila ke-3 Pancasila! Hari ini, Aqlan akan membuktikan kekuatan gotong royong itu!"</w:t>
       </w:r>
     </w:p>
+    <w:tbl>
+      <w:tblPr>
+        <w:tblW w:type="auto" w:w="0"/>
+        <w:jc w:val="center"/>
+        <w:tblLayout w:type="fixed"/>
+        <w:tblLook w:firstColumn="1" w:firstRow="1" w:lastColumn="0" w:lastRow="0" w:noHBand="0" w:noVBand="1" w:val="04A0"/>
+      </w:tblPr>
+      <w:tblGrid>
+        <w:gridCol w:w="9792"/>
+      </w:tblGrid>
+      <w:tr>
+        <w:tc>
+          <w:tcPr>
+            <w:tcW w:type="dxa" w:w="10080"/>
+            <w:shd w:fill="FFF1F2"/>
+            <w:tcMar>
+              <w:top w:w="140" w:type="dxa"/>
+              <w:bottom w:w="140" w:type="dxa"/>
+              <w:left w:w="200" w:type="dxa"/>
+              <w:right w:w="200" w:type="dxa"/>
+            </w:tcMar>
+          </w:tcPr>
+          <w:p>
+            <w:r>
+              <w:rPr>
+                <w:rFonts w:ascii="Arial" w:hAnsi="Arial"/>
+                <w:b/>
+                <w:color w:val="BE123C"/>
+                <w:sz w:val="22"/>
+              </w:rPr>
+              <w:t>📖 [08:00 - 20:00] STORYTELLING CANVA SLIDE 1-6 (BUKU TEKS &amp; KESEHARIAN KOMPLEK AQLAN)</w:t>
+              <w:br/>
+            </w:r>
+            <w:r>
+              <w:rPr>
+                <w:rFonts w:ascii="Calibri" w:hAnsi="Calibri"/>
+                <w:color w:val="1E293B"/>
+                <w:sz w:val="20"/>
+              </w:rPr>
+              <w:t>Materi Inti Buku Siswa Kemendikbud: 1.340 suku bangsa, definisi gotong royong Sila ke-3, tradisi Gugur Gunung (Jawa) dan Mapalus (Minahasa), serta pemangkasan waktu dari 5 hari jadi 45 menit.</w:t>
+            </w:r>
+          </w:p>
+        </w:tc>
+      </w:tr>
+    </w:tbl>
+    <w:p/>
     <w:p>
       <w:pPr>
         <w:spacing w:before="60" w:after="60"/>
@@ -283,7 +451,7 @@
           <w:color w:val="64748B"/>
           <w:sz w:val="18"/>
         </w:rPr>
-        <w:t>[Membahas konsep buku teks]</w:t>
+        <w:t>[Menunjukkan peta kebinekaan di Slide 2]</w:t>
         <w:br/>
       </w:r>
       <w:r>
@@ -301,40 +469,7 @@
           <w:color w:val="0F172A"/>
           <w:sz w:val="20"/>
         </w:rPr>
-        <w:t>"Di Buku Siswa Kemendikbud halaman 63 dicatat bahwa Indonesia punya 1.340 suku bangsa. Di komplek Aqlan ada tetangga dari Jawa, Sunda, Batak, Minang. Gotong royong adalah bekerja sama sukarela tanpa pamrih. Di Jawa namanya Gugur Gunung, di Minahasa namanya Mapalus. Kalau Pak RT butuh 5 hari sendirian, kalau warga membagi tugas 3 regu, cuma butuh 45 menit saja!"</w:t>
-      </w:r>
-    </w:p>
-    <w:p>
-      <w:pPr>
-        <w:spacing w:before="60" w:after="60"/>
-        <w:ind w:left="0"/>
-      </w:pPr>
-      <w:r>
-        <w:rPr>
-          <w:rFonts w:ascii="Calibri" w:hAnsi="Calibri"/>
-          <w:i/>
-          <w:color w:val="64748B"/>
-          <w:sz w:val="18"/>
-        </w:rPr>
-        <w:t>[Membimbing ke game web]</w:t>
-        <w:br/>
-      </w:r>
-      <w:r>
-        <w:rPr>
-          <w:rFonts w:ascii="Arial" w:hAnsi="Arial"/>
-          <w:b/>
-          <w:color w:val="BE123C"/>
-          <w:sz w:val="20"/>
-        </w:rPr>
-        <w:t xml:space="preserve">Guru Tiara: </w:t>
-      </w:r>
-      <w:r>
-        <w:rPr>
-          <w:rFonts w:ascii="Calibri" w:hAnsi="Calibri"/>
-          <w:color w:val="0F172A"/>
-          <w:sz w:val="20"/>
-        </w:rPr>
-        <w:t>"Sekarang buka game Pancasila kita di: https://tiara-dwi.github.io/pkbm-games/pancasila/. Pastikan nama Aqlan sudah terpilih. Ada 4 Misi beruntun menuju target 400 Poin Ksatria!"</w:t>
+        <w:t>"Coba Aqlan lihat Slide 2 Canva ini. Di Buku Siswa Kemendikbud halaman 63 dicatat: Indonesia kita ini luar biasa kaya, punya lebih dari 1.340 suku bangsa dan 718 bahasa daerah! Di komplek tempat tinggal Aqlan sendiri, tetangga Aqlan ada yang dari suku apa saja?"</w:t>
       </w:r>
     </w:p>
     <w:p>
@@ -358,7 +493,40 @@
           <w:color w:val="334155"/>
           <w:sz w:val="20"/>
         </w:rPr>
-        <w:t>"Misi 1 selesai dapet 100 poin bu! Misi 2 sapu lidi dapet 100 poin lagi! Misi 3 tradisi nusantara dapet 100 poin! Sekarang Misi 4 Mini Test bu!"</w:t>
+        <w:t>"Ada yang dari Sunda, Jawa, Batak, sama ada yang dari Padang bu."</w:t>
+      </w:r>
+    </w:p>
+    <w:p>
+      <w:pPr>
+        <w:spacing w:before="60" w:after="60"/>
+        <w:ind w:left="0"/>
+      </w:pPr>
+      <w:r>
+        <w:rPr>
+          <w:rFonts w:ascii="Calibri" w:hAnsi="Calibri"/>
+          <w:i/>
+          <w:color w:val="64748B"/>
+          <w:sz w:val="18"/>
+        </w:rPr>
+        <w:t>[Pindah ke Slide 3]</w:t>
+        <w:br/>
+      </w:r>
+      <w:r>
+        <w:rPr>
+          <w:rFonts w:ascii="Arial" w:hAnsi="Arial"/>
+          <w:b/>
+          <w:color w:val="BE123C"/>
+          <w:sz w:val="20"/>
+        </w:rPr>
+        <w:t xml:space="preserve">Guru Tiara: </w:t>
+      </w:r>
+      <w:r>
+        <w:rPr>
+          <w:rFonts w:ascii="Calibri" w:hAnsi="Calibri"/>
+          <w:color w:val="0F172A"/>
+          <w:sz w:val="20"/>
+        </w:rPr>
+        <w:t>"Nah, bayangkan kalau Aqlan lagi main skate di lapangan komplek, lalu ada teman baru pindahan dari Maluku namanya Samuel yang logat bicaranya beda dan masih pemalu. Apa yang sebaiknya Aqlan lakukan?"</w:t>
       </w:r>
     </w:p>
     <w:p>
@@ -382,7 +550,7 @@
           <w:color w:val="334155"/>
           <w:sz w:val="20"/>
         </w:rPr>
-        <w:t>"Horeee bu! Skor aku 400 sempurna! Keluar piala emas sama sertifikat Ksatria Gotong Royong SD Kelas 4!"</w:t>
+        <w:t>"Aku sapa bu, terus aku ajak main skate bareng!"</w:t>
       </w:r>
     </w:p>
     <w:p>
@@ -397,7 +565,7 @@
           <w:color w:val="64748B"/>
           <w:sz w:val="18"/>
         </w:rPr>
-        <w:t>[Mendiktekan 5 poin ringkas resmi]</w:t>
+        <w:t>[Menjelaskan poin buku teks di Slide 4, 5, dan 6]</w:t>
         <w:br/>
       </w:r>
       <w:r>
@@ -415,7 +583,31 @@
           <w:color w:val="0F172A"/>
           <w:sz w:val="20"/>
         </w:rPr>
-        <w:t>"Alhamdulillah! Ksatria hebat tangannya juga rapi menulis. Ambil buku tulis PPKn dan pulpen Aqlan, kita catat 5 poin penting ksatria hari ini ya!"</w:t>
+        <w:t>"Pintar! Menghargai keragaman suku dimulai dari sapaan hangat di arena bermain! Sekarang kita lihat Slide 4 dan 5. Di halaman 71 buku teks, gotong royong didefinisikan sebagai bekerja bersama-sama secara sukarela tanpa pamrih atau upah demi mencapai tujuan kepentingan umum. Tradisi gotong royong ini punya nama-nama unik di nusantara: di Jawa namanya 'Gugur Gunung', di Minahasa Sulawesi Utara namanya 'Mapalus', dan di Palembang namanya 'Sikaroban'. Sekarang kita lihat Slide 6: Empat Keajaiban Manfaat Gotong Royong. Jika pekerjaan pohon beringin tadi dikerjakan gotong royong membagi tugas 3 regu: regu potong kayu, regu bersihkan selokan, dan regu konsumsi, berapa waktu yang dibutuhkan Aqlan?"</w:t>
+      </w:r>
+    </w:p>
+    <w:p>
+      <w:pPr>
+        <w:spacing w:before="60" w:after="60"/>
+        <w:ind w:left="288"/>
+      </w:pPr>
+      <w:r>
+        <w:rPr>
+          <w:rFonts w:ascii="Arial" w:hAnsi="Arial"/>
+          <w:b/>
+          <w:color w:val="0284C7"/>
+          <w:sz w:val="20"/>
+        </w:rPr>
+        <w:t xml:space="preserve">Aqlan: </w:t>
+      </w:r>
+      <w:r>
+        <w:rPr>
+          <w:rFonts w:ascii="Calibri" w:hAnsi="Calibri"/>
+          <w:i/>
+          <w:color w:val="334155"/>
+          <w:sz w:val="20"/>
+        </w:rPr>
+        <w:t>"Cuma sebentar bu, mungkin 45 menit sudah selesai!"</w:t>
       </w:r>
     </w:p>
     <w:p>
@@ -430,7 +622,7 @@
           <w:color w:val="64748B"/>
           <w:sz w:val="18"/>
         </w:rPr>
-        <w:t>[Refleksi akhir]</w:t>
+        <w:t>[Tersenyum bangga]</w:t>
         <w:br/>
       </w:r>
       <w:r>
@@ -448,7 +640,813 @@
           <w:color w:val="0F172A"/>
           <w:sz w:val="20"/>
         </w:rPr>
-        <w:t>"Apa 1 tindakan gotong royong nyata yang mau Aqlan lakukan di rumah hari ini bareng Ayah atau Bunda?"</w:t>
+        <w:t>"Tepat! Dari 5 hari (120 jam) dipangkas tuntas menjadi hanya 45 menit! Beban 100 kilo terasa enteng saat diangkat bersama-sama!"</w:t>
+      </w:r>
+    </w:p>
+    <w:tbl>
+      <w:tblPr>
+        <w:tblW w:type="auto" w:w="0"/>
+        <w:jc w:val="center"/>
+        <w:tblLayout w:type="fixed"/>
+        <w:tblLook w:firstColumn="1" w:firstRow="1" w:lastColumn="0" w:lastRow="0" w:noHBand="0" w:noVBand="1" w:val="04A0"/>
+      </w:tblPr>
+      <w:tblGrid>
+        <w:gridCol w:w="9792"/>
+      </w:tblGrid>
+      <w:tr>
+        <w:tc>
+          <w:tcPr>
+            <w:tcW w:type="dxa" w:w="10080"/>
+            <w:shd w:fill="FFF1F2"/>
+            <w:tcMar>
+              <w:top w:w="140" w:type="dxa"/>
+              <w:bottom w:w="140" w:type="dxa"/>
+              <w:left w:w="200" w:type="dxa"/>
+              <w:right w:w="200" w:type="dxa"/>
+            </w:tcMar>
+          </w:tcPr>
+          <w:p>
+            <w:r>
+              <w:rPr>
+                <w:rFonts w:ascii="Arial" w:hAnsi="Arial"/>
+                <w:b/>
+                <w:color w:val="BE123C"/>
+                <w:sz w:val="22"/>
+              </w:rPr>
+              <w:t>🎨 [20:00 - 30:00] CANVA SLIDE 7-9 (VISUAL BARU SAPU LIDI &amp; SUMPAH PEMUDA 1928)</w:t>
+              <w:br/>
+            </w:r>
+            <w:r>
+              <w:rPr>
+                <w:rFonts w:ascii="Calibri" w:hAnsi="Calibri"/>
+                <w:color w:val="1E293B"/>
+                <w:sz w:val="20"/>
+              </w:rPr>
+              <w:t>Fokus Pembelajaran: Eksperimen 1 lidi patah vs seikat sapu lidi, serta Bahasa Indonesia sebagai bahasa persatuan Sumpah Pemuda 28 Oktober 1928.</w:t>
+            </w:r>
+          </w:p>
+        </w:tc>
+      </w:tr>
+    </w:tbl>
+    <w:p/>
+    <w:p>
+      <w:pPr>
+        <w:spacing w:before="120" w:after="60"/>
+        <w:jc w:val="center"/>
+      </w:pPr>
+      <w:r>
+        <w:drawing>
+          <wp:inline xmlns:a="http://schemas.openxmlformats.org/drawingml/2006/main" xmlns:pic="http://schemas.openxmlformats.org/drawingml/2006/picture">
+            <wp:extent cx="5029200" cy="2806995"/>
+            <wp:docPr id="1" name="Picture 1"/>
+            <wp:cNvGraphicFramePr>
+              <a:graphicFrameLocks noChangeAspect="1"/>
+            </wp:cNvGraphicFramePr>
+            <a:graphic>
+              <a:graphicData uri="http://schemas.openxmlformats.org/drawingml/2006/picture">
+                <pic:pic>
+                  <pic:nvPicPr>
+                    <pic:cNvPr id="0" name="filosofi_sapu_lidi_slide.jpg"/>
+                    <pic:cNvPicPr/>
+                  </pic:nvPicPr>
+                  <pic:blipFill>
+                    <a:blip r:embed="rId9"/>
+                    <a:stretch>
+                      <a:fillRect/>
+                    </a:stretch>
+                  </pic:blipFill>
+                  <pic:spPr>
+                    <a:xfrm>
+                      <a:off x="0" y="0"/>
+                      <a:ext cx="5029200" cy="2806995"/>
+                    </a:xfrm>
+                    <a:prstGeom prst="rect"/>
+                  </pic:spPr>
+                </pic:pic>
+              </a:graphicData>
+            </a:graphic>
+          </wp:inline>
+        </w:drawing>
+      </w:r>
+    </w:p>
+    <w:p>
+      <w:pPr>
+        <w:spacing w:after="160"/>
+        <w:jc w:val="center"/>
+      </w:pPr>
+      <w:r>
+        <w:rPr>
+          <w:rFonts w:ascii="Calibri" w:hAnsi="Calibri"/>
+          <w:i/>
+          <w:color w:val="64748B"/>
+          <w:sz w:val="18"/>
+        </w:rPr>
+        <w:t>Gambar Slide 7 Canva: Filosofi Seikat Sapu Lidi (Sendirian Rapuh ❌ vs Bersatu Kuat ✅)</w:t>
+      </w:r>
+    </w:p>
+    <w:p>
+      <w:pPr>
+        <w:spacing w:before="60" w:after="60"/>
+        <w:ind w:left="0"/>
+      </w:pPr>
+      <w:r>
+        <w:rPr>
+          <w:rFonts w:ascii="Calibri" w:hAnsi="Calibri"/>
+          <w:i/>
+          <w:color w:val="64748B"/>
+          <w:sz w:val="18"/>
+        </w:rPr>
+        <w:t>[Menampilkan gambar Slide 7 di layar]</w:t>
+        <w:br/>
+      </w:r>
+      <w:r>
+        <w:rPr>
+          <w:rFonts w:ascii="Arial" w:hAnsi="Arial"/>
+          <w:b/>
+          <w:color w:val="BE123C"/>
+          <w:sz w:val="20"/>
+        </w:rPr>
+        <w:t xml:space="preserve">Guru Tiara: </w:t>
+      </w:r>
+      <w:r>
+        <w:rPr>
+          <w:rFonts w:ascii="Calibri" w:hAnsi="Calibri"/>
+          <w:color w:val="0F172A"/>
+          <w:sz w:val="20"/>
+        </w:rPr>
+        <w:t>"Aqlan, coba lihat gambar di Slide 7 ini! Keren banget kan gambarnya? Di sebelah kiri ada sebatang lidi kelapa tipis yang patah terbelah dua saat menusuk tanah, ada tulisan KREK! dan 'Sendirian: Rapuh ❌'. Tapi coba lihat di sebelah kanan: ada seikat sapu lidi tebal yang diikat pita merah putih, sedang menyapu batu, kerikil, dan lumpur bersih seketika dengan kilauan emas SWOOSH! dan tanda 'Bersatu: Kuat ✅'. Aqlan tahu kenapa satu lidi gampang patah, tapi kalau diikat jadi sapu lidi bisa menyingkirkan batu besar?"</w:t>
+      </w:r>
+    </w:p>
+    <w:p>
+      <w:pPr>
+        <w:spacing w:before="60" w:after="60"/>
+        <w:ind w:left="288"/>
+      </w:pPr>
+      <w:r>
+        <w:rPr>
+          <w:rFonts w:ascii="Arial" w:hAnsi="Arial"/>
+          <w:b/>
+          <w:color w:val="0284C7"/>
+          <w:sz w:val="20"/>
+        </w:rPr>
+        <w:t xml:space="preserve">Aqlan: </w:t>
+      </w:r>
+      <w:r>
+        <w:rPr>
+          <w:rFonts w:ascii="Calibri" w:hAnsi="Calibri"/>
+          <w:i/>
+          <w:color w:val="334155"/>
+          <w:sz w:val="20"/>
+        </w:rPr>
+        <w:t>"Karena kalau seikat mereka bersatu bu, jadi tebal dan nggak bisa dipatahin!"</w:t>
+      </w:r>
+    </w:p>
+    <w:p>
+      <w:pPr>
+        <w:spacing w:before="60" w:after="60"/>
+        <w:ind w:left="0"/>
+      </w:pPr>
+      <w:r>
+        <w:rPr>
+          <w:rFonts w:ascii="Calibri" w:hAnsi="Calibri"/>
+          <w:i/>
+          <w:color w:val="64748B"/>
+          <w:sz w:val="18"/>
+        </w:rPr>
+        <w:t>[Menghubungkan ke Slide 8 Sumpah Pemuda]</w:t>
+        <w:br/>
+      </w:r>
+      <w:r>
+        <w:rPr>
+          <w:rFonts w:ascii="Arial" w:hAnsi="Arial"/>
+          <w:b/>
+          <w:color w:val="BE123C"/>
+          <w:sz w:val="20"/>
+        </w:rPr>
+        <w:t xml:space="preserve">Guru Tiara: </w:t>
+      </w:r>
+      <w:r>
+        <w:rPr>
+          <w:rFonts w:ascii="Calibri" w:hAnsi="Calibri"/>
+          <w:color w:val="0F172A"/>
+          <w:sz w:val="20"/>
+        </w:rPr>
+        <w:t>"100 buat Aqlan! Itulah rahasia karakter kita: sendirian kita rapuh, tapi kalau kita bersatu mengikat perbedaan, masalah seberat apa pun bisa kita selesaikan! Dan di Slide 8, waktu warga komplek Aqlan yang berbeda suku tadi gotong royong, bahasa apa yang membuat instruksi Pak RT dimengerti oleh warga Jawa, Batak, Sunda, dan Maluku?"</w:t>
+      </w:r>
+    </w:p>
+    <w:p>
+      <w:pPr>
+        <w:spacing w:before="60" w:after="60"/>
+        <w:ind w:left="288"/>
+      </w:pPr>
+      <w:r>
+        <w:rPr>
+          <w:rFonts w:ascii="Arial" w:hAnsi="Arial"/>
+          <w:b/>
+          <w:color w:val="0284C7"/>
+          <w:sz w:val="20"/>
+        </w:rPr>
+        <w:t xml:space="preserve">Aqlan: </w:t>
+      </w:r>
+      <w:r>
+        <w:rPr>
+          <w:rFonts w:ascii="Calibri" w:hAnsi="Calibri"/>
+          <w:i/>
+          <w:color w:val="334155"/>
+          <w:sz w:val="20"/>
+        </w:rPr>
+        <w:t>"Bahasa Indonesia bu!"</w:t>
+      </w:r>
+    </w:p>
+    <w:p>
+      <w:pPr>
+        <w:spacing w:before="60" w:after="60"/>
+        <w:ind w:left="0"/>
+      </w:pPr>
+      <w:r>
+        <w:rPr>
+          <w:rFonts w:ascii="Calibri" w:hAnsi="Calibri"/>
+          <w:i/>
+          <w:color w:val="64748B"/>
+          <w:sz w:val="18"/>
+        </w:rPr>
+        <w:t>[Tersenyum mantap]</w:t>
+        <w:br/>
+      </w:r>
+      <w:r>
+        <w:rPr>
+          <w:rFonts w:ascii="Arial" w:hAnsi="Arial"/>
+          <w:b/>
+          <w:color w:val="BE123C"/>
+          <w:sz w:val="20"/>
+        </w:rPr>
+        <w:t xml:space="preserve">Guru Tiara: </w:t>
+      </w:r>
+      <w:r>
+        <w:rPr>
+          <w:rFonts w:ascii="Calibri" w:hAnsi="Calibri"/>
+          <w:color w:val="0F172A"/>
+          <w:sz w:val="20"/>
+        </w:rPr>
+        <w:t>"Tepat! Sesuai ikrar bersejarah Sumpah Pemuda 28 Oktober 1928: Bahasa Indonesia adalah bahasa persatuan yang menjembatani kebinekaan!"</w:t>
+      </w:r>
+    </w:p>
+    <w:tbl>
+      <w:tblPr>
+        <w:tblW w:type="auto" w:w="0"/>
+        <w:jc w:val="center"/>
+        <w:tblLayout w:type="fixed"/>
+        <w:tblLook w:firstColumn="1" w:firstRow="1" w:lastColumn="0" w:lastRow="0" w:noHBand="0" w:noVBand="1" w:val="04A0"/>
+      </w:tblPr>
+      <w:tblGrid>
+        <w:gridCol w:w="9792"/>
+      </w:tblGrid>
+      <w:tr>
+        <w:tc>
+          <w:tcPr>
+            <w:tcW w:type="dxa" w:w="10080"/>
+            <w:shd w:fill="FFF1F2"/>
+            <w:tcMar>
+              <w:top w:w="140" w:type="dxa"/>
+              <w:bottom w:w="140" w:type="dxa"/>
+              <w:left w:w="200" w:type="dxa"/>
+              <w:right w:w="200" w:type="dxa"/>
+            </w:tcMar>
+          </w:tcPr>
+          <w:p>
+            <w:r>
+              <w:rPr>
+                <w:rFonts w:ascii="Arial" w:hAnsi="Arial"/>
+                <w:b/>
+                <w:color w:val="BE123C"/>
+                <w:sz w:val="22"/>
+              </w:rPr>
+              <w:t>🎮 [30:00 - 45:00] PRAKTIK LANGSUNG 4 MISI GAME WEB INTERAKTIF (TARGET: 400 POIN)</w:t>
+              <w:br/>
+            </w:r>
+            <w:r>
+              <w:rPr>
+                <w:rFonts w:ascii="Calibri" w:hAnsi="Calibri"/>
+                <w:color w:val="1E293B"/>
+                <w:sz w:val="20"/>
+              </w:rPr>
+              <w:t>Akses Game: https://tiara-dwi.github.io/pkbm-games/pancasila/ (Pilih Siswa: Aqlan • Kelas 4)</w:t>
+              <w:br/>
+              <w:t>Target Misi: Misi 1 (100 Poin), Misi 2 (100 Poin), Misi 3 (100 Poin), Misi 4 Mini Test C3-C4 (100 Poin).</w:t>
+            </w:r>
+          </w:p>
+        </w:tc>
+      </w:tr>
+    </w:tbl>
+    <w:p/>
+    <w:p>
+      <w:pPr>
+        <w:spacing w:before="60" w:after="60"/>
+        <w:ind w:left="0"/>
+      </w:pPr>
+      <w:r>
+        <w:rPr>
+          <w:rFonts w:ascii="Calibri" w:hAnsi="Calibri"/>
+          <w:i/>
+          <w:color w:val="64748B"/>
+          <w:sz w:val="18"/>
+        </w:rPr>
+        <w:t>[Mengarahkan Aqlan membuka web game]</w:t>
+        <w:br/>
+      </w:r>
+      <w:r>
+        <w:rPr>
+          <w:rFonts w:ascii="Arial" w:hAnsi="Arial"/>
+          <w:b/>
+          <w:color w:val="BE123C"/>
+          <w:sz w:val="20"/>
+        </w:rPr>
+        <w:t xml:space="preserve">Guru Tiara: </w:t>
+      </w:r>
+      <w:r>
+        <w:rPr>
+          <w:rFonts w:ascii="Calibri" w:hAnsi="Calibri"/>
+          <w:color w:val="0F172A"/>
+          <w:sz w:val="20"/>
+        </w:rPr>
+        <w:t>"Sekarang saatnya membuktikan kemampuan ksatria Aqlan di game web! Buka browser di laptop atau HP Aqlan, ketik link: https://tiara-dwi.github.io/pkbm-games/pancasila/. Sudah terbuka layarnya? Pastikan nama Aqlan sudah terpilih di pojok atas ya! Hari ini ada 4 Misi beruntun menuju target 400 Poin Ksatria!"</w:t>
+      </w:r>
+    </w:p>
+    <w:p>
+      <w:pPr>
+        <w:spacing w:before="60" w:after="60"/>
+        <w:ind w:left="0"/>
+      </w:pPr>
+      <w:r>
+        <w:rPr>
+          <w:rFonts w:ascii="Calibri" w:hAnsi="Calibri"/>
+          <w:i/>
+          <w:color w:val="64748B"/>
+          <w:sz w:val="18"/>
+        </w:rPr>
+        <w:t>[Membimbing Misi 1]</w:t>
+        <w:br/>
+      </w:r>
+      <w:r>
+        <w:rPr>
+          <w:rFonts w:ascii="Arial" w:hAnsi="Arial"/>
+          <w:b/>
+          <w:color w:val="BE123C"/>
+          <w:sz w:val="20"/>
+        </w:rPr>
+        <w:t xml:space="preserve">Guru Tiara: </w:t>
+      </w:r>
+      <w:r>
+        <w:rPr>
+          <w:rFonts w:ascii="Calibri" w:hAnsi="Calibri"/>
+          <w:color w:val="0F172A"/>
+          <w:sz w:val="20"/>
+        </w:rPr>
+        <w:t>"Klik tombol 'Misi 1: Badai Beringin'. Baca skenarionya, lalu pilih kartu pembagian tugas gotong royong 3 regu!"</w:t>
+      </w:r>
+    </w:p>
+    <w:p>
+      <w:pPr>
+        <w:spacing w:before="60" w:after="60"/>
+        <w:ind w:left="288"/>
+      </w:pPr>
+      <w:r>
+        <w:rPr>
+          <w:rFonts w:ascii="Arial" w:hAnsi="Arial"/>
+          <w:b/>
+          <w:color w:val="0284C7"/>
+          <w:sz w:val="20"/>
+        </w:rPr>
+        <w:t xml:space="preserve">Aqlan: </w:t>
+      </w:r>
+      <w:r>
+        <w:rPr>
+          <w:rFonts w:ascii="Calibri" w:hAnsi="Calibri"/>
+          <w:i/>
+          <w:color w:val="334155"/>
+          <w:sz w:val="20"/>
+        </w:rPr>
+        <w:t>"Yey dapat 100 poin pertama bu! Waktunya berubah jadi 45 menit!"</w:t>
+      </w:r>
+    </w:p>
+    <w:p>
+      <w:pPr>
+        <w:spacing w:before="60" w:after="60"/>
+        <w:ind w:left="0"/>
+      </w:pPr>
+      <w:r>
+        <w:rPr>
+          <w:rFonts w:ascii="Calibri" w:hAnsi="Calibri"/>
+          <w:i/>
+          <w:color w:val="64748B"/>
+          <w:sz w:val="18"/>
+        </w:rPr>
+        <w:t>[Membimbing Misi 2]</w:t>
+        <w:br/>
+      </w:r>
+      <w:r>
+        <w:rPr>
+          <w:rFonts w:ascii="Arial" w:hAnsi="Arial"/>
+          <w:b/>
+          <w:color w:val="BE123C"/>
+          <w:sz w:val="20"/>
+        </w:rPr>
+        <w:t xml:space="preserve">Guru Tiara: </w:t>
+      </w:r>
+      <w:r>
+        <w:rPr>
+          <w:rFonts w:ascii="Calibri" w:hAnsi="Calibri"/>
+          <w:color w:val="0F172A"/>
+          <w:sz w:val="20"/>
+        </w:rPr>
+        <w:t>"Hebat! Sekarang klik tab 'Misi 2: Sapu Lidi'. Coba klik tombol uji 1 lidi dulu!"</w:t>
+      </w:r>
+    </w:p>
+    <w:p>
+      <w:pPr>
+        <w:spacing w:before="60" w:after="60"/>
+        <w:ind w:left="288"/>
+      </w:pPr>
+      <w:r>
+        <w:rPr>
+          <w:rFonts w:ascii="Arial" w:hAnsi="Arial"/>
+          <w:b/>
+          <w:color w:val="0284C7"/>
+          <w:sz w:val="20"/>
+        </w:rPr>
+        <w:t xml:space="preserve">Aqlan: </w:t>
+      </w:r>
+      <w:r>
+        <w:rPr>
+          <w:rFonts w:ascii="Calibri" w:hAnsi="Calibri"/>
+          <w:i/>
+          <w:color w:val="334155"/>
+          <w:sz w:val="20"/>
+        </w:rPr>
+        <w:t>"Lidinya patah bu, bunyinya KREK!"</w:t>
+      </w:r>
+    </w:p>
+    <w:p>
+      <w:pPr>
+        <w:spacing w:before="60" w:after="60"/>
+        <w:ind w:left="0"/>
+      </w:pPr>
+      <w:r>
+        <w:rPr>
+          <w:rFonts w:ascii="Calibri" w:hAnsi="Calibri"/>
+          <w:i/>
+          <w:color w:val="64748B"/>
+          <w:sz w:val="18"/>
+        </w:rPr>
+        <w:t>[Menanti respon Aqlan]</w:t>
+        <w:br/>
+      </w:r>
+      <w:r>
+        <w:rPr>
+          <w:rFonts w:ascii="Arial" w:hAnsi="Arial"/>
+          <w:b/>
+          <w:color w:val="BE123C"/>
+          <w:sz w:val="20"/>
+        </w:rPr>
+        <w:t xml:space="preserve">Guru Tiara: </w:t>
+      </w:r>
+      <w:r>
+        <w:rPr>
+          <w:rFonts w:ascii="Calibri" w:hAnsi="Calibri"/>
+          <w:color w:val="0F172A"/>
+          <w:sz w:val="20"/>
+        </w:rPr>
+        <w:t>"Nah, sekarang klik tombol ikat 50 lidi jadi sapu!"</w:t>
+      </w:r>
+    </w:p>
+    <w:p>
+      <w:pPr>
+        <w:spacing w:before="60" w:after="60"/>
+        <w:ind w:left="288"/>
+      </w:pPr>
+      <w:r>
+        <w:rPr>
+          <w:rFonts w:ascii="Arial" w:hAnsi="Arial"/>
+          <w:b/>
+          <w:color w:val="0284C7"/>
+          <w:sz w:val="20"/>
+        </w:rPr>
+        <w:t xml:space="preserve">Aqlan: </w:t>
+      </w:r>
+      <w:r>
+        <w:rPr>
+          <w:rFonts w:ascii="Calibri" w:hAnsi="Calibri"/>
+          <w:i/>
+          <w:color w:val="334155"/>
+          <w:sz w:val="20"/>
+        </w:rPr>
+        <w:t>"Wih bersih seketika kerikilnya bu! Nambah 100 poin, skorku jadi 200!"</w:t>
+      </w:r>
+    </w:p>
+    <w:p>
+      <w:pPr>
+        <w:spacing w:before="60" w:after="60"/>
+        <w:ind w:left="0"/>
+      </w:pPr>
+      <w:r>
+        <w:rPr>
+          <w:rFonts w:ascii="Calibri" w:hAnsi="Calibri"/>
+          <w:i/>
+          <w:color w:val="64748B"/>
+          <w:sz w:val="18"/>
+        </w:rPr>
+        <w:t>[Membimbing Misi 3]</w:t>
+        <w:br/>
+      </w:r>
+      <w:r>
+        <w:rPr>
+          <w:rFonts w:ascii="Arial" w:hAnsi="Arial"/>
+          <w:b/>
+          <w:color w:val="BE123C"/>
+          <w:sz w:val="20"/>
+        </w:rPr>
+        <w:t xml:space="preserve">Guru Tiara: </w:t>
+      </w:r>
+      <w:r>
+        <w:rPr>
+          <w:rFonts w:ascii="Calibri" w:hAnsi="Calibri"/>
+          <w:color w:val="0F172A"/>
+          <w:sz w:val="20"/>
+        </w:rPr>
+        <w:t>"Lanjut klik 'Misi 3: Tradisi Nusantara'. Cocokkan tradisi Mapalus Minahasa dan peran Bahasa Indonesia Sumpah Pemuda!"</w:t>
+      </w:r>
+    </w:p>
+    <w:p>
+      <w:pPr>
+        <w:spacing w:before="60" w:after="60"/>
+        <w:ind w:left="288"/>
+      </w:pPr>
+      <w:r>
+        <w:rPr>
+          <w:rFonts w:ascii="Arial" w:hAnsi="Arial"/>
+          <w:b/>
+          <w:color w:val="0284C7"/>
+          <w:sz w:val="20"/>
+        </w:rPr>
+        <w:t xml:space="preserve">Aqlan: </w:t>
+      </w:r>
+      <w:r>
+        <w:rPr>
+          <w:rFonts w:ascii="Calibri" w:hAnsi="Calibri"/>
+          <w:i/>
+          <w:color w:val="334155"/>
+          <w:sz w:val="20"/>
+        </w:rPr>
+        <w:t>"Beres bu, skorku sekarang 300 poin!"</w:t>
+      </w:r>
+    </w:p>
+    <w:p>
+      <w:pPr>
+        <w:spacing w:before="60" w:after="60"/>
+        <w:ind w:left="0"/>
+      </w:pPr>
+      <w:r>
+        <w:rPr>
+          <w:rFonts w:ascii="Calibri" w:hAnsi="Calibri"/>
+          <w:i/>
+          <w:color w:val="64748B"/>
+          <w:sz w:val="18"/>
+        </w:rPr>
+        <w:t>[Mengawasi pengerjaan mini test]</w:t>
+        <w:br/>
+      </w:r>
+      <w:r>
+        <w:rPr>
+          <w:rFonts w:ascii="Arial" w:hAnsi="Arial"/>
+          <w:b/>
+          <w:color w:val="BE123C"/>
+          <w:sz w:val="20"/>
+        </w:rPr>
+        <w:t xml:space="preserve">Guru Tiara: </w:t>
+      </w:r>
+      <w:r>
+        <w:rPr>
+          <w:rFonts w:ascii="Calibri" w:hAnsi="Calibri"/>
+          <w:color w:val="0F172A"/>
+          <w:sz w:val="20"/>
+        </w:rPr>
+        <w:t>"Sekarang misi puncak: klik 'Misi 4: Mini Test C3-C4'. Ada 4 soal pilihan ganda. Soal 1 tentang pohon beringin, Soal 2 tentang filosofi sapu lidi, Soal 3 tradisi Mapalus, dan Soal 4 tentang Sumpah Pemuda. Baca tenang-tenang ya!"</w:t>
+      </w:r>
+    </w:p>
+    <w:p>
+      <w:pPr>
+        <w:spacing w:before="60" w:after="60"/>
+        <w:ind w:left="288"/>
+      </w:pPr>
+      <w:r>
+        <w:rPr>
+          <w:rFonts w:ascii="Arial" w:hAnsi="Arial"/>
+          <w:b/>
+          <w:color w:val="0284C7"/>
+          <w:sz w:val="20"/>
+        </w:rPr>
+        <w:t xml:space="preserve">Aqlan: </w:t>
+      </w:r>
+      <w:r>
+        <w:rPr>
+          <w:rFonts w:ascii="Calibri" w:hAnsi="Calibri"/>
+          <w:i/>
+          <w:color w:val="334155"/>
+          <w:sz w:val="20"/>
+        </w:rPr>
+        <w:t>"Horeee bu! Betul semua! Skor aku 400 sempurna! Keluar piala emas dan sertifikat Ksatria Gotong Royong SD Kelas 4!"</w:t>
+      </w:r>
+    </w:p>
+    <w:tbl>
+      <w:tblPr>
+        <w:tblW w:type="auto" w:w="0"/>
+        <w:jc w:val="center"/>
+        <w:tblLayout w:type="fixed"/>
+        <w:tblLook w:firstColumn="1" w:firstRow="1" w:lastColumn="0" w:lastRow="0" w:noHBand="0" w:noVBand="1" w:val="04A0"/>
+      </w:tblPr>
+      <w:tblGrid>
+        <w:gridCol w:w="9792"/>
+      </w:tblGrid>
+      <w:tr>
+        <w:tc>
+          <w:tcPr>
+            <w:tcW w:type="dxa" w:w="10080"/>
+            <w:shd w:fill="FFF1F2"/>
+            <w:tcMar>
+              <w:top w:w="140" w:type="dxa"/>
+              <w:bottom w:w="140" w:type="dxa"/>
+              <w:left w:w="200" w:type="dxa"/>
+              <w:right w:w="200" w:type="dxa"/>
+            </w:tcMar>
+          </w:tcPr>
+          <w:p>
+            <w:r>
+              <w:rPr>
+                <w:rFonts w:ascii="Arial" w:hAnsi="Arial"/>
+                <w:b/>
+                <w:color w:val="BE123C"/>
+                <w:sz w:val="22"/>
+              </w:rPr>
+              <w:t>📝 [45:00 - 55:00] BIMBINGAN MENULIS BUKU CATATAN SISWA (BUKU TULIS PPKN AQLAN)</w:t>
+              <w:br/>
+            </w:r>
+            <w:r>
+              <w:rPr>
+                <w:rFonts w:ascii="Calibri" w:hAnsi="Calibri"/>
+                <w:color w:val="1E293B"/>
+                <w:sz w:val="20"/>
+              </w:rPr>
+              <w:t>Instruksi Guru: Diktekan 5 poin penting ringkas ini agar disalin rapi ke buku tulis PPKn Aqlan.</w:t>
+            </w:r>
+          </w:p>
+        </w:tc>
+      </w:tr>
+    </w:tbl>
+    <w:p/>
+    <w:p>
+      <w:pPr>
+        <w:spacing w:before="60" w:after="60"/>
+        <w:ind w:left="0"/>
+      </w:pPr>
+      <w:r>
+        <w:rPr>
+          <w:rFonts w:ascii="Calibri" w:hAnsi="Calibri"/>
+          <w:i/>
+          <w:color w:val="64748B"/>
+          <w:sz w:val="18"/>
+        </w:rPr>
+        <w:t>[Mendiktekan dengan sabar, memastikan kerapian catatan]</w:t>
+        <w:br/>
+      </w:r>
+      <w:r>
+        <w:rPr>
+          <w:rFonts w:ascii="Arial" w:hAnsi="Arial"/>
+          <w:b/>
+          <w:color w:val="BE123C"/>
+          <w:sz w:val="20"/>
+        </w:rPr>
+        <w:t xml:space="preserve">Guru Tiara: </w:t>
+      </w:r>
+      <w:r>
+        <w:rPr>
+          <w:rFonts w:ascii="Calibri" w:hAnsi="Calibri"/>
+          <w:color w:val="0F172A"/>
+          <w:sz w:val="20"/>
+        </w:rPr>
+        <w:t>"Alhamdulillah! Ksatria hebat bukan cuma jago di game, tapi tangannya juga rapi menulis ilmu di buku catatan. Sekarang ambil buku tulis PPKn dan pulpen Aqlan. Bu Tiara diktekan 5 poin ringkas resmi hari ini ya:</w:t>
+        <w:br/>
+        <w:t>1. Gotong royong adalah tradisi bekerja bersama-sama secara sukarela tanpa pamrih demi kepentingan umum (pengamalan Sila ke-3 Pancasila).</w:t>
+        <w:br/>
+        <w:t>2. Empat manfaat gotong royong: pekerjaan berat terasa ringan, cepat selesai (5 hari dipangkas jadi 45 menit), menghemat biaya, dan mempererat kerukunan tetangga.</w:t>
+        <w:br/>
+        <w:t>3. Nama tradisi gotong royong daerah: Gugur Gunung (Jawa) dan Mapalus (Minahasa, Sulawesi Utara).</w:t>
+        <w:br/>
+        <w:t>4. Bahasa Indonesia berfungsi sebagai bahasa persatuan penjembatan kebinekaan sesuai ikrar Sumpah Pemuda 28 Oktober 1928.</w:t>
+        <w:br/>
+        <w:t>5. Filosofi Sapu Lidi: Sendirian rapuh dan mudah patah, bersatu mengikat perbedaan menjadi kekuatan yang tak terkalahkan!"</w:t>
+      </w:r>
+    </w:p>
+    <w:p>
+      <w:pPr>
+        <w:spacing w:before="60" w:after="60"/>
+        <w:ind w:left="288"/>
+      </w:pPr>
+      <w:r>
+        <w:rPr>
+          <w:rFonts w:ascii="Arial" w:hAnsi="Arial"/>
+          <w:b/>
+          <w:color w:val="0284C7"/>
+          <w:sz w:val="20"/>
+        </w:rPr>
+        <w:t xml:space="preserve">Aqlan: </w:t>
+      </w:r>
+      <w:r>
+        <w:rPr>
+          <w:rFonts w:ascii="Calibri" w:hAnsi="Calibri"/>
+          <w:i/>
+          <w:color w:val="334155"/>
+          <w:sz w:val="20"/>
+        </w:rPr>
+        <w:t>"Sudah selesai bu Tiara! Tulisanku rapi banget!"</w:t>
+      </w:r>
+    </w:p>
+    <w:tbl>
+      <w:tblPr>
+        <w:tblW w:type="auto" w:w="0"/>
+        <w:jc w:val="center"/>
+        <w:tblLayout w:type="fixed"/>
+        <w:tblLook w:firstColumn="1" w:firstRow="1" w:lastColumn="0" w:lastRow="0" w:noHBand="0" w:noVBand="1" w:val="04A0"/>
+      </w:tblPr>
+      <w:tblGrid>
+        <w:gridCol w:w="9792"/>
+      </w:tblGrid>
+      <w:tr>
+        <w:tc>
+          <w:tcPr>
+            <w:tcW w:type="dxa" w:w="10080"/>
+            <w:shd w:fill="FFF1F2"/>
+            <w:tcMar>
+              <w:top w:w="140" w:type="dxa"/>
+              <w:bottom w:w="140" w:type="dxa"/>
+              <w:left w:w="200" w:type="dxa"/>
+              <w:right w:w="200" w:type="dxa"/>
+            </w:tcMar>
+          </w:tcPr>
+          <w:p>
+            <w:r>
+              <w:rPr>
+                <w:rFonts w:ascii="Arial" w:hAnsi="Arial"/>
+                <w:b/>
+                <w:color w:val="BE123C"/>
+                <w:sz w:val="22"/>
+              </w:rPr>
+              <w:t>🌟 [55:00 - 60:00] REFLEKSI KARAKTER &amp; PENUTUPAN SESI 1 AQLAN</w:t>
+              <w:br/>
+            </w:r>
+            <w:r>
+              <w:rPr>
+                <w:rFonts w:ascii="Calibri" w:hAnsi="Calibri"/>
+                <w:color w:val="1E293B"/>
+                <w:sz w:val="20"/>
+              </w:rPr>
+              <w:t>Fokus Penutup: Komitmen 1 aksi gotong royong nyata di rumah dan apresiasi pencapaian 400 Poin.</w:t>
+            </w:r>
+          </w:p>
+        </w:tc>
+      </w:tr>
+    </w:tbl>
+    <w:p/>
+    <w:p>
+      <w:pPr>
+        <w:spacing w:before="60" w:after="60"/>
+        <w:ind w:left="0"/>
+      </w:pPr>
+      <w:r>
+        <w:rPr>
+          <w:rFonts w:ascii="Calibri" w:hAnsi="Calibri"/>
+          <w:i/>
+          <w:color w:val="64748B"/>
+          <w:sz w:val="18"/>
+        </w:rPr>
+        <w:t>[Menatap hangat dan tersenyum bangga]</w:t>
+        <w:br/>
+      </w:r>
+      <w:r>
+        <w:rPr>
+          <w:rFonts w:ascii="Arial" w:hAnsi="Arial"/>
+          <w:b/>
+          <w:color w:val="BE123C"/>
+          <w:sz w:val="20"/>
+        </w:rPr>
+        <w:t xml:space="preserve">Guru Tiara: </w:t>
+      </w:r>
+      <w:r>
+        <w:rPr>
+          <w:rFonts w:ascii="Calibri" w:hAnsi="Calibri"/>
+          <w:color w:val="0F172A"/>
+          <w:sz w:val="20"/>
+        </w:rPr>
+        <w:t>"Masya Allah, hebat sekali Aqlan hari ini! Terakhir sebelum kita tutup sesi 60 menit kita: apa 1 tindakan gotong royong nyata yang mau Aqlan lakukan di rumah hari ini bareng Ayah atau Bunda?"</w:t>
       </w:r>
     </w:p>
     <w:p>
@@ -487,7 +1485,7 @@
           <w:color w:val="64748B"/>
           <w:sz w:val="18"/>
         </w:rPr>
-        <w:t>[Menutup Sesi 1]</w:t>
+        <w:t>[Melambaikan tangan ceria, menutup sesi Zoom Aqlan]</w:t>
         <w:br/>
       </w:r>
       <w:r>
@@ -505,7 +1503,7 @@
           <w:color w:val="0F172A"/>
           <w:sz w:val="20"/>
         </w:rPr>
-        <w:t>"Janji ksatria yang luar biasa! Selamat ya Aqlan atas gelar Ksatria Gotong Royong 400 Poin hari ini! Wassalamu'alaikum wr. wb!"</w:t>
+        <w:t>"Janji ksatria yang sangat luar biasa! Selamat ya Aqlan atas gelar Ksatria Gotong Royong 400 Poin hari ini. Belajar sama Aqlan seru banget! Terima kasih banyak Aqlan, sampai ketemu di sesi berikutnya ya. Wassalamu'alaikum warahmatullahi wabarakatuh!"</w:t>
       </w:r>
     </w:p>
     <w:p>
@@ -518,11 +1516,13 @@
         <w:rPr>
           <w:rFonts w:ascii="Arial Black" w:hAnsi="Arial Black"/>
           <w:color w:val="B45309"/>
-          <w:sz w:val="23"/>
+          <w:sz w:val="24"/>
         </w:rPr>
         <w:t>━━━━━━━━━━━━━━━━━━━━━━━━━━━━━━━━━━━━━━━━━━━━━━━━━</w:t>
         <w:br/>
-        <w:t>SESI 2: MISHKA (KELAS 5 SD • 60 MENIT) — KERAGAMAN BUDAYA INDONESIAKU</w:t>
+        <w:t>PART II: SESI 2 — MISHKA (KELAS 5 SD • DURASI: 60 MENIT)</w:t>
+        <w:br/>
+        <w:t>Topik: Keragaman Budaya Indonesiaku &amp; Sains Arsitektur Nusantara (Bab 3)</w:t>
         <w:br/>
         <w:t>━━━━━━━━━━━━━━━━━━━━━━━━━━━━━━━━━━━━━━━━━━━━━━━━━</w:t>
       </w:r>
@@ -557,7 +1557,7 @@
                 <w:color w:val="B45309"/>
                 <w:sz w:val="22"/>
               </w:rPr>
-              <w:t>🎯 IMAGINATION HOOK PILIHAN A (TERKUNCI): MENEMBUS DINGIN 5°C LEMBAH BALIEM KE KEHANGATAN HONAI</w:t>
+              <w:t>🎯 [00:00 - 08:00] PEMBUKAAN &amp; GUIDED IMAGINATION (PILIHAN A TERKUNCI: SUHU 5°C JAYAWIJAYA PAPUA)</w:t>
               <w:br/>
             </w:r>
             <w:r>
@@ -566,7 +1566,7 @@
                 <w:color w:val="1E293B"/>
                 <w:sz w:val="20"/>
               </w:rPr>
-              <w:t>"Mishka, duduk tegak dan rileks... pejamkan kedua matamu perlahan. Tarik napas sejuk dari hidung... hembuskan. Bayangkan Mishka sedang berdiri di puncak Lembah Baliem Pegunungan Jayawijaya Papua saat senja. Dinginnya menusuk jaket tebalmu... suhunya anjlok sampai 5 derajat Celsius! Setiap kali Mishka bernapas, keluar uap putih es. Ujung jari mulai kaku kedinginan. Tapi di depanmu berdiri rumah bulat silinder beratap jerami tebal tanpa jendela sama sekali. Mishka melangkah masuk lewat pintunya yang rendah... WUSH! Seketika udara berubah hangat 22 derajat Celsius! Di tengah ruangan ada bara perapian kayu yang menyala tenang. Tak ada angin dingin yang bisa menembus masuk... Sekarang, buka kedua matamu perlahan Mishka!"</w:t>
+              <w:t>Fokus Stimulasi Sensorik: Suhu dingin beku 5°C di pegunungan Papua, hembusan angin menembus jaket, uap napas mengepul putih, dan kehangatan ajaib 22°C di dalam silinder Honai tanpa jendela.</w:t>
             </w:r>
           </w:p>
         </w:tc>
@@ -585,7 +1585,7 @@
           <w:color w:val="64748B"/>
           <w:sz w:val="18"/>
         </w:rPr>
-        <w:t>[Tersenyum ramah di Zoom]</w:t>
+        <w:t>[Tersenyum ramah di layar Zoom, menyapa hangat]</w:t>
         <w:br/>
       </w:r>
       <w:r>
@@ -603,7 +1603,7 @@
           <w:color w:val="0F172A"/>
           <w:sz w:val="20"/>
         </w:rPr>
-        <w:t>"Halo Mishka! Assalamu'alaikum! Senang sekali bisa ketemu lagi di Zoom hari ini! Gimana latihannya minggu ini? Sehat dan semangat kan?"</w:t>
+        <w:t>"Halo Mishka! Assalamu'alaikum! Senang sekali Bu Tiara bisa bertatap muka lagi dengan Mishka di Zoom hari ini! Gimana latihannya minggu ini? Sehat dan semangat kan?"</w:t>
       </w:r>
     </w:p>
     <w:p>
@@ -642,7 +1642,7 @@
           <w:color w:val="64748B"/>
           <w:sz w:val="18"/>
         </w:rPr>
-        <w:t>[Memantik rasa ingin tahu]</w:t>
+        <w:t>[Mengatur suara lembut, menenangkan, dan penuh rasa ingin tahu sains]</w:t>
         <w:br/>
       </w:r>
       <w:r>
@@ -660,7 +1660,73 @@
           <w:color w:val="0F172A"/>
           <w:sz w:val="20"/>
         </w:rPr>
-        <w:t>"Mishka, pernahkah terpikir: kenapa nenek moyang suku Dani Papua membuat Honai bulat tanpa jendela sama sekali? Apakah karena kehabisan bahan, atau karena mereka ilmuwan termodinamika alami yang sangat jenius?"</w:t>
+        <w:t>"Wah hebat! Nah Mishka, sebelum kita masuk ke buku teks dan slide Canva, Bu Tiara punya satu rahasia sains luar biasa warisan nenek moyang bangsa kita yang berhubungan langsung dengan kelenturan gerak tubuh Mishka. Yuk, duduk tegak tapi rileks di kursimu... sekarang, pejamkan kedua matamu perlahan-lahan. Tarik napas sejuk lewat hidung... hembuskan perlahan..."</w:t>
+      </w:r>
+    </w:p>
+    <w:p>
+      <w:pPr>
+        <w:spacing w:before="60" w:after="60"/>
+        <w:ind w:left="0"/>
+      </w:pPr>
+      <w:r>
+        <w:rPr>
+          <w:rFonts w:ascii="Calibri" w:hAnsi="Calibri"/>
+          <w:i/>
+          <w:color w:val="64748B"/>
+          <w:sz w:val="18"/>
+        </w:rPr>
+        <w:t>[Membacakan narasi sensorik suhu termal dan visual dengan penghayatan mendalam]</w:t>
+        <w:br/>
+      </w:r>
+      <w:r>
+        <w:rPr>
+          <w:rFonts w:ascii="Arial" w:hAnsi="Arial"/>
+          <w:b/>
+          <w:color w:val="BE123C"/>
+          <w:sz w:val="20"/>
+        </w:rPr>
+        <w:t xml:space="preserve">Guru Tiara: </w:t>
+      </w:r>
+      <w:r>
+        <w:rPr>
+          <w:rFonts w:ascii="Calibri" w:hAnsi="Calibri"/>
+          <w:color w:val="0F172A"/>
+          <w:sz w:val="20"/>
+        </w:rPr>
+        <w:t>"Bayangkan Mishka sedang berdiri di puncak Lembah Baliem Pegunungan Jayawijaya Papua saat senja. Dinginnya luar biasa menusuk jaket tebalmu... suhunya anjlok sampai 5 derajat Celsius! Setiap kali Mishka bernapas, keluar uap putih seperti asap es di udara. Ujung-ujung jari Mishka mulai kaku kedinginan. Tapi tepat di depanmu, berdiri sebuah rumah tradisional berbentuk silinder bundar beratap jerami ilalang kering yang sangat tebal tanpa jendela sama sekali. Mishka melangkah maju, membuka pintunya yang rendah, dan masuk ke dalam... WUSH! Seketika udara di dalam berubah menjadi hangat dan nyaman, sekitar 22 derajat Celsius! Di tengah ruangan ada bara api perapian kayu yang menyala tenang. Tak ada angin dingin yang bisa menembus masuk... Sekarang, buka kedua matamu perlahan-lahan Mishka!"</w:t>
+      </w:r>
+    </w:p>
+    <w:p>
+      <w:pPr>
+        <w:spacing w:before="60" w:after="60"/>
+        <w:ind w:left="0"/>
+      </w:pPr>
+      <w:r>
+        <w:rPr>
+          <w:rFonts w:ascii="Calibri" w:hAnsi="Calibri"/>
+          <w:i/>
+          <w:color w:val="64748B"/>
+          <w:sz w:val="18"/>
+        </w:rPr>
+        <w:t>[Tersenyum menatap mata Mishka]</w:t>
+        <w:br/>
+      </w:r>
+      <w:r>
+        <w:rPr>
+          <w:rFonts w:ascii="Arial" w:hAnsi="Arial"/>
+          <w:b/>
+          <w:color w:val="BE123C"/>
+          <w:sz w:val="20"/>
+        </w:rPr>
+        <w:t xml:space="preserve">Guru Tiara: </w:t>
+      </w:r>
+      <w:r>
+        <w:rPr>
+          <w:rFonts w:ascii="Calibri" w:hAnsi="Calibri"/>
+          <w:color w:val="0F172A"/>
+          <w:sz w:val="20"/>
+        </w:rPr>
+        <w:t>"Mishka, pernahkah terpikir: kenapa nenek moyang suku Dani di Papua merancang Rumah Honai berbentuk bulat melingkar dan sengaja TIDAK membuat jendela sama sekali? Apakah karena mereka kehabisan bahan bangunan, atau karena mereka adalah ilmuwan termodinamika alami yang sangat jenius?"</w:t>
       </w:r>
     </w:p>
     <w:p>
@@ -699,7 +1765,7 @@
           <w:color w:val="64748B"/>
           <w:sz w:val="18"/>
         </w:rPr>
-        <w:t>[Tepuk tangan kagum, membuka Slide Canva Sesi 2]</w:t>
+        <w:t>[Tepuk tangan kagum, membuka Slide Canva 1 dan 2]</w:t>
         <w:br/>
       </w:r>
       <w:r>
@@ -720,6 +1786,52 @@
         <w:t>"BINGO! Cerdas sekali analisis sains Mishka! Itu yang di fisika modern disebut 'Heat Trap' atau perangkap kalor alami! Tanpa listrik canggih, mereka mampu bertahan hidup di pegunungan beku 5 derajat Celsius selama ratusan tahun!"</w:t>
       </w:r>
     </w:p>
+    <w:tbl>
+      <w:tblPr>
+        <w:tblW w:type="auto" w:w="0"/>
+        <w:jc w:val="center"/>
+        <w:tblLayout w:type="fixed"/>
+        <w:tblLook w:firstColumn="1" w:firstRow="1" w:lastColumn="0" w:lastRow="0" w:noHBand="0" w:noVBand="1" w:val="04A0"/>
+      </w:tblPr>
+      <w:tblGrid>
+        <w:gridCol w:w="9792"/>
+      </w:tblGrid>
+      <w:tr>
+        <w:tc>
+          <w:tcPr>
+            <w:tcW w:type="dxa" w:w="10080"/>
+            <w:shd w:fill="FFFBEB"/>
+            <w:tcMar>
+              <w:top w:w="140" w:type="dxa"/>
+              <w:bottom w:w="140" w:type="dxa"/>
+              <w:left w:w="200" w:type="dxa"/>
+              <w:right w:w="200" w:type="dxa"/>
+            </w:tcMar>
+          </w:tcPr>
+          <w:p>
+            <w:r>
+              <w:rPr>
+                <w:rFonts w:ascii="Arial" w:hAnsi="Arial"/>
+                <w:b/>
+                <w:color w:val="B45309"/>
+                <w:sz w:val="22"/>
+              </w:rPr>
+              <w:t>📖 [08:00 - 20:00] STORYTELLING CANVA SLIDE 1-6 (BUKU TEKS, GEMPA RUMAH GADANG &amp; TORAJA)</w:t>
+              <w:br/>
+            </w:r>
+            <w:r>
+              <w:rPr>
+                <w:rFonts w:ascii="Calibri" w:hAnsi="Calibri"/>
+                <w:color w:val="1E293B"/>
+                <w:sz w:val="20"/>
+              </w:rPr>
+              <w:t>Materi Inti Buku Siswa Kemendikbud: 3 faktor keragaman (&gt;17.000 pulau), sains tahan gempa pasak kayu elastis Rumah Gadang Minangkabau vs kelenturan senam lantai, dan Rumah Tongkonan Toraja.</w:t>
+            </w:r>
+          </w:p>
+        </w:tc>
+      </w:tr>
+    </w:tbl>
+    <w:p/>
     <w:p>
       <w:pPr>
         <w:spacing w:before="60" w:after="60"/>
@@ -732,7 +1844,7 @@
           <w:color w:val="64748B"/>
           <w:sz w:val="18"/>
         </w:rPr>
-        <w:t>[Menjelaskan materi textbook]</w:t>
+        <w:t>[Membahas poin penting di Slide 2, 4, 5, dan 6]</w:t>
         <w:br/>
       </w:r>
       <w:r>
@@ -750,40 +1862,7 @@
           <w:color w:val="0F172A"/>
           <w:sz w:val="20"/>
         </w:rPr>
-        <w:t>"Buku Siswa Kemendikbud halaman 63 mencatat bahwa Indonesia punya lebih dari 17.000 pulau. Bandingkan Honai penahan dingin beku dengan Rumah Gadang di Minangkabau yang memakai sistem pasak kayu elastis tanpa paku besi sama sekali untuk meredam gempa bumi, persis kelenturan senam lantai! Dan ada Rumah Tongkonan Toraja beratap perahu. Sikap membanggakan budaya sendiri berlebihan dan meremehkan budaya lain disebut Etnosentrisme, dan Pelajar Pancasila wajib melawannya!"</w:t>
-      </w:r>
-    </w:p>
-    <w:p>
-      <w:pPr>
-        <w:spacing w:before="60" w:after="60"/>
-        <w:ind w:left="0"/>
-      </w:pPr>
-      <w:r>
-        <w:rPr>
-          <w:rFonts w:ascii="Calibri" w:hAnsi="Calibri"/>
-          <w:i/>
-          <w:color w:val="64748B"/>
-          <w:sz w:val="18"/>
-        </w:rPr>
-        <w:t>[Mengarahkan ke game web]</w:t>
-        <w:br/>
-      </w:r>
-      <w:r>
-        <w:rPr>
-          <w:rFonts w:ascii="Arial" w:hAnsi="Arial"/>
-          <w:b/>
-          <w:color w:val="BE123C"/>
-          <w:sz w:val="20"/>
-        </w:rPr>
-        <w:t xml:space="preserve">Guru Tiara: </w:t>
-      </w:r>
-      <w:r>
-        <w:rPr>
-          <w:rFonts w:ascii="Calibri" w:hAnsi="Calibri"/>
-          <w:color w:val="0F172A"/>
-          <w:sz w:val="20"/>
-        </w:rPr>
-        <w:t>"Buka game Pancasila di: https://tiara-dwi.github.io/pkbm-games/pancasila/, pilih nama Mishka dan klik tab Kelas 5. Ada 4 Misi Ekspedisi Sains &amp; Budaya untuk kumpulkan 400 Poin!"</w:t>
+        <w:t>"Coba Mishka lihat Slide 2 Canva ini. Buku Siswa Kemendikbud halaman 63 mencatat bahwa Indonesia adalah negara kepulauan terbesar di dunia dengan lebih dari 17.000 pulau! Ada 3 faktor penyebab keragaman budaya: letak strategis jalur laut dunia, kondisi kepulauan yang terpisah samudra, dan perbedaan bentang alam. Nah, sekarang coba lihat Slide 4, 5, dan 6. Bandingkan Honai penahan dingin beku tadi dengan Rumah Gadang di Minangkabau Sumatera Barat. Rumah Gadang dibangun di atas tiang panggung kayu dengan sistem sambungan pasak kayu elastis tanpa paku besi sama sekali!"</w:t>
       </w:r>
     </w:p>
     <w:p>
@@ -807,7 +1886,7 @@
           <w:color w:val="334155"/>
           <w:sz w:val="20"/>
         </w:rPr>
-        <w:t>"Misi 1 Honai dapet 100 poin! Misi 2 pasak gempa Gadang dapet 100 poin! Misi 3 anti-etnosentrisme dapet 100 poin! Dan Misi 4 Mini Test betul semua dapet 100 poin! Total 400 poin sempurna bu!"</w:t>
+        <w:t>"Tanpa paku besi bu? Kenapa bisa kuat ya?"</w:t>
       </w:r>
     </w:p>
     <w:p>
@@ -822,7 +1901,7 @@
           <w:color w:val="64748B"/>
           <w:sz w:val="18"/>
         </w:rPr>
-        <w:t>[Mendiktekan 5 poin ringkas resmi]</w:t>
+        <w:t>[Menghubungkan rekayasa gempa dengan kelenturan senam lantai]</w:t>
         <w:br/>
       </w:r>
       <w:r>
@@ -840,40 +1919,7 @@
           <w:color w:val="0F172A"/>
           <w:sz w:val="20"/>
         </w:rPr>
-        <w:t>"Alhamdulillah! Sekarang ambil buku tulis PPKn dan pulpen Mishka. Kita catat 5 poin inti sains dan budaya nusantara hari ini ya!"</w:t>
-      </w:r>
-    </w:p>
-    <w:p>
-      <w:pPr>
-        <w:spacing w:before="60" w:after="60"/>
-        <w:ind w:left="0"/>
-      </w:pPr>
-      <w:r>
-        <w:rPr>
-          <w:rFonts w:ascii="Calibri" w:hAnsi="Calibri"/>
-          <w:i/>
-          <w:color w:val="64748B"/>
-          <w:sz w:val="18"/>
-        </w:rPr>
-        <w:t>[Refleksi akhir]</w:t>
-        <w:br/>
-      </w:r>
-      <w:r>
-        <w:rPr>
-          <w:rFonts w:ascii="Arial" w:hAnsi="Arial"/>
-          <w:b/>
-          <w:color w:val="BE123C"/>
-          <w:sz w:val="20"/>
-        </w:rPr>
-        <w:t xml:space="preserve">Guru Tiara: </w:t>
-      </w:r>
-      <w:r>
-        <w:rPr>
-          <w:rFonts w:ascii="Calibri" w:hAnsi="Calibri"/>
-          <w:color w:val="0F172A"/>
-          <w:sz w:val="20"/>
-        </w:rPr>
-        <w:t>"Bagaimana Mishka memadukan kelenturan lingkaran Honai dan keagungan haluan Tongkonan dalam gerakan senam lantai nanti?"</w:t>
+        <w:t>"Karena Sumatera Barat berada di jalur rawan gempa bumi. Bangunan semen modern yang kaku jika diguncang gempa 7.5 SR akan patah retak roboh. Tapi Rumah Gadang, berkat sambungan pasak kayu elastisnya, justru bergoyang luwes meredam getaran seismik gempa persis seperti tubuh pesenam lantai yang lentur meredam lompatan salto! Tidak patah dan berdiri kokoh ratusan tahun! Dan ada juga Rumah Tongkonan Toraja yang beratap perahu menghormati leluhur maritim. Nah Mishka, jika semua suku punya kejeniusan masing-masing, pantas tidak jika ada teman yang mengejek tarian atau budaya suku lain?"</w:t>
       </w:r>
     </w:p>
     <w:p>
@@ -897,7 +1943,7 @@
           <w:color w:val="334155"/>
           <w:sz w:val="20"/>
         </w:rPr>
-        <w:t>"Bisa bikin gerakan melingkar lentur seperti Honai, lalu gerakan tangan membentang seperti atap perahu Tongkonan bu! Keduanya indah kalau bersatu!"</w:t>
+        <w:t>"Sama sekali nggak pantas bu! Kita harus menghargai dan bangga dengan semua budaya."</w:t>
       </w:r>
     </w:p>
     <w:p>
@@ -912,7 +1958,7 @@
           <w:color w:val="64748B"/>
           <w:sz w:val="18"/>
         </w:rPr>
-        <w:t>[Menutup Sesi 2]</w:t>
+        <w:t>[Memberikan penguatan karakter anti-etnosentrisme]</w:t>
         <w:br/>
       </w:r>
       <w:r>
@@ -930,7 +1976,767 @@
           <w:color w:val="0F172A"/>
           <w:sz w:val="20"/>
         </w:rPr>
-        <w:t>"Gagasan koreografi persatuan yang luar biasa puitis! Selamat atas predikat Duta Pelestari Budaya Nusantara 400 Poin hari ini Mishka! Sampai jumpa di sesi berikutnya ya. Wassalamu'alaikum wr. wb!"</w:t>
+        <w:t>"Tepat sekali! Sikap membanggakan budaya sendiri berlebihan dan meremehkan budaya suku lain disebut 'Etnosentrisme'. Dan Pelajar Pancasila sejati selalu menjauhi etnosentrisme!"</w:t>
+      </w:r>
+    </w:p>
+    <w:tbl>
+      <w:tblPr>
+        <w:tblW w:type="auto" w:w="0"/>
+        <w:jc w:val="center"/>
+        <w:tblLayout w:type="fixed"/>
+        <w:tblLook w:firstColumn="1" w:firstRow="1" w:lastColumn="0" w:lastRow="0" w:noHBand="0" w:noVBand="1" w:val="04A0"/>
+      </w:tblPr>
+      <w:tblGrid>
+        <w:gridCol w:w="9792"/>
+      </w:tblGrid>
+      <w:tr>
+        <w:tc>
+          <w:tcPr>
+            <w:tcW w:type="dxa" w:w="10080"/>
+            <w:shd w:fill="FFFBEB"/>
+            <w:tcMar>
+              <w:top w:w="140" w:type="dxa"/>
+              <w:bottom w:w="140" w:type="dxa"/>
+              <w:left w:w="200" w:type="dxa"/>
+              <w:right w:w="200" w:type="dxa"/>
+            </w:tcMar>
+          </w:tcPr>
+          <w:p>
+            <w:r>
+              <w:rPr>
+                <w:rFonts w:ascii="Arial" w:hAnsi="Arial"/>
+                <w:b/>
+                <w:color w:val="B45309"/>
+                <w:sz w:val="22"/>
+              </w:rPr>
+              <w:t>🎨 [20:00 - 32:00] CANVA SLIDE 7-9 (3 VISUAL BARU: PENTAS TEATER, ALAT MUSIK &amp; FESTIVAL KULINER)</w:t>
+              <w:br/>
+            </w:r>
+            <w:r>
+              <w:rPr>
+                <w:rFonts w:ascii="Calibri" w:hAnsi="Calibri"/>
+                <w:color w:val="1E293B"/>
+                <w:sz w:val="20"/>
+              </w:rPr>
+              <w:t>Fokus Pembelajaran: Pentas Teater harmoni 3 busana adat (Toraja, Minang, Papua), warisan 4 instrumen musik tradisional (Sasando, Angklung, Tifa, Gamelan), dan Festival Kuliner tanpa etnosentrisme.</w:t>
+            </w:r>
+          </w:p>
+        </w:tc>
+      </w:tr>
+    </w:tbl>
+    <w:p/>
+    <w:p>
+      <w:pPr>
+        <w:spacing w:before="60" w:after="60"/>
+        <w:ind w:left="0"/>
+      </w:pPr>
+      <w:r>
+        <w:rPr>
+          <w:rFonts w:ascii="Calibri" w:hAnsi="Calibri"/>
+          <w:i/>
+          <w:color w:val="64748B"/>
+          <w:sz w:val="18"/>
+        </w:rPr>
+        <w:t>[Menampilkan Slide 7 gambar pentas teater]</w:t>
+        <w:br/>
+      </w:r>
+      <w:r>
+        <w:rPr>
+          <w:rFonts w:ascii="Arial" w:hAnsi="Arial"/>
+          <w:b/>
+          <w:color w:val="BE123C"/>
+          <w:sz w:val="20"/>
+        </w:rPr>
+        <w:t xml:space="preserve">Guru Tiara: </w:t>
+      </w:r>
+      <w:r>
+        <w:rPr>
+          <w:rFonts w:ascii="Calibri" w:hAnsi="Calibri"/>
+          <w:color w:val="0F172A"/>
+          <w:sz w:val="20"/>
+        </w:rPr>
+        <w:t>"Mishka, lihat gambar di Slide 7 ini! Ini adalah karya seni yang memukau: Pentas Teater Harmoni Budaya Sekolah! Coba lihat siapa yang ada di tengah?"</w:t>
+      </w:r>
+    </w:p>
+    <w:p>
+      <w:pPr>
+        <w:spacing w:before="60" w:after="60"/>
+        <w:ind w:left="288"/>
+      </w:pPr>
+      <w:r>
+        <w:rPr>
+          <w:rFonts w:ascii="Arial" w:hAnsi="Arial"/>
+          <w:b/>
+          <w:color w:val="0284C7"/>
+          <w:sz w:val="20"/>
+        </w:rPr>
+        <w:t xml:space="preserve">Mishka: </w:t>
+      </w:r>
+      <w:r>
+        <w:rPr>
+          <w:rFonts w:ascii="Calibri" w:hAnsi="Calibri"/>
+          <w:i/>
+          <w:color w:val="334155"/>
+          <w:sz w:val="20"/>
+        </w:rPr>
+        <w:t>"Wah ada aku bu! Pakai baju adat Toraja Baju Pokko sama hiasan manik-manik Kandaure!"</w:t>
+      </w:r>
+    </w:p>
+    <w:p>
+      <w:pPr>
+        <w:spacing w:before="60" w:after="60"/>
+        <w:ind w:left="0"/>
+      </w:pPr>
+      <w:r>
+        <w:rPr>
+          <w:rFonts w:ascii="Calibri" w:hAnsi="Calibri"/>
+          <w:i/>
+          <w:color w:val="64748B"/>
+          <w:sz w:val="18"/>
+        </w:rPr>
+        <w:t>[Mengapresiasi nilai persatuan di Slide 7]</w:t>
+        <w:br/>
+      </w:r>
+      <w:r>
+        <w:rPr>
+          <w:rFonts w:ascii="Arial" w:hAnsi="Arial"/>
+          <w:b/>
+          <w:color w:val="BE123C"/>
+          <w:sz w:val="20"/>
+        </w:rPr>
+        <w:t xml:space="preserve">Guru Tiara: </w:t>
+      </w:r>
+      <w:r>
+        <w:rPr>
+          <w:rFonts w:ascii="Calibri" w:hAnsi="Calibri"/>
+          <w:color w:val="0F172A"/>
+          <w:sz w:val="20"/>
+        </w:rPr>
+        <w:t>"Iya, cantik sekali! Dan di samping kiri Mishka, sahabatmu memakai baju adat Minang lengkap dengan mahkota tanduk kerbau Tingkuluak Tanduak bersulam emas. Di samping kananmu, sahabat dari Papua memakai mahkota bulu cendrawasih dan memegang alat musik Tifa! Di latar panggung ada 3 miniatur rumah adat: Tongkonan, Rumah Gadang, dan Honai. Ketika ketiganya tampil bersama di bawah lampu panggung yang sama, seluruh penonton berdiri bertepuk tangan kagum! Ini bukti bahwa saat perbedaan berpadu, tercipta mahakarya seni yang luar biasa!"</w:t>
+      </w:r>
+    </w:p>
+    <w:p>
+      <w:pPr>
+        <w:spacing w:before="60" w:after="60"/>
+        <w:ind w:left="0"/>
+      </w:pPr>
+      <w:r>
+        <w:rPr>
+          <w:rFonts w:ascii="Calibri" w:hAnsi="Calibri"/>
+          <w:i/>
+          <w:color w:val="64748B"/>
+          <w:sz w:val="18"/>
+        </w:rPr>
+        <w:t>[Pindah ke Slide 8]</w:t>
+        <w:br/>
+      </w:r>
+      <w:r>
+        <w:rPr>
+          <w:rFonts w:ascii="Arial" w:hAnsi="Arial"/>
+          <w:b/>
+          <w:color w:val="BE123C"/>
+          <w:sz w:val="20"/>
+        </w:rPr>
+        <w:t xml:space="preserve">Guru Tiara: </w:t>
+      </w:r>
+      <w:r>
+        <w:rPr>
+          <w:rFonts w:ascii="Calibri" w:hAnsi="Calibri"/>
+          <w:color w:val="0F172A"/>
+          <w:sz w:val="20"/>
+        </w:rPr>
+        <w:t>"Sekarang lihat Slide 8: Mahakarya Alat Musik Tradisional &amp; Wastra Nusantara. Ada Sasando dari daun lontar pulau Rote berdampingan dengan Tenun Ikat, Angklung bambu Jawa Barat dengan Batik Mega Mendung, Tifa Papua dengan tas Noken, serta Gamelan Gong Ageng dengan Batik Parang. Setiap nada bambu, dawai lontar, dan pukulan tifa menyuarakan doa dan keagungan bangsa!"</w:t>
+      </w:r>
+    </w:p>
+    <w:p>
+      <w:pPr>
+        <w:spacing w:before="60" w:after="60"/>
+        <w:ind w:left="0"/>
+      </w:pPr>
+      <w:r>
+        <w:rPr>
+          <w:rFonts w:ascii="Calibri" w:hAnsi="Calibri"/>
+          <w:i/>
+          <w:color w:val="64748B"/>
+          <w:sz w:val="18"/>
+        </w:rPr>
+        <w:t>[Pindah ke Slide 9]</w:t>
+        <w:br/>
+      </w:r>
+      <w:r>
+        <w:rPr>
+          <w:rFonts w:ascii="Arial" w:hAnsi="Arial"/>
+          <w:b/>
+          <w:color w:val="BE123C"/>
+          <w:sz w:val="20"/>
+        </w:rPr>
+        <w:t xml:space="preserve">Guru Tiara: </w:t>
+      </w:r>
+      <w:r>
+        <w:rPr>
+          <w:rFonts w:ascii="Calibri" w:hAnsi="Calibri"/>
+          <w:color w:val="0F172A"/>
+          <w:sz w:val="20"/>
+        </w:rPr>
+        <w:t>"Dan lihat Slide 9: Festival Kuliner Nusantara di ruang kelas! Ada Papeda Papua kuah kuning ikan kunyit dengan sumpit gata-gata, Rendang Padang di atas daun pisang, dan Gudeg Yogyakarta. Mishka dan teman-teman saling mencicipi dengan senyum gembira tanpa ada yang mengejek aromanya. Inilah teladan nyata Pelajar Pancasila anti-etnosentrisme!"</w:t>
+      </w:r>
+    </w:p>
+    <w:tbl>
+      <w:tblPr>
+        <w:tblW w:type="auto" w:w="0"/>
+        <w:jc w:val="center"/>
+        <w:tblLayout w:type="fixed"/>
+        <w:tblLook w:firstColumn="1" w:firstRow="1" w:lastColumn="0" w:lastRow="0" w:noHBand="0" w:noVBand="1" w:val="04A0"/>
+      </w:tblPr>
+      <w:tblGrid>
+        <w:gridCol w:w="9792"/>
+      </w:tblGrid>
+      <w:tr>
+        <w:tc>
+          <w:tcPr>
+            <w:tcW w:type="dxa" w:w="10080"/>
+            <w:shd w:fill="FFFBEB"/>
+            <w:tcMar>
+              <w:top w:w="140" w:type="dxa"/>
+              <w:bottom w:w="140" w:type="dxa"/>
+              <w:left w:w="200" w:type="dxa"/>
+              <w:right w:w="200" w:type="dxa"/>
+            </w:tcMar>
+          </w:tcPr>
+          <w:p>
+            <w:r>
+              <w:rPr>
+                <w:rFonts w:ascii="Arial" w:hAnsi="Arial"/>
+                <w:b/>
+                <w:color w:val="B45309"/>
+                <w:sz w:val="22"/>
+              </w:rPr>
+              <w:t>🎮 [32:00 - 45:00] PRAKTIK LANGSUNG 4 MISI GAME WEB INTERAKTIF (TARGET: 400 POIN)</w:t>
+              <w:br/>
+            </w:r>
+            <w:r>
+              <w:rPr>
+                <w:rFonts w:ascii="Calibri" w:hAnsi="Calibri"/>
+                <w:color w:val="1E293B"/>
+                <w:sz w:val="20"/>
+              </w:rPr>
+              <w:t>Akses Game: https://tiara-dwi.github.io/pkbm-games/pancasila/ (Pilih Siswa: Mishka • Kelas 5)</w:t>
+              <w:br/>
+              <w:t>Target Misi: Misi 1 (100 Poin), Misi 2 (100 Poin), Misi 3 (100 Poin), Misi 4 Mini Test C4 (100 Poin).</w:t>
+            </w:r>
+          </w:p>
+        </w:tc>
+      </w:tr>
+    </w:tbl>
+    <w:p/>
+    <w:p>
+      <w:pPr>
+        <w:spacing w:before="60" w:after="60"/>
+        <w:ind w:left="0"/>
+      </w:pPr>
+      <w:r>
+        <w:rPr>
+          <w:rFonts w:ascii="Calibri" w:hAnsi="Calibri"/>
+          <w:i/>
+          <w:color w:val="64748B"/>
+          <w:sz w:val="18"/>
+        </w:rPr>
+        <w:t>[Mengarahkan Mishka membuka game web]</w:t>
+        <w:br/>
+      </w:r>
+      <w:r>
+        <w:rPr>
+          <w:rFonts w:ascii="Arial" w:hAnsi="Arial"/>
+          <w:b/>
+          <w:color w:val="BE123C"/>
+          <w:sz w:val="20"/>
+        </w:rPr>
+        <w:t xml:space="preserve">Guru Tiara: </w:t>
+      </w:r>
+      <w:r>
+        <w:rPr>
+          <w:rFonts w:ascii="Calibri" w:hAnsi="Calibri"/>
+          <w:color w:val="0F172A"/>
+          <w:sz w:val="20"/>
+        </w:rPr>
+        <w:t>"Sekarang saatnya menguji ketajaman analisismu di game web! Buka browser di: https://tiara-dwi.github.io/pkbm-games/pancasila/. Pilih nama Mishka di pojok atas dan klik tab 'Sesi 2: Mishka'. Ada 4 Misi Ekspedisi Sains &amp; Budaya menuju target 400 Poin!"</w:t>
+      </w:r>
+    </w:p>
+    <w:p>
+      <w:pPr>
+        <w:spacing w:before="60" w:after="60"/>
+        <w:ind w:left="0"/>
+      </w:pPr>
+      <w:r>
+        <w:rPr>
+          <w:rFonts w:ascii="Calibri" w:hAnsi="Calibri"/>
+          <w:i/>
+          <w:color w:val="64748B"/>
+          <w:sz w:val="18"/>
+        </w:rPr>
+        <w:t>[Membimbing Misi 1]</w:t>
+        <w:br/>
+      </w:r>
+      <w:r>
+        <w:rPr>
+          <w:rFonts w:ascii="Arial" w:hAnsi="Arial"/>
+          <w:b/>
+          <w:color w:val="BE123C"/>
+          <w:sz w:val="20"/>
+        </w:rPr>
+        <w:t xml:space="preserve">Guru Tiara: </w:t>
+      </w:r>
+      <w:r>
+        <w:rPr>
+          <w:rFonts w:ascii="Calibri" w:hAnsi="Calibri"/>
+          <w:color w:val="0F172A"/>
+          <w:sz w:val="20"/>
+        </w:rPr>
+        <w:t>"Klik 'Misi 1: Sains Honai 5°C'. Coba uji pasang jendela kaca vs desain asli tanpa jendela!"</w:t>
+      </w:r>
+    </w:p>
+    <w:p>
+      <w:pPr>
+        <w:spacing w:before="60" w:after="60"/>
+        <w:ind w:left="288"/>
+      </w:pPr>
+      <w:r>
+        <w:rPr>
+          <w:rFonts w:ascii="Arial" w:hAnsi="Arial"/>
+          <w:b/>
+          <w:color w:val="0284C7"/>
+          <w:sz w:val="20"/>
+        </w:rPr>
+        <w:t xml:space="preserve">Mishka: </w:t>
+      </w:r>
+      <w:r>
+        <w:rPr>
+          <w:rFonts w:ascii="Calibri" w:hAnsi="Calibri"/>
+          <w:i/>
+          <w:color w:val="334155"/>
+          <w:sz w:val="20"/>
+        </w:rPr>
+        <w:t>"Jendela kaca bikin suhu drop jadi 7 derajat bu, ada tanda bahaya hipotermia! Pas klik desain asli tanpa jendela, langsung hangat 22 derajat dan dapat 100 poin!"</w:t>
+      </w:r>
+    </w:p>
+    <w:p>
+      <w:pPr>
+        <w:spacing w:before="60" w:after="60"/>
+        <w:ind w:left="0"/>
+      </w:pPr>
+      <w:r>
+        <w:rPr>
+          <w:rFonts w:ascii="Calibri" w:hAnsi="Calibri"/>
+          <w:i/>
+          <w:color w:val="64748B"/>
+          <w:sz w:val="18"/>
+        </w:rPr>
+        <w:t>[Membimbing Misi 2]</w:t>
+        <w:br/>
+      </w:r>
+      <w:r>
+        <w:rPr>
+          <w:rFonts w:ascii="Arial" w:hAnsi="Arial"/>
+          <w:b/>
+          <w:color w:val="BE123C"/>
+          <w:sz w:val="20"/>
+        </w:rPr>
+        <w:t xml:space="preserve">Guru Tiara: </w:t>
+      </w:r>
+      <w:r>
+        <w:rPr>
+          <w:rFonts w:ascii="Calibri" w:hAnsi="Calibri"/>
+          <w:color w:val="0F172A"/>
+          <w:sz w:val="20"/>
+        </w:rPr>
+        <w:t>"Lanjut ke 'Misi 2: Pasak Gempa Gadang'. Simulasikan gempa bumi 7.5 SR!"</w:t>
+      </w:r>
+    </w:p>
+    <w:p>
+      <w:pPr>
+        <w:spacing w:before="60" w:after="60"/>
+        <w:ind w:left="288"/>
+      </w:pPr>
+      <w:r>
+        <w:rPr>
+          <w:rFonts w:ascii="Arial" w:hAnsi="Arial"/>
+          <w:b/>
+          <w:color w:val="0284C7"/>
+          <w:sz w:val="20"/>
+        </w:rPr>
+        <w:t xml:space="preserve">Mishka: </w:t>
+      </w:r>
+      <w:r>
+        <w:rPr>
+          <w:rFonts w:ascii="Calibri" w:hAnsi="Calibri"/>
+          <w:i/>
+          <w:color w:val="334155"/>
+          <w:sz w:val="20"/>
+        </w:rPr>
+        <w:t>"Gedung semennya roboh retak bu, tapi Rumah Gadang pasak elastis bergoyang lentur dan kokoh! Tambah 100 poin jadi 200!"</w:t>
+      </w:r>
+    </w:p>
+    <w:p>
+      <w:pPr>
+        <w:spacing w:before="60" w:after="60"/>
+        <w:ind w:left="0"/>
+      </w:pPr>
+      <w:r>
+        <w:rPr>
+          <w:rFonts w:ascii="Calibri" w:hAnsi="Calibri"/>
+          <w:i/>
+          <w:color w:val="64748B"/>
+          <w:sz w:val="18"/>
+        </w:rPr>
+        <w:t>[Membimbing Misi 3]</w:t>
+        <w:br/>
+      </w:r>
+      <w:r>
+        <w:rPr>
+          <w:rFonts w:ascii="Arial" w:hAnsi="Arial"/>
+          <w:b/>
+          <w:color w:val="BE123C"/>
+          <w:sz w:val="20"/>
+        </w:rPr>
+        <w:t xml:space="preserve">Guru Tiara: </w:t>
+      </w:r>
+      <w:r>
+        <w:rPr>
+          <w:rFonts w:ascii="Calibri" w:hAnsi="Calibri"/>
+          <w:color w:val="0F172A"/>
+          <w:sz w:val="20"/>
+        </w:rPr>
+        <w:t>"Buka 'Misi 3: Anti-Etnosentrisme'. Selesaikan kasus teman yang mengejek tarian adat daerah lain!"</w:t>
+      </w:r>
+    </w:p>
+    <w:p>
+      <w:pPr>
+        <w:spacing w:before="60" w:after="60"/>
+        <w:ind w:left="288"/>
+      </w:pPr>
+      <w:r>
+        <w:rPr>
+          <w:rFonts w:ascii="Arial" w:hAnsi="Arial"/>
+          <w:b/>
+          <w:color w:val="0284C7"/>
+          <w:sz w:val="20"/>
+        </w:rPr>
+        <w:t xml:space="preserve">Mishka: </w:t>
+      </w:r>
+      <w:r>
+        <w:rPr>
+          <w:rFonts w:ascii="Calibri" w:hAnsi="Calibri"/>
+          <w:i/>
+          <w:color w:val="334155"/>
+          <w:sz w:val="20"/>
+        </w:rPr>
+        <w:t>"Berhasil membongkar bahaya etnosentrisme bu! Skorku sekarang 300 poin!"</w:t>
+      </w:r>
+    </w:p>
+    <w:p>
+      <w:pPr>
+        <w:spacing w:before="60" w:after="60"/>
+        <w:ind w:left="0"/>
+      </w:pPr>
+      <w:r>
+        <w:rPr>
+          <w:rFonts w:ascii="Calibri" w:hAnsi="Calibri"/>
+          <w:i/>
+          <w:color w:val="64748B"/>
+          <w:sz w:val="18"/>
+        </w:rPr>
+        <w:t>[Mengawasi pengerjaan mini test]</w:t>
+        <w:br/>
+      </w:r>
+      <w:r>
+        <w:rPr>
+          <w:rFonts w:ascii="Arial" w:hAnsi="Arial"/>
+          <w:b/>
+          <w:color w:val="BE123C"/>
+          <w:sz w:val="20"/>
+        </w:rPr>
+        <w:t xml:space="preserve">Guru Tiara: </w:t>
+      </w:r>
+      <w:r>
+        <w:rPr>
+          <w:rFonts w:ascii="Calibri" w:hAnsi="Calibri"/>
+          <w:color w:val="0F172A"/>
+          <w:sz w:val="20"/>
+        </w:rPr>
+        <w:t>"Misi puncak kita: klik 'Misi 4: Mini Test C3-C4'. Ada 4 soal pilihan ganda sains arsitektur &amp; kebinekaan. Kerjakan dengan teliti ya Mishka!"</w:t>
+      </w:r>
+    </w:p>
+    <w:p>
+      <w:pPr>
+        <w:spacing w:before="60" w:after="60"/>
+        <w:ind w:left="288"/>
+      </w:pPr>
+      <w:r>
+        <w:rPr>
+          <w:rFonts w:ascii="Arial" w:hAnsi="Arial"/>
+          <w:b/>
+          <w:color w:val="0284C7"/>
+          <w:sz w:val="20"/>
+        </w:rPr>
+        <w:t xml:space="preserve">Mishka: </w:t>
+      </w:r>
+      <w:r>
+        <w:rPr>
+          <w:rFonts w:ascii="Calibri" w:hAnsi="Calibri"/>
+          <w:i/>
+          <w:color w:val="334155"/>
+          <w:sz w:val="20"/>
+        </w:rPr>
+        <w:t>"Alhamdulillah bu, betul semua! Skorku 400 sempurna dan keluar sertifikat Duta Pelestari Budaya Nusantara SD Kelas 5!"</w:t>
+      </w:r>
+    </w:p>
+    <w:tbl>
+      <w:tblPr>
+        <w:tblW w:type="auto" w:w="0"/>
+        <w:jc w:val="center"/>
+        <w:tblLayout w:type="fixed"/>
+        <w:tblLook w:firstColumn="1" w:firstRow="1" w:lastColumn="0" w:lastRow="0" w:noHBand="0" w:noVBand="1" w:val="04A0"/>
+      </w:tblPr>
+      <w:tblGrid>
+        <w:gridCol w:w="9792"/>
+      </w:tblGrid>
+      <w:tr>
+        <w:tc>
+          <w:tcPr>
+            <w:tcW w:type="dxa" w:w="10080"/>
+            <w:shd w:fill="FFFBEB"/>
+            <w:tcMar>
+              <w:top w:w="140" w:type="dxa"/>
+              <w:bottom w:w="140" w:type="dxa"/>
+              <w:left w:w="200" w:type="dxa"/>
+              <w:right w:w="200" w:type="dxa"/>
+            </w:tcMar>
+          </w:tcPr>
+          <w:p>
+            <w:r>
+              <w:rPr>
+                <w:rFonts w:ascii="Arial" w:hAnsi="Arial"/>
+                <w:b/>
+                <w:color w:val="B45309"/>
+                <w:sz w:val="22"/>
+              </w:rPr>
+              <w:t>📝 [45:00 - 55:00] BIMBINGAN MENULIS BUKU CATATAN SISWA (BUKU TULIS PPKN MISHKA)</w:t>
+              <w:br/>
+            </w:r>
+            <w:r>
+              <w:rPr>
+                <w:rFonts w:ascii="Calibri" w:hAnsi="Calibri"/>
+                <w:color w:val="1E293B"/>
+                <w:sz w:val="20"/>
+              </w:rPr>
+              <w:t>Instruksi Guru: Diktekan 5 poin penting ringkas ini agar disalin rapi ke buku tulis PPKn Mishka.</w:t>
+            </w:r>
+          </w:p>
+        </w:tc>
+      </w:tr>
+    </w:tbl>
+    <w:p/>
+    <w:p>
+      <w:pPr>
+        <w:spacing w:before="60" w:after="60"/>
+        <w:ind w:left="0"/>
+      </w:pPr>
+      <w:r>
+        <w:rPr>
+          <w:rFonts w:ascii="Calibri" w:hAnsi="Calibri"/>
+          <w:i/>
+          <w:color w:val="64748B"/>
+          <w:sz w:val="18"/>
+        </w:rPr>
+        <w:t>[Mendiktekan dengan terstruktur dan jelas]</w:t>
+        <w:br/>
+      </w:r>
+      <w:r>
+        <w:rPr>
+          <w:rFonts w:ascii="Arial" w:hAnsi="Arial"/>
+          <w:b/>
+          <w:color w:val="BE123C"/>
+          <w:sz w:val="20"/>
+        </w:rPr>
+        <w:t xml:space="preserve">Guru Tiara: </w:t>
+      </w:r>
+      <w:r>
+        <w:rPr>
+          <w:rFonts w:ascii="Calibri" w:hAnsi="Calibri"/>
+          <w:color w:val="0F172A"/>
+          <w:sz w:val="20"/>
+        </w:rPr>
+        <w:t>"Alhamdulillah! Sekarang ambil buku tulis PPKn dan pulpen Mishka. Bu Tiara diktekan 5 poin inti sains dan budaya nusantara untuk disalin rapi:</w:t>
+        <w:br/>
+        <w:t>1. Tiga faktor penyebab keragaman budaya Indonesia: letak strategis jalur perdagangan dunia, kondisi kepulauan (&gt;17.000 pulau), dan perbedaan bentang alam/iklim.</w:t>
+        <w:br/>
+        <w:t>2. Sains Termodinamika Rumah Honai (Papua): Bentuk silinder jerami tebal tanpa bukaan jendela berfungsi sebagai heat trap (perangkap kalor) alami dari suhu beku 5°C pegunungan.</w:t>
+        <w:br/>
+        <w:t>3. Sains Tahan Gempa Rumah Gadang (Minangkabau): Dibangun dengan sambungan pasak kayu elastis tanpa paku besi sehingga lentur meredam getaran seismik gempa bumi.</w:t>
+        <w:br/>
+        <w:t>4. Rumah Tongkonan (Toraja): Atap lengkung perahu menghormati leluhur maritim dan tiang panggung tinggi melancarkan sirkulasi udara lembap tropis.</w:t>
+        <w:br/>
+        <w:t>5. Sikap Anti-Etnosentrisme: Menghindari sikap menganggap budaya sendiri paling hebat dan selalu mengagumi serta menghormati mahakarya kebinekaan nusantara!"</w:t>
+      </w:r>
+    </w:p>
+    <w:p>
+      <w:pPr>
+        <w:spacing w:before="60" w:after="60"/>
+        <w:ind w:left="288"/>
+      </w:pPr>
+      <w:r>
+        <w:rPr>
+          <w:rFonts w:ascii="Arial" w:hAnsi="Arial"/>
+          <w:b/>
+          <w:color w:val="0284C7"/>
+          <w:sz w:val="20"/>
+        </w:rPr>
+        <w:t xml:space="preserve">Mishka: </w:t>
+      </w:r>
+      <w:r>
+        <w:rPr>
+          <w:rFonts w:ascii="Calibri" w:hAnsi="Calibri"/>
+          <w:i/>
+          <w:color w:val="334155"/>
+          <w:sz w:val="20"/>
+        </w:rPr>
+        <w:t>"Sudah selesai bu Tiara! Catatannya lengkap dan rapi!"</w:t>
+      </w:r>
+    </w:p>
+    <w:tbl>
+      <w:tblPr>
+        <w:tblW w:type="auto" w:w="0"/>
+        <w:jc w:val="center"/>
+        <w:tblLayout w:type="fixed"/>
+        <w:tblLook w:firstColumn="1" w:firstRow="1" w:lastColumn="0" w:lastRow="0" w:noHBand="0" w:noVBand="1" w:val="04A0"/>
+      </w:tblPr>
+      <w:tblGrid>
+        <w:gridCol w:w="9792"/>
+      </w:tblGrid>
+      <w:tr>
+        <w:tc>
+          <w:tcPr>
+            <w:tcW w:type="dxa" w:w="10080"/>
+            <w:shd w:fill="FFFBEB"/>
+            <w:tcMar>
+              <w:top w:w="140" w:type="dxa"/>
+              <w:bottom w:w="140" w:type="dxa"/>
+              <w:left w:w="200" w:type="dxa"/>
+              <w:right w:w="200" w:type="dxa"/>
+            </w:tcMar>
+          </w:tcPr>
+          <w:p>
+            <w:r>
+              <w:rPr>
+                <w:rFonts w:ascii="Arial" w:hAnsi="Arial"/>
+                <w:b/>
+                <w:color w:val="B45309"/>
+                <w:sz w:val="22"/>
+              </w:rPr>
+              <w:t>🌟 [55:00 - 60:00] REFLEKSI KARAKTER &amp; PENUTUPAN SESI 2 MISHKA</w:t>
+              <w:br/>
+            </w:r>
+            <w:r>
+              <w:rPr>
+                <w:rFonts w:ascii="Calibri" w:hAnsi="Calibri"/>
+                <w:color w:val="1E293B"/>
+                <w:sz w:val="20"/>
+              </w:rPr>
+              <w:t>Fokus Penutup: Harmoni koreografi perpaduan Honai &amp; Tongkonan dalam senam lantai dan apresiasi 400 Poin.</w:t>
+            </w:r>
+          </w:p>
+        </w:tc>
+      </w:tr>
+    </w:tbl>
+    <w:p/>
+    <w:p>
+      <w:pPr>
+        <w:spacing w:before="60" w:after="60"/>
+        <w:ind w:left="0"/>
+      </w:pPr>
+      <w:r>
+        <w:rPr>
+          <w:rFonts w:ascii="Calibri" w:hAnsi="Calibri"/>
+          <w:i/>
+          <w:color w:val="64748B"/>
+          <w:sz w:val="18"/>
+        </w:rPr>
+        <w:t>[Menatap hangat dan menginspirasi]</w:t>
+        <w:br/>
+      </w:r>
+      <w:r>
+        <w:rPr>
+          <w:rFonts w:ascii="Arial" w:hAnsi="Arial"/>
+          <w:b/>
+          <w:color w:val="BE123C"/>
+          <w:sz w:val="20"/>
+        </w:rPr>
+        <w:t xml:space="preserve">Guru Tiara: </w:t>
+      </w:r>
+      <w:r>
+        <w:rPr>
+          <w:rFonts w:ascii="Calibri" w:hAnsi="Calibri"/>
+          <w:color w:val="0F172A"/>
+          <w:sz w:val="20"/>
+        </w:rPr>
+        <w:t>"Alhamdulillah, bangga sekali Bu Tiara sama Mishka hari ini! Sebagai refleksi penutup: bagaimana Mishka memadukan kelenturan lingkaran Honai dan keagungan haluan Tongkonan dalam gerakan senam lantai Mishka nanti?"</w:t>
+      </w:r>
+    </w:p>
+    <w:p>
+      <w:pPr>
+        <w:spacing w:before="60" w:after="60"/>
+        <w:ind w:left="288"/>
+      </w:pPr>
+      <w:r>
+        <w:rPr>
+          <w:rFonts w:ascii="Arial" w:hAnsi="Arial"/>
+          <w:b/>
+          <w:color w:val="0284C7"/>
+          <w:sz w:val="20"/>
+        </w:rPr>
+        <w:t xml:space="preserve">Mishka: </w:t>
+      </w:r>
+      <w:r>
+        <w:rPr>
+          <w:rFonts w:ascii="Calibri" w:hAnsi="Calibri"/>
+          <w:i/>
+          <w:color w:val="334155"/>
+          <w:sz w:val="20"/>
+        </w:rPr>
+        <w:t>"Bisa bikin gerakan melingkar lentur seperti Honai, lalu gerakan tangan membentang tegak seperti atap perahu Tongkonan bu! Keduanya indah kalau bersatu!"</w:t>
+      </w:r>
+    </w:p>
+    <w:p>
+      <w:pPr>
+        <w:spacing w:before="60" w:after="60"/>
+        <w:ind w:left="0"/>
+      </w:pPr>
+      <w:r>
+        <w:rPr>
+          <w:rFonts w:ascii="Calibri" w:hAnsi="Calibri"/>
+          <w:i/>
+          <w:color w:val="64748B"/>
+          <w:sz w:val="18"/>
+        </w:rPr>
+        <w:t>[Tersenyum bangga, menutup sesi Zoom Mishka]</w:t>
+        <w:br/>
+      </w:r>
+      <w:r>
+        <w:rPr>
+          <w:rFonts w:ascii="Arial" w:hAnsi="Arial"/>
+          <w:b/>
+          <w:color w:val="BE123C"/>
+          <w:sz w:val="20"/>
+        </w:rPr>
+        <w:t xml:space="preserve">Guru Tiara: </w:t>
+      </w:r>
+      <w:r>
+        <w:rPr>
+          <w:rFonts w:ascii="Calibri" w:hAnsi="Calibri"/>
+          <w:color w:val="0F172A"/>
+          <w:sz w:val="20"/>
+        </w:rPr>
+        <w:t>"Gagasan koreografi persatuan yang sangat puitis dan luar biasa! Selamat ya Mishka, resmi dinobatkan sebagai Duta Pelestari Budaya Nusantara dengan skor 400 sempurna hari ini! Terima kasih banyak Mishka, sampai jumpa di sesi berikutnya ya. Wassalamu'alaikum warahmatullahi wabarakatuh!"</w:t>
       </w:r>
     </w:p>
     <w:sectPr>

</xml_diff>